<commit_message>
update: srs and hoi vien usecase diagram
</commit_message>
<xml_diff>
--- a/srs.docx
+++ b/srs.docx
@@ -3056,7 +3056,7 @@
                 <w:szCs w:val="28"/>
                 <w:lang w:val="en-US"/>
               </w:rPr>
-              <w:t>Admin nhấn nut [Tìm kiếm]</w:t>
+              <w:t>Admin nhấn nút [Tìm kiếm]</w:t>
             </w:r>
           </w:p>
           <w:p>
@@ -4844,12 +4844,6 @@
             <w:insideH w:val="single" w:color="auto" w:sz="4" w:space="0"/>
             <w:insideV w:val="single" w:color="auto" w:sz="4" w:space="0"/>
           </w:tblBorders>
-          <w:tblCellMar>
-            <w:top w:w="0" w:type="dxa"/>
-            <w:left w:w="108" w:type="dxa"/>
-            <w:bottom w:w="0" w:type="dxa"/>
-            <w:right w:w="108" w:type="dxa"/>
-          </w:tblCellMar>
         </w:tblPrEx>
         <w:trPr>
           <w:jc w:val="center"/>
@@ -5829,12 +5823,6 @@
             <w:insideH w:val="single" w:color="auto" w:sz="4" w:space="0"/>
             <w:insideV w:val="single" w:color="auto" w:sz="4" w:space="0"/>
           </w:tblBorders>
-          <w:tblCellMar>
-            <w:top w:w="0" w:type="dxa"/>
-            <w:left w:w="108" w:type="dxa"/>
-            <w:bottom w:w="0" w:type="dxa"/>
-            <w:right w:w="108" w:type="dxa"/>
-          </w:tblCellMar>
         </w:tblPrEx>
         <w:trPr>
           <w:jc w:val="center"/>
@@ -6695,7 +6683,7 @@
                 <w:szCs w:val="28"/>
                 <w:lang w:val="en-US"/>
               </w:rPr>
-              <w:t>3.1 Nếu Admin chọn hủy thì đóng hộp thoại xác nhận và quay lại màn hình danh sách phòng</w:t>
+              <w:t>2.1 Nếu Admin chọn hủy thì đóng hộp thoại xác nhận và quay lại màn hình danh sách phòng</w:t>
             </w:r>
           </w:p>
           <w:p>
@@ -8486,8 +8474,6 @@
               </w:rPr>
               <w:t>Hệ thống thông báo thành công</w:t>
             </w:r>
-            <w:bookmarkStart w:id="0" w:name="_GoBack"/>
-            <w:bookmarkEnd w:id="0"/>
           </w:p>
         </w:tc>
       </w:tr>
@@ -8545,6 +8531,7 @@
           <w:p>
             <w:pPr>
               <w:numPr>
+                <w:ilvl w:val="0"/>
                 <w:numId w:val="0"/>
               </w:numPr>
               <w:spacing w:line="336" w:lineRule="auto"/>
@@ -8569,77 +8556,4141 @@
           </w:p>
           <w:p>
             <w:pPr>
+              <w:numPr>
+                <w:ilvl w:val="0"/>
+                <w:numId w:val="0"/>
+              </w:numPr>
+              <w:spacing w:line="336" w:lineRule="auto"/>
+              <w:ind w:left="70" w:leftChars="0"/>
+              <w:jc w:val="both"/>
+              <w:rPr>
+                <w:rFonts w:hint="default" w:ascii="Times New Roman" w:hAnsi="Times New Roman" w:cs="Times New Roman"/>
+                <w:sz w:val="28"/>
+                <w:szCs w:val="28"/>
+                <w:lang w:val="en-US"/>
+              </w:rPr>
+            </w:pPr>
+            <w:r>
+              <w:rPr>
+                <w:rFonts w:hint="default" w:ascii="Times New Roman" w:hAnsi="Times New Roman" w:cs="Times New Roman"/>
+                <w:sz w:val="28"/>
+                <w:szCs w:val="28"/>
+                <w:lang w:val="en-US"/>
+              </w:rPr>
+              <w:t>3.1.1.1 Nếu số lượng thêm mới không hợp lệ thì hệ thống thông báo lỗi số lượng không hợp lệ đến Admin</w:t>
+            </w:r>
+          </w:p>
+          <w:p>
+            <w:pPr>
+              <w:numPr>
+                <w:ilvl w:val="0"/>
+                <w:numId w:val="0"/>
+              </w:numPr>
+              <w:spacing w:line="336" w:lineRule="auto"/>
+              <w:ind w:left="70" w:leftChars="0"/>
+              <w:jc w:val="both"/>
+              <w:rPr>
+                <w:rFonts w:hint="default" w:ascii="Times New Roman" w:hAnsi="Times New Roman" w:cs="Times New Roman"/>
+                <w:sz w:val="28"/>
+                <w:szCs w:val="28"/>
+                <w:lang w:val="en-US"/>
+              </w:rPr>
+            </w:pPr>
+            <w:r>
+              <w:rPr>
+                <w:rFonts w:hint="default" w:ascii="Times New Roman" w:hAnsi="Times New Roman" w:cs="Times New Roman"/>
+                <w:sz w:val="28"/>
+                <w:szCs w:val="28"/>
+                <w:lang w:val="en-US"/>
+              </w:rPr>
+              <w:t>3.2.2 Nếu không hợp lệ thì hệ thống thông báo lỗi số lượng không hợp lệ đến Admin</w:t>
+            </w:r>
+          </w:p>
+          <w:p>
+            <w:pPr>
+              <w:numPr>
+                <w:ilvl w:val="0"/>
+                <w:numId w:val="0"/>
+              </w:numPr>
+              <w:spacing w:line="336" w:lineRule="auto"/>
+              <w:ind w:left="70" w:leftChars="0"/>
+              <w:jc w:val="both"/>
+              <w:rPr>
+                <w:rFonts w:hint="default" w:ascii="Times New Roman" w:hAnsi="Times New Roman" w:cs="Times New Roman"/>
+                <w:sz w:val="28"/>
+                <w:szCs w:val="28"/>
+                <w:lang w:val="en-US"/>
+              </w:rPr>
+            </w:pPr>
+            <w:r>
+              <w:rPr>
+                <w:rFonts w:hint="default" w:ascii="Times New Roman" w:hAnsi="Times New Roman" w:cs="Times New Roman"/>
+                <w:sz w:val="28"/>
+                <w:szCs w:val="28"/>
+                <w:lang w:val="en-US"/>
+              </w:rPr>
+              <w:t>3.3.2 Nếu Admin chọn hủy thì hệ thống đóng hội hoại và quay về màn hình cập nhật dịch vụ của phòng</w:t>
+            </w:r>
+          </w:p>
+        </w:tc>
+      </w:tr>
+    </w:tbl>
+    <w:p>
+      <w:pPr>
+        <w:numPr>
+          <w:ilvl w:val="0"/>
+          <w:numId w:val="0"/>
+        </w:numPr>
+        <w:ind w:leftChars="0"/>
+        <w:rPr>
+          <w:rFonts w:hint="default" w:ascii="Times New Roman" w:hAnsi="Times New Roman" w:cs="Times New Roman"/>
+          <w:lang w:val="en-US"/>
+        </w:rPr>
+      </w:pPr>
+    </w:p>
+    <w:p>
+      <w:pPr>
+        <w:pStyle w:val="6"/>
+        <w:bidi w:val="0"/>
+        <w:rPr>
+          <w:rFonts w:hint="default"/>
+          <w:lang w:val="en-US"/>
+        </w:rPr>
+      </w:pPr>
+      <w:r>
+        <w:rPr>
+          <w:rFonts w:hint="default"/>
+          <w:lang w:val="en-US"/>
+        </w:rPr>
+        <w:t>2.2.1.11 Đặc tả usecase chuyển phòng</w:t>
+      </w:r>
+    </w:p>
+    <w:tbl>
+      <w:tblPr>
+        <w:tblStyle w:val="8"/>
+        <w:tblW w:w="9355" w:type="dxa"/>
+        <w:jc w:val="center"/>
+        <w:tblBorders>
+          <w:top w:val="single" w:color="auto" w:sz="4" w:space="0"/>
+          <w:left w:val="single" w:color="auto" w:sz="4" w:space="0"/>
+          <w:bottom w:val="single" w:color="auto" w:sz="4" w:space="0"/>
+          <w:right w:val="single" w:color="auto" w:sz="4" w:space="0"/>
+          <w:insideH w:val="single" w:color="auto" w:sz="4" w:space="0"/>
+          <w:insideV w:val="single" w:color="auto" w:sz="4" w:space="0"/>
+        </w:tblBorders>
+        <w:tblLayout w:type="autofit"/>
+        <w:tblCellMar>
+          <w:top w:w="0" w:type="dxa"/>
+          <w:left w:w="108" w:type="dxa"/>
+          <w:bottom w:w="0" w:type="dxa"/>
+          <w:right w:w="108" w:type="dxa"/>
+        </w:tblCellMar>
+      </w:tblPr>
+      <w:tblGrid>
+        <w:gridCol w:w="2925"/>
+        <w:gridCol w:w="6430"/>
+      </w:tblGrid>
+      <w:tr>
+        <w:tblPrEx>
+          <w:tblBorders>
+            <w:top w:val="single" w:color="auto" w:sz="4" w:space="0"/>
+            <w:left w:val="single" w:color="auto" w:sz="4" w:space="0"/>
+            <w:bottom w:val="single" w:color="auto" w:sz="4" w:space="0"/>
+            <w:right w:val="single" w:color="auto" w:sz="4" w:space="0"/>
+            <w:insideH w:val="single" w:color="auto" w:sz="4" w:space="0"/>
+            <w:insideV w:val="single" w:color="auto" w:sz="4" w:space="0"/>
+          </w:tblBorders>
+          <w:tblCellMar>
+            <w:top w:w="0" w:type="dxa"/>
+            <w:left w:w="108" w:type="dxa"/>
+            <w:bottom w:w="0" w:type="dxa"/>
+            <w:right w:w="108" w:type="dxa"/>
+          </w:tblCellMar>
+        </w:tblPrEx>
+        <w:trPr>
+          <w:jc w:val="center"/>
+        </w:trPr>
+        <w:tc>
+          <w:tcPr>
+            <w:tcW w:w="2925" w:type="dxa"/>
+            <w:vAlign w:val="center"/>
+          </w:tcPr>
+          <w:p>
+            <w:pPr>
+              <w:spacing w:line="336" w:lineRule="auto"/>
+              <w:jc w:val="center"/>
+              <w:rPr>
+                <w:rFonts w:hint="default" w:ascii="Times New Roman" w:hAnsi="Times New Roman" w:cs="Times New Roman"/>
+                <w:b/>
+                <w:bCs/>
+                <w:sz w:val="28"/>
+                <w:szCs w:val="28"/>
+              </w:rPr>
+            </w:pPr>
+            <w:r>
+              <w:rPr>
+                <w:rStyle w:val="11"/>
+                <w:rFonts w:hint="default" w:ascii="Times New Roman" w:hAnsi="Times New Roman" w:cs="Times New Roman" w:eastAsiaTheme="majorEastAsia"/>
+                <w:sz w:val="28"/>
+                <w:szCs w:val="28"/>
+              </w:rPr>
+              <w:t>Thuộc tính</w:t>
+            </w:r>
+          </w:p>
+        </w:tc>
+        <w:tc>
+          <w:tcPr>
+            <w:tcW w:w="6430" w:type="dxa"/>
+            <w:vAlign w:val="center"/>
+          </w:tcPr>
+          <w:p>
+            <w:pPr>
+              <w:spacing w:line="336" w:lineRule="auto"/>
+              <w:jc w:val="center"/>
+              <w:rPr>
+                <w:rFonts w:hint="default" w:ascii="Times New Roman" w:hAnsi="Times New Roman" w:cs="Times New Roman"/>
+                <w:b/>
+                <w:bCs/>
+                <w:sz w:val="28"/>
+                <w:szCs w:val="28"/>
+              </w:rPr>
+            </w:pPr>
+            <w:r>
+              <w:rPr>
+                <w:rStyle w:val="11"/>
+                <w:rFonts w:hint="default" w:ascii="Times New Roman" w:hAnsi="Times New Roman" w:cs="Times New Roman" w:eastAsiaTheme="majorEastAsia"/>
+                <w:sz w:val="28"/>
+                <w:szCs w:val="28"/>
+              </w:rPr>
+              <w:t>Mô tả</w:t>
+            </w:r>
+          </w:p>
+        </w:tc>
+      </w:tr>
+      <w:tr>
+        <w:tblPrEx>
+          <w:tblBorders>
+            <w:top w:val="single" w:color="auto" w:sz="4" w:space="0"/>
+            <w:left w:val="single" w:color="auto" w:sz="4" w:space="0"/>
+            <w:bottom w:val="single" w:color="auto" w:sz="4" w:space="0"/>
+            <w:right w:val="single" w:color="auto" w:sz="4" w:space="0"/>
+            <w:insideH w:val="single" w:color="auto" w:sz="4" w:space="0"/>
+            <w:insideV w:val="single" w:color="auto" w:sz="4" w:space="0"/>
+          </w:tblBorders>
+          <w:tblCellMar>
+            <w:top w:w="0" w:type="dxa"/>
+            <w:left w:w="108" w:type="dxa"/>
+            <w:bottom w:w="0" w:type="dxa"/>
+            <w:right w:w="108" w:type="dxa"/>
+          </w:tblCellMar>
+        </w:tblPrEx>
+        <w:trPr>
+          <w:jc w:val="center"/>
+        </w:trPr>
+        <w:tc>
+          <w:tcPr>
+            <w:tcW w:w="2925" w:type="dxa"/>
+            <w:vAlign w:val="center"/>
+          </w:tcPr>
+          <w:p>
+            <w:pPr>
+              <w:spacing w:line="336" w:lineRule="auto"/>
+              <w:jc w:val="center"/>
+              <w:rPr>
+                <w:rFonts w:hint="default" w:ascii="Times New Roman" w:hAnsi="Times New Roman" w:cs="Times New Roman"/>
+                <w:sz w:val="28"/>
+                <w:szCs w:val="28"/>
+              </w:rPr>
+            </w:pPr>
+            <w:r>
+              <w:rPr>
+                <w:rStyle w:val="11"/>
+                <w:rFonts w:hint="default" w:ascii="Times New Roman" w:hAnsi="Times New Roman" w:cs="Times New Roman" w:eastAsiaTheme="majorEastAsia"/>
+                <w:sz w:val="28"/>
+                <w:szCs w:val="28"/>
+              </w:rPr>
+              <w:t>Tên Use Case</w:t>
+            </w:r>
+          </w:p>
+        </w:tc>
+        <w:tc>
+          <w:tcPr>
+            <w:tcW w:w="6430" w:type="dxa"/>
+            <w:vAlign w:val="center"/>
+          </w:tcPr>
+          <w:p>
+            <w:pPr>
+              <w:spacing w:line="336" w:lineRule="auto"/>
+              <w:jc w:val="both"/>
+              <w:rPr>
+                <w:rFonts w:hint="default" w:ascii="Times New Roman" w:hAnsi="Times New Roman" w:cs="Times New Roman"/>
+                <w:sz w:val="28"/>
+                <w:szCs w:val="28"/>
+                <w:lang w:val="en-US"/>
+              </w:rPr>
+            </w:pPr>
+            <w:r>
+              <w:rPr>
+                <w:rFonts w:hint="default" w:ascii="Times New Roman" w:hAnsi="Times New Roman" w:cs="Times New Roman"/>
+                <w:sz w:val="28"/>
+                <w:szCs w:val="28"/>
+                <w:lang w:val="en-US"/>
+              </w:rPr>
+              <w:t>Chuyển phòng</w:t>
+            </w:r>
+          </w:p>
+        </w:tc>
+      </w:tr>
+      <w:tr>
+        <w:tblPrEx>
+          <w:tblBorders>
+            <w:top w:val="single" w:color="auto" w:sz="4" w:space="0"/>
+            <w:left w:val="single" w:color="auto" w:sz="4" w:space="0"/>
+            <w:bottom w:val="single" w:color="auto" w:sz="4" w:space="0"/>
+            <w:right w:val="single" w:color="auto" w:sz="4" w:space="0"/>
+            <w:insideH w:val="single" w:color="auto" w:sz="4" w:space="0"/>
+            <w:insideV w:val="single" w:color="auto" w:sz="4" w:space="0"/>
+          </w:tblBorders>
+          <w:tblCellMar>
+            <w:top w:w="0" w:type="dxa"/>
+            <w:left w:w="108" w:type="dxa"/>
+            <w:bottom w:w="0" w:type="dxa"/>
+            <w:right w:w="108" w:type="dxa"/>
+          </w:tblCellMar>
+        </w:tblPrEx>
+        <w:trPr>
+          <w:jc w:val="center"/>
+        </w:trPr>
+        <w:tc>
+          <w:tcPr>
+            <w:tcW w:w="2925" w:type="dxa"/>
+            <w:vAlign w:val="center"/>
+          </w:tcPr>
+          <w:p>
+            <w:pPr>
+              <w:spacing w:line="336" w:lineRule="auto"/>
+              <w:jc w:val="center"/>
+              <w:rPr>
+                <w:rFonts w:hint="default" w:ascii="Times New Roman" w:hAnsi="Times New Roman" w:cs="Times New Roman"/>
+                <w:sz w:val="28"/>
+                <w:szCs w:val="28"/>
+              </w:rPr>
+            </w:pPr>
+            <w:r>
+              <w:rPr>
+                <w:rStyle w:val="11"/>
+                <w:rFonts w:hint="default" w:ascii="Times New Roman" w:hAnsi="Times New Roman" w:cs="Times New Roman" w:eastAsiaTheme="majorEastAsia"/>
+                <w:sz w:val="28"/>
+                <w:szCs w:val="28"/>
+              </w:rPr>
+              <w:t>Mô tả</w:t>
+            </w:r>
+          </w:p>
+        </w:tc>
+        <w:tc>
+          <w:tcPr>
+            <w:tcW w:w="6430" w:type="dxa"/>
+            <w:vAlign w:val="center"/>
+          </w:tcPr>
+          <w:p>
+            <w:pPr>
+              <w:pStyle w:val="10"/>
+              <w:spacing w:before="0" w:beforeAutospacing="0" w:after="0" w:afterAutospacing="0" w:line="336" w:lineRule="auto"/>
+              <w:jc w:val="both"/>
+              <w:rPr>
+                <w:rFonts w:hint="default" w:ascii="Times New Roman" w:hAnsi="Times New Roman" w:cs="Times New Roman"/>
+                <w:sz w:val="28"/>
+                <w:szCs w:val="28"/>
+                <w:lang w:val="vi"/>
+              </w:rPr>
+            </w:pPr>
+            <w:r>
+              <w:rPr>
+                <w:rFonts w:hint="default" w:ascii="Times New Roman" w:hAnsi="Times New Roman"/>
+                <w:sz w:val="28"/>
+                <w:szCs w:val="28"/>
+                <w:lang w:val="vi"/>
+              </w:rPr>
+              <w:t>Cho phép chuyển khách từ phòng hiện tại sang một phòng mới trống</w:t>
+            </w:r>
+            <w:r>
+              <w:rPr>
+                <w:rFonts w:hint="default" w:ascii="Times New Roman" w:hAnsi="Times New Roman"/>
+                <w:sz w:val="28"/>
+                <w:szCs w:val="28"/>
+                <w:lang w:val="en-US"/>
+              </w:rPr>
+              <w:t xml:space="preserve"> hoặc phòng chờ</w:t>
+            </w:r>
+            <w:r>
+              <w:rPr>
+                <w:rFonts w:hint="default" w:ascii="Times New Roman" w:hAnsi="Times New Roman"/>
+                <w:sz w:val="28"/>
+                <w:szCs w:val="28"/>
+                <w:lang w:val="vi"/>
+              </w:rPr>
+              <w:t>. Hệ thống sẽ kết thúc thời gian tính tiền ở phòng cũ và bắt đầu tính thời gian ở phòng mới</w:t>
+            </w:r>
+          </w:p>
+        </w:tc>
+      </w:tr>
+      <w:tr>
+        <w:tblPrEx>
+          <w:tblBorders>
+            <w:top w:val="single" w:color="auto" w:sz="4" w:space="0"/>
+            <w:left w:val="single" w:color="auto" w:sz="4" w:space="0"/>
+            <w:bottom w:val="single" w:color="auto" w:sz="4" w:space="0"/>
+            <w:right w:val="single" w:color="auto" w:sz="4" w:space="0"/>
+            <w:insideH w:val="single" w:color="auto" w:sz="4" w:space="0"/>
+            <w:insideV w:val="single" w:color="auto" w:sz="4" w:space="0"/>
+          </w:tblBorders>
+          <w:tblCellMar>
+            <w:top w:w="0" w:type="dxa"/>
+            <w:left w:w="108" w:type="dxa"/>
+            <w:bottom w:w="0" w:type="dxa"/>
+            <w:right w:w="108" w:type="dxa"/>
+          </w:tblCellMar>
+        </w:tblPrEx>
+        <w:trPr>
+          <w:jc w:val="center"/>
+        </w:trPr>
+        <w:tc>
+          <w:tcPr>
+            <w:tcW w:w="2925" w:type="dxa"/>
+            <w:vAlign w:val="center"/>
+          </w:tcPr>
+          <w:p>
+            <w:pPr>
+              <w:spacing w:line="336" w:lineRule="auto"/>
+              <w:jc w:val="center"/>
+              <w:rPr>
+                <w:rFonts w:hint="default" w:ascii="Times New Roman" w:hAnsi="Times New Roman" w:cs="Times New Roman"/>
+                <w:sz w:val="28"/>
+                <w:szCs w:val="28"/>
+              </w:rPr>
+            </w:pPr>
+            <w:r>
+              <w:rPr>
+                <w:rStyle w:val="11"/>
+                <w:rFonts w:hint="default" w:ascii="Times New Roman" w:hAnsi="Times New Roman" w:cs="Times New Roman" w:eastAsiaTheme="majorEastAsia"/>
+                <w:sz w:val="28"/>
+                <w:szCs w:val="28"/>
+              </w:rPr>
+              <w:t>Tác nhân chính</w:t>
+            </w:r>
+          </w:p>
+        </w:tc>
+        <w:tc>
+          <w:tcPr>
+            <w:tcW w:w="6430" w:type="dxa"/>
+            <w:vAlign w:val="center"/>
+          </w:tcPr>
+          <w:p>
+            <w:pPr>
+              <w:spacing w:line="336" w:lineRule="auto"/>
+              <w:jc w:val="both"/>
+              <w:rPr>
+                <w:rFonts w:hint="default" w:ascii="Times New Roman" w:hAnsi="Times New Roman" w:cs="Times New Roman"/>
+                <w:sz w:val="28"/>
+                <w:szCs w:val="28"/>
+                <w:lang w:val="en-US"/>
+              </w:rPr>
+            </w:pPr>
+            <w:r>
+              <w:rPr>
+                <w:rFonts w:hint="default" w:ascii="Times New Roman" w:hAnsi="Times New Roman" w:cs="Times New Roman"/>
+                <w:sz w:val="28"/>
+                <w:szCs w:val="28"/>
+                <w:lang w:val="en-US"/>
+              </w:rPr>
+              <w:t>Admin</w:t>
+            </w:r>
+          </w:p>
+        </w:tc>
+      </w:tr>
+      <w:tr>
+        <w:tblPrEx>
+          <w:tblBorders>
+            <w:top w:val="single" w:color="auto" w:sz="4" w:space="0"/>
+            <w:left w:val="single" w:color="auto" w:sz="4" w:space="0"/>
+            <w:bottom w:val="single" w:color="auto" w:sz="4" w:space="0"/>
+            <w:right w:val="single" w:color="auto" w:sz="4" w:space="0"/>
+            <w:insideH w:val="single" w:color="auto" w:sz="4" w:space="0"/>
+            <w:insideV w:val="single" w:color="auto" w:sz="4" w:space="0"/>
+          </w:tblBorders>
+          <w:tblCellMar>
+            <w:top w:w="0" w:type="dxa"/>
+            <w:left w:w="108" w:type="dxa"/>
+            <w:bottom w:w="0" w:type="dxa"/>
+            <w:right w:w="108" w:type="dxa"/>
+          </w:tblCellMar>
+        </w:tblPrEx>
+        <w:trPr>
+          <w:jc w:val="center"/>
+        </w:trPr>
+        <w:tc>
+          <w:tcPr>
+            <w:tcW w:w="2925" w:type="dxa"/>
+            <w:vAlign w:val="center"/>
+          </w:tcPr>
+          <w:p>
+            <w:pPr>
+              <w:spacing w:line="336" w:lineRule="auto"/>
+              <w:jc w:val="center"/>
+              <w:rPr>
+                <w:rFonts w:hint="default" w:ascii="Times New Roman" w:hAnsi="Times New Roman" w:cs="Times New Roman"/>
+                <w:sz w:val="28"/>
+                <w:szCs w:val="28"/>
+              </w:rPr>
+            </w:pPr>
+            <w:r>
+              <w:rPr>
+                <w:rStyle w:val="11"/>
+                <w:rFonts w:hint="default" w:ascii="Times New Roman" w:hAnsi="Times New Roman" w:cs="Times New Roman" w:eastAsiaTheme="majorEastAsia"/>
+                <w:sz w:val="28"/>
+                <w:szCs w:val="28"/>
+              </w:rPr>
+              <w:t>Tiền điều kiện</w:t>
+            </w:r>
+          </w:p>
+        </w:tc>
+        <w:tc>
+          <w:tcPr>
+            <w:tcW w:w="6430" w:type="dxa"/>
+            <w:vAlign w:val="center"/>
+          </w:tcPr>
+          <w:p>
+            <w:pPr>
+              <w:spacing w:line="336" w:lineRule="auto"/>
+              <w:jc w:val="both"/>
+              <w:rPr>
+                <w:rFonts w:hint="default" w:ascii="Times New Roman" w:hAnsi="Times New Roman" w:cs="Times New Roman"/>
+                <w:sz w:val="28"/>
+                <w:szCs w:val="28"/>
+                <w:lang w:val="en-US"/>
+              </w:rPr>
+            </w:pPr>
+            <w:r>
+              <w:rPr>
+                <w:rFonts w:hint="default" w:ascii="Times New Roman" w:hAnsi="Times New Roman" w:cs="Times New Roman"/>
+                <w:sz w:val="28"/>
+                <w:szCs w:val="28"/>
+                <w:lang w:val="en-US"/>
+              </w:rPr>
+              <w:t>Admin đã đăng nhập vào hệ thống và đang xem thông tin chi tiết một phòng. Phòng đang xem phải là phòng đang sử dụng hoặc phòng tạm</w:t>
+            </w:r>
+          </w:p>
+        </w:tc>
+      </w:tr>
+      <w:tr>
+        <w:tblPrEx>
+          <w:tblBorders>
+            <w:top w:val="single" w:color="auto" w:sz="4" w:space="0"/>
+            <w:left w:val="single" w:color="auto" w:sz="4" w:space="0"/>
+            <w:bottom w:val="single" w:color="auto" w:sz="4" w:space="0"/>
+            <w:right w:val="single" w:color="auto" w:sz="4" w:space="0"/>
+            <w:insideH w:val="single" w:color="auto" w:sz="4" w:space="0"/>
+            <w:insideV w:val="single" w:color="auto" w:sz="4" w:space="0"/>
+          </w:tblBorders>
+          <w:tblCellMar>
+            <w:top w:w="0" w:type="dxa"/>
+            <w:left w:w="108" w:type="dxa"/>
+            <w:bottom w:w="0" w:type="dxa"/>
+            <w:right w:w="108" w:type="dxa"/>
+          </w:tblCellMar>
+        </w:tblPrEx>
+        <w:trPr>
+          <w:jc w:val="center"/>
+        </w:trPr>
+        <w:tc>
+          <w:tcPr>
+            <w:tcW w:w="2925" w:type="dxa"/>
+            <w:vAlign w:val="center"/>
+          </w:tcPr>
+          <w:p>
+            <w:pPr>
+              <w:spacing w:line="336" w:lineRule="auto"/>
+              <w:jc w:val="center"/>
+              <w:rPr>
+                <w:rFonts w:hint="default" w:ascii="Times New Roman" w:hAnsi="Times New Roman" w:cs="Times New Roman"/>
+                <w:sz w:val="28"/>
+                <w:szCs w:val="28"/>
+              </w:rPr>
+            </w:pPr>
+            <w:r>
+              <w:rPr>
+                <w:rStyle w:val="11"/>
+                <w:rFonts w:hint="default" w:ascii="Times New Roman" w:hAnsi="Times New Roman" w:cs="Times New Roman" w:eastAsiaTheme="majorEastAsia"/>
+                <w:sz w:val="28"/>
+                <w:szCs w:val="28"/>
+              </w:rPr>
+              <w:t>Hậu điều kiện</w:t>
+            </w:r>
+          </w:p>
+        </w:tc>
+        <w:tc>
+          <w:tcPr>
+            <w:tcW w:w="6430" w:type="dxa"/>
+            <w:vAlign w:val="center"/>
+          </w:tcPr>
+          <w:p>
+            <w:pPr>
+              <w:pStyle w:val="10"/>
+              <w:spacing w:before="0" w:beforeAutospacing="0" w:after="0" w:afterAutospacing="0" w:line="336" w:lineRule="auto"/>
+              <w:jc w:val="both"/>
+              <w:rPr>
+                <w:rFonts w:hint="default" w:ascii="Times New Roman" w:hAnsi="Times New Roman" w:cs="Times New Roman"/>
+                <w:sz w:val="28"/>
+                <w:szCs w:val="28"/>
+                <w:lang w:val="en-US"/>
+              </w:rPr>
+            </w:pPr>
+            <w:r>
+              <w:rPr>
+                <w:rFonts w:hint="default" w:ascii="Times New Roman" w:hAnsi="Times New Roman" w:cs="Times New Roman"/>
+                <w:sz w:val="28"/>
+                <w:szCs w:val="28"/>
+                <w:lang w:val="en-US"/>
+              </w:rPr>
+              <w:t>Phòng hiện tại chuyển thành phòng trống hoặc phòng chờ. Phòng mới được chuyển thành phòng đang sử dụng hoặc phòng tạm</w:t>
+            </w:r>
+          </w:p>
+        </w:tc>
+      </w:tr>
+      <w:tr>
+        <w:tblPrEx>
+          <w:tblBorders>
+            <w:top w:val="single" w:color="auto" w:sz="4" w:space="0"/>
+            <w:left w:val="single" w:color="auto" w:sz="4" w:space="0"/>
+            <w:bottom w:val="single" w:color="auto" w:sz="4" w:space="0"/>
+            <w:right w:val="single" w:color="auto" w:sz="4" w:space="0"/>
+            <w:insideH w:val="single" w:color="auto" w:sz="4" w:space="0"/>
+            <w:insideV w:val="single" w:color="auto" w:sz="4" w:space="0"/>
+          </w:tblBorders>
+          <w:tblCellMar>
+            <w:top w:w="0" w:type="dxa"/>
+            <w:left w:w="108" w:type="dxa"/>
+            <w:bottom w:w="0" w:type="dxa"/>
+            <w:right w:w="108" w:type="dxa"/>
+          </w:tblCellMar>
+        </w:tblPrEx>
+        <w:trPr>
+          <w:jc w:val="center"/>
+        </w:trPr>
+        <w:tc>
+          <w:tcPr>
+            <w:tcW w:w="2925" w:type="dxa"/>
+            <w:vAlign w:val="center"/>
+          </w:tcPr>
+          <w:p>
+            <w:pPr>
+              <w:spacing w:line="336" w:lineRule="auto"/>
+              <w:jc w:val="center"/>
+              <w:rPr>
+                <w:rFonts w:hint="default" w:ascii="Times New Roman" w:hAnsi="Times New Roman" w:cs="Times New Roman"/>
+                <w:sz w:val="28"/>
+                <w:szCs w:val="28"/>
+              </w:rPr>
+            </w:pPr>
+            <w:r>
+              <w:rPr>
+                <w:rStyle w:val="11"/>
+                <w:rFonts w:hint="default" w:ascii="Times New Roman" w:hAnsi="Times New Roman" w:cs="Times New Roman" w:eastAsiaTheme="majorEastAsia"/>
+                <w:sz w:val="28"/>
+                <w:szCs w:val="28"/>
+              </w:rPr>
+              <w:t>Luồng chính</w:t>
+            </w:r>
+          </w:p>
+        </w:tc>
+        <w:tc>
+          <w:tcPr>
+            <w:tcW w:w="6430" w:type="dxa"/>
+            <w:vAlign w:val="center"/>
+          </w:tcPr>
+          <w:p>
+            <w:pPr>
+              <w:pStyle w:val="10"/>
+              <w:numPr>
+                <w:ilvl w:val="0"/>
+                <w:numId w:val="12"/>
+              </w:numPr>
+              <w:spacing w:before="0" w:beforeAutospacing="0" w:after="0" w:afterAutospacing="0" w:line="336" w:lineRule="auto"/>
+              <w:jc w:val="both"/>
+              <w:rPr>
+                <w:rFonts w:hint="default" w:ascii="Times New Roman" w:hAnsi="Times New Roman" w:cs="Times New Roman"/>
+                <w:sz w:val="28"/>
+                <w:szCs w:val="28"/>
+                <w:lang w:val="en-US"/>
+              </w:rPr>
+            </w:pPr>
+            <w:r>
+              <w:rPr>
+                <w:rFonts w:hint="default" w:ascii="Times New Roman" w:hAnsi="Times New Roman" w:cs="Times New Roman"/>
+                <w:sz w:val="28"/>
+                <w:szCs w:val="28"/>
+                <w:lang w:val="en-US"/>
+              </w:rPr>
+              <w:t>Tại màn hình xem chi tiết, Admin nhấn nút [Chuyển phòng]</w:t>
+            </w:r>
+          </w:p>
+          <w:p>
+            <w:pPr>
+              <w:pStyle w:val="10"/>
+              <w:numPr>
+                <w:ilvl w:val="0"/>
+                <w:numId w:val="12"/>
+              </w:numPr>
+              <w:spacing w:before="0" w:beforeAutospacing="0" w:after="0" w:afterAutospacing="0" w:line="336" w:lineRule="auto"/>
+              <w:jc w:val="both"/>
+              <w:rPr>
+                <w:rFonts w:hint="default" w:ascii="Times New Roman" w:hAnsi="Times New Roman" w:cs="Times New Roman"/>
+                <w:sz w:val="28"/>
+                <w:szCs w:val="28"/>
+                <w:lang w:val="en-US"/>
+              </w:rPr>
+            </w:pPr>
+            <w:r>
+              <w:rPr>
+                <w:rFonts w:hint="default" w:ascii="Times New Roman" w:hAnsi="Times New Roman" w:cs="Times New Roman"/>
+                <w:sz w:val="28"/>
+                <w:szCs w:val="28"/>
+                <w:lang w:val="en-US"/>
+              </w:rPr>
+              <w:t>Hệ thống hiển thị danh sách phòng trống (vẫn còn hoạt động) hoặc phòng chờ mà có sức chứa bằng hoặc lớn hơn sức chứa phòng hiện tại</w:t>
+            </w:r>
+          </w:p>
+          <w:p>
+            <w:pPr>
+              <w:pStyle w:val="10"/>
+              <w:numPr>
+                <w:ilvl w:val="0"/>
+                <w:numId w:val="12"/>
+              </w:numPr>
+              <w:spacing w:before="0" w:beforeAutospacing="0" w:after="0" w:afterAutospacing="0" w:line="336" w:lineRule="auto"/>
+              <w:jc w:val="both"/>
+              <w:rPr>
+                <w:rFonts w:hint="default" w:ascii="Times New Roman" w:hAnsi="Times New Roman" w:cs="Times New Roman"/>
+                <w:sz w:val="28"/>
+                <w:szCs w:val="28"/>
+                <w:lang w:val="en-US"/>
+              </w:rPr>
+            </w:pPr>
+            <w:r>
+              <w:rPr>
+                <w:rFonts w:hint="default" w:ascii="Times New Roman" w:hAnsi="Times New Roman" w:cs="Times New Roman"/>
+                <w:sz w:val="28"/>
+                <w:szCs w:val="28"/>
+                <w:lang w:val="en-US"/>
+              </w:rPr>
+              <w:t>Nếu Admin chọn phòng trống thì ghi nhận thời gian kết thúc của phòng hiện tại, chuyển phòng hiện tại sang phòng trống (nếu phòng hiện tại ở trạng thái đang sử dụng) hoặc phòng chờ (nếu phòng hiện tại ở trạng thái là phòng tạm), đồng thời hệ thống thêm phòng mới vào hóa đơn tạm tính và phòng mới sẽ được chuyển thành phòng đang sử dụng</w:t>
+            </w:r>
+          </w:p>
+          <w:p>
+            <w:pPr>
+              <w:pStyle w:val="10"/>
+              <w:numPr>
+                <w:ilvl w:val="0"/>
+                <w:numId w:val="12"/>
+              </w:numPr>
+              <w:spacing w:before="0" w:beforeAutospacing="0" w:after="0" w:afterAutospacing="0" w:line="336" w:lineRule="auto"/>
+              <w:jc w:val="both"/>
+              <w:rPr>
+                <w:rFonts w:hint="default" w:ascii="Times New Roman" w:hAnsi="Times New Roman" w:cs="Times New Roman"/>
+                <w:sz w:val="28"/>
+                <w:szCs w:val="28"/>
+                <w:lang w:val="en-US"/>
+              </w:rPr>
+            </w:pPr>
+            <w:r>
+              <w:rPr>
+                <w:rFonts w:hint="default" w:ascii="Times New Roman" w:hAnsi="Times New Roman" w:cs="Times New Roman"/>
+                <w:sz w:val="28"/>
+                <w:szCs w:val="28"/>
+                <w:lang w:val="en-US"/>
+              </w:rPr>
+              <w:t>Nếu Admin chọn phòng chờ thì hệ thống kiểm tra xem thời điểm hiện tại đến thời điểm dự kiến nhận phòng không nhỏ hơn khoảng thời gian được quy định trước (khoảng thời gian được phép mở phòng nếu phòng đã được đặt trước) hay không</w:t>
+            </w:r>
+          </w:p>
+          <w:p>
+            <w:pPr>
+              <w:pStyle w:val="10"/>
+              <w:numPr>
+                <w:ilvl w:val="1"/>
+                <w:numId w:val="12"/>
+              </w:numPr>
+              <w:spacing w:before="0" w:beforeAutospacing="0" w:after="0" w:afterAutospacing="0" w:line="336" w:lineRule="auto"/>
+              <w:ind w:left="70" w:leftChars="0" w:firstLine="0" w:firstLineChars="0"/>
+              <w:jc w:val="both"/>
+              <w:rPr>
+                <w:rFonts w:hint="default" w:ascii="Times New Roman" w:hAnsi="Times New Roman" w:cs="Times New Roman"/>
+                <w:sz w:val="28"/>
+                <w:szCs w:val="28"/>
+                <w:lang w:val="en-US"/>
+              </w:rPr>
+            </w:pPr>
+            <w:r>
+              <w:rPr>
+                <w:rFonts w:hint="default" w:ascii="Times New Roman" w:hAnsi="Times New Roman" w:cs="Times New Roman"/>
+                <w:sz w:val="28"/>
+                <w:szCs w:val="28"/>
+                <w:lang w:val="en-US"/>
+              </w:rPr>
+              <w:t>Nếu không thì ghi nhận thời gian kết thúc của phòng hiện tại, chuyển phòng hiện tại sang phòng trống (nếu phòng hiện tại ở trạng thái đang sử dụng) hoặc phòng chờ (nếu phòng hiện tại ở trạng thái là phòng tạm), đồng thời đồng thời hệ thống thêm phòng mới vào hóa đơn tạm tính và phòng mới sẽ được chuyển thành phòng tạm</w:t>
+            </w:r>
+          </w:p>
+          <w:p>
+            <w:pPr>
+              <w:pStyle w:val="10"/>
+              <w:numPr>
+                <w:ilvl w:val="0"/>
+                <w:numId w:val="12"/>
+              </w:numPr>
+              <w:spacing w:before="0" w:beforeAutospacing="0" w:after="0" w:afterAutospacing="0" w:line="336" w:lineRule="auto"/>
+              <w:ind w:left="0" w:leftChars="0" w:firstLine="0" w:firstLineChars="0"/>
+              <w:jc w:val="both"/>
+              <w:rPr>
+                <w:rFonts w:hint="default" w:ascii="Times New Roman" w:hAnsi="Times New Roman" w:cs="Times New Roman"/>
+                <w:sz w:val="28"/>
+                <w:szCs w:val="28"/>
+                <w:lang w:val="en-US"/>
+              </w:rPr>
+            </w:pPr>
+            <w:r>
+              <w:rPr>
+                <w:rFonts w:hint="default" w:ascii="Times New Roman" w:hAnsi="Times New Roman" w:cs="Times New Roman"/>
+                <w:sz w:val="28"/>
+                <w:szCs w:val="28"/>
+                <w:lang w:val="en-US"/>
+              </w:rPr>
+              <w:t xml:space="preserve">Hệ thống thông báo chuyển phòng thành công </w:t>
+            </w:r>
+          </w:p>
+        </w:tc>
+      </w:tr>
+      <w:tr>
+        <w:tblPrEx>
+          <w:tblBorders>
+            <w:top w:val="single" w:color="auto" w:sz="4" w:space="0"/>
+            <w:left w:val="single" w:color="auto" w:sz="4" w:space="0"/>
+            <w:bottom w:val="single" w:color="auto" w:sz="4" w:space="0"/>
+            <w:right w:val="single" w:color="auto" w:sz="4" w:space="0"/>
+            <w:insideH w:val="single" w:color="auto" w:sz="4" w:space="0"/>
+            <w:insideV w:val="single" w:color="auto" w:sz="4" w:space="0"/>
+          </w:tblBorders>
+          <w:tblCellMar>
+            <w:top w:w="0" w:type="dxa"/>
+            <w:left w:w="108" w:type="dxa"/>
+            <w:bottom w:w="0" w:type="dxa"/>
+            <w:right w:w="108" w:type="dxa"/>
+          </w:tblCellMar>
+        </w:tblPrEx>
+        <w:trPr>
+          <w:jc w:val="center"/>
+        </w:trPr>
+        <w:tc>
+          <w:tcPr>
+            <w:tcW w:w="2925" w:type="dxa"/>
+            <w:vAlign w:val="center"/>
+          </w:tcPr>
+          <w:p>
+            <w:pPr>
+              <w:spacing w:line="336" w:lineRule="auto"/>
+              <w:jc w:val="center"/>
+              <w:rPr>
+                <w:rFonts w:hint="default" w:ascii="Times New Roman" w:hAnsi="Times New Roman" w:cs="Times New Roman"/>
+                <w:sz w:val="28"/>
+                <w:szCs w:val="28"/>
+              </w:rPr>
+            </w:pPr>
+            <w:r>
+              <w:rPr>
+                <w:rStyle w:val="11"/>
+                <w:rFonts w:hint="default" w:ascii="Times New Roman" w:hAnsi="Times New Roman" w:cs="Times New Roman" w:eastAsiaTheme="majorEastAsia"/>
+                <w:sz w:val="28"/>
+                <w:szCs w:val="28"/>
+              </w:rPr>
+              <w:t>Luồng thay thế</w:t>
+            </w:r>
+          </w:p>
+        </w:tc>
+        <w:tc>
+          <w:tcPr>
+            <w:tcW w:w="6430" w:type="dxa"/>
+            <w:vAlign w:val="center"/>
+          </w:tcPr>
+          <w:p>
+            <w:pPr>
+              <w:spacing w:line="336" w:lineRule="auto"/>
+              <w:jc w:val="both"/>
+              <w:rPr>
+                <w:rFonts w:hint="default" w:ascii="Times New Roman" w:hAnsi="Times New Roman" w:cs="Times New Roman"/>
+                <w:sz w:val="28"/>
+                <w:szCs w:val="28"/>
+                <w:lang w:val="en-US"/>
+              </w:rPr>
+            </w:pPr>
+            <w:r>
+              <w:rPr>
+                <w:rFonts w:hint="default" w:ascii="Times New Roman" w:hAnsi="Times New Roman" w:cs="Times New Roman"/>
+                <w:sz w:val="28"/>
+                <w:szCs w:val="28"/>
+                <w:lang w:val="en-US"/>
+              </w:rPr>
+              <w:t>4.2 Nếu có thì thông báo lỗi thời điểm hiện tại không thể chuyển sang phòng chờ này đến Admin</w:t>
+            </w:r>
+          </w:p>
+        </w:tc>
+      </w:tr>
+    </w:tbl>
+    <w:p>
+      <w:pPr>
+        <w:numPr>
+          <w:ilvl w:val="0"/>
+          <w:numId w:val="0"/>
+        </w:numPr>
+        <w:ind w:leftChars="0"/>
+        <w:rPr>
+          <w:rFonts w:hint="default" w:ascii="Times New Roman" w:hAnsi="Times New Roman" w:cs="Times New Roman"/>
+          <w:lang w:val="en-US"/>
+        </w:rPr>
+      </w:pPr>
+    </w:p>
+    <w:p>
+      <w:pPr>
+        <w:pStyle w:val="6"/>
+        <w:bidi w:val="0"/>
+        <w:rPr>
+          <w:rFonts w:hint="default"/>
+          <w:lang w:val="en-US"/>
+        </w:rPr>
+      </w:pPr>
+      <w:r>
+        <w:rPr>
+          <w:rFonts w:hint="default"/>
+          <w:lang w:val="en-US"/>
+        </w:rPr>
+        <w:t>2.2.1.12 Đặc tả usecase trả phòng</w:t>
+      </w:r>
+    </w:p>
+    <w:tbl>
+      <w:tblPr>
+        <w:tblStyle w:val="8"/>
+        <w:tblW w:w="9355" w:type="dxa"/>
+        <w:jc w:val="center"/>
+        <w:tblBorders>
+          <w:top w:val="single" w:color="auto" w:sz="4" w:space="0"/>
+          <w:left w:val="single" w:color="auto" w:sz="4" w:space="0"/>
+          <w:bottom w:val="single" w:color="auto" w:sz="4" w:space="0"/>
+          <w:right w:val="single" w:color="auto" w:sz="4" w:space="0"/>
+          <w:insideH w:val="single" w:color="auto" w:sz="4" w:space="0"/>
+          <w:insideV w:val="single" w:color="auto" w:sz="4" w:space="0"/>
+        </w:tblBorders>
+        <w:tblLayout w:type="autofit"/>
+        <w:tblCellMar>
+          <w:top w:w="0" w:type="dxa"/>
+          <w:left w:w="108" w:type="dxa"/>
+          <w:bottom w:w="0" w:type="dxa"/>
+          <w:right w:w="108" w:type="dxa"/>
+        </w:tblCellMar>
+      </w:tblPr>
+      <w:tblGrid>
+        <w:gridCol w:w="2925"/>
+        <w:gridCol w:w="6430"/>
+      </w:tblGrid>
+      <w:tr>
+        <w:tblPrEx>
+          <w:tblBorders>
+            <w:top w:val="single" w:color="auto" w:sz="4" w:space="0"/>
+            <w:left w:val="single" w:color="auto" w:sz="4" w:space="0"/>
+            <w:bottom w:val="single" w:color="auto" w:sz="4" w:space="0"/>
+            <w:right w:val="single" w:color="auto" w:sz="4" w:space="0"/>
+            <w:insideH w:val="single" w:color="auto" w:sz="4" w:space="0"/>
+            <w:insideV w:val="single" w:color="auto" w:sz="4" w:space="0"/>
+          </w:tblBorders>
+          <w:tblCellMar>
+            <w:top w:w="0" w:type="dxa"/>
+            <w:left w:w="108" w:type="dxa"/>
+            <w:bottom w:w="0" w:type="dxa"/>
+            <w:right w:w="108" w:type="dxa"/>
+          </w:tblCellMar>
+        </w:tblPrEx>
+        <w:trPr>
+          <w:jc w:val="center"/>
+        </w:trPr>
+        <w:tc>
+          <w:tcPr>
+            <w:tcW w:w="2925" w:type="dxa"/>
+            <w:vAlign w:val="center"/>
+          </w:tcPr>
+          <w:p>
+            <w:pPr>
+              <w:spacing w:line="336" w:lineRule="auto"/>
+              <w:jc w:val="center"/>
+              <w:rPr>
+                <w:rFonts w:hint="default" w:ascii="Times New Roman" w:hAnsi="Times New Roman" w:cs="Times New Roman"/>
+                <w:b/>
+                <w:bCs/>
+                <w:sz w:val="28"/>
+                <w:szCs w:val="28"/>
+              </w:rPr>
+            </w:pPr>
+            <w:r>
+              <w:rPr>
+                <w:rStyle w:val="11"/>
+                <w:rFonts w:hint="default" w:ascii="Times New Roman" w:hAnsi="Times New Roman" w:cs="Times New Roman" w:eastAsiaTheme="majorEastAsia"/>
+                <w:sz w:val="28"/>
+                <w:szCs w:val="28"/>
+              </w:rPr>
+              <w:t>Thuộc tính</w:t>
+            </w:r>
+          </w:p>
+        </w:tc>
+        <w:tc>
+          <w:tcPr>
+            <w:tcW w:w="6430" w:type="dxa"/>
+            <w:vAlign w:val="center"/>
+          </w:tcPr>
+          <w:p>
+            <w:pPr>
+              <w:spacing w:line="336" w:lineRule="auto"/>
+              <w:jc w:val="center"/>
+              <w:rPr>
+                <w:rFonts w:hint="default" w:ascii="Times New Roman" w:hAnsi="Times New Roman" w:cs="Times New Roman"/>
+                <w:b/>
+                <w:bCs/>
+                <w:sz w:val="28"/>
+                <w:szCs w:val="28"/>
+              </w:rPr>
+            </w:pPr>
+            <w:r>
+              <w:rPr>
+                <w:rStyle w:val="11"/>
+                <w:rFonts w:hint="default" w:ascii="Times New Roman" w:hAnsi="Times New Roman" w:cs="Times New Roman" w:eastAsiaTheme="majorEastAsia"/>
+                <w:sz w:val="28"/>
+                <w:szCs w:val="28"/>
+              </w:rPr>
+              <w:t>Mô tả</w:t>
+            </w:r>
+          </w:p>
+        </w:tc>
+      </w:tr>
+      <w:tr>
+        <w:tblPrEx>
+          <w:tblBorders>
+            <w:top w:val="single" w:color="auto" w:sz="4" w:space="0"/>
+            <w:left w:val="single" w:color="auto" w:sz="4" w:space="0"/>
+            <w:bottom w:val="single" w:color="auto" w:sz="4" w:space="0"/>
+            <w:right w:val="single" w:color="auto" w:sz="4" w:space="0"/>
+            <w:insideH w:val="single" w:color="auto" w:sz="4" w:space="0"/>
+            <w:insideV w:val="single" w:color="auto" w:sz="4" w:space="0"/>
+          </w:tblBorders>
+          <w:tblCellMar>
+            <w:top w:w="0" w:type="dxa"/>
+            <w:left w:w="108" w:type="dxa"/>
+            <w:bottom w:w="0" w:type="dxa"/>
+            <w:right w:w="108" w:type="dxa"/>
+          </w:tblCellMar>
+        </w:tblPrEx>
+        <w:trPr>
+          <w:jc w:val="center"/>
+        </w:trPr>
+        <w:tc>
+          <w:tcPr>
+            <w:tcW w:w="2925" w:type="dxa"/>
+            <w:vAlign w:val="center"/>
+          </w:tcPr>
+          <w:p>
+            <w:pPr>
+              <w:spacing w:line="336" w:lineRule="auto"/>
+              <w:jc w:val="center"/>
+              <w:rPr>
+                <w:rFonts w:hint="default" w:ascii="Times New Roman" w:hAnsi="Times New Roman" w:cs="Times New Roman"/>
+                <w:sz w:val="28"/>
+                <w:szCs w:val="28"/>
+              </w:rPr>
+            </w:pPr>
+            <w:r>
+              <w:rPr>
+                <w:rStyle w:val="11"/>
+                <w:rFonts w:hint="default" w:ascii="Times New Roman" w:hAnsi="Times New Roman" w:cs="Times New Roman" w:eastAsiaTheme="majorEastAsia"/>
+                <w:sz w:val="28"/>
+                <w:szCs w:val="28"/>
+              </w:rPr>
+              <w:t>Tên Use Case</w:t>
+            </w:r>
+          </w:p>
+        </w:tc>
+        <w:tc>
+          <w:tcPr>
+            <w:tcW w:w="6430" w:type="dxa"/>
+            <w:vAlign w:val="center"/>
+          </w:tcPr>
+          <w:p>
+            <w:pPr>
+              <w:spacing w:line="336" w:lineRule="auto"/>
+              <w:jc w:val="both"/>
+              <w:rPr>
+                <w:rFonts w:hint="default" w:ascii="Times New Roman" w:hAnsi="Times New Roman" w:cs="Times New Roman"/>
+                <w:sz w:val="28"/>
+                <w:szCs w:val="28"/>
+                <w:lang w:val="en-US"/>
+              </w:rPr>
+            </w:pPr>
+            <w:r>
+              <w:rPr>
+                <w:rFonts w:hint="default" w:ascii="Times New Roman" w:hAnsi="Times New Roman" w:cs="Times New Roman"/>
+                <w:sz w:val="28"/>
+                <w:szCs w:val="28"/>
+                <w:lang w:val="en-US"/>
+              </w:rPr>
+              <w:t>Trả phòng</w:t>
+            </w:r>
+          </w:p>
+        </w:tc>
+      </w:tr>
+      <w:tr>
+        <w:tblPrEx>
+          <w:tblBorders>
+            <w:top w:val="single" w:color="auto" w:sz="4" w:space="0"/>
+            <w:left w:val="single" w:color="auto" w:sz="4" w:space="0"/>
+            <w:bottom w:val="single" w:color="auto" w:sz="4" w:space="0"/>
+            <w:right w:val="single" w:color="auto" w:sz="4" w:space="0"/>
+            <w:insideH w:val="single" w:color="auto" w:sz="4" w:space="0"/>
+            <w:insideV w:val="single" w:color="auto" w:sz="4" w:space="0"/>
+          </w:tblBorders>
+          <w:tblCellMar>
+            <w:top w:w="0" w:type="dxa"/>
+            <w:left w:w="108" w:type="dxa"/>
+            <w:bottom w:w="0" w:type="dxa"/>
+            <w:right w:w="108" w:type="dxa"/>
+          </w:tblCellMar>
+        </w:tblPrEx>
+        <w:trPr>
+          <w:jc w:val="center"/>
+        </w:trPr>
+        <w:tc>
+          <w:tcPr>
+            <w:tcW w:w="2925" w:type="dxa"/>
+            <w:vAlign w:val="center"/>
+          </w:tcPr>
+          <w:p>
+            <w:pPr>
+              <w:spacing w:line="336" w:lineRule="auto"/>
+              <w:jc w:val="center"/>
+              <w:rPr>
+                <w:rFonts w:hint="default" w:ascii="Times New Roman" w:hAnsi="Times New Roman" w:cs="Times New Roman"/>
+                <w:sz w:val="28"/>
+                <w:szCs w:val="28"/>
+              </w:rPr>
+            </w:pPr>
+            <w:r>
+              <w:rPr>
+                <w:rStyle w:val="11"/>
+                <w:rFonts w:hint="default" w:ascii="Times New Roman" w:hAnsi="Times New Roman" w:cs="Times New Roman" w:eastAsiaTheme="majorEastAsia"/>
+                <w:sz w:val="28"/>
+                <w:szCs w:val="28"/>
+              </w:rPr>
+              <w:t>Mô tả</w:t>
+            </w:r>
+          </w:p>
+        </w:tc>
+        <w:tc>
+          <w:tcPr>
+            <w:tcW w:w="6430" w:type="dxa"/>
+            <w:vAlign w:val="center"/>
+          </w:tcPr>
+          <w:p>
+            <w:pPr>
+              <w:pStyle w:val="10"/>
+              <w:spacing w:before="0" w:beforeAutospacing="0" w:after="0" w:afterAutospacing="0" w:line="336" w:lineRule="auto"/>
+              <w:jc w:val="both"/>
+              <w:rPr>
+                <w:rFonts w:hint="default" w:ascii="Times New Roman" w:hAnsi="Times New Roman" w:cs="Times New Roman"/>
+                <w:sz w:val="28"/>
+                <w:szCs w:val="28"/>
+                <w:lang w:val="vi"/>
+              </w:rPr>
+            </w:pPr>
+            <w:r>
+              <w:rPr>
+                <w:rFonts w:hint="default" w:ascii="Times New Roman" w:hAnsi="Times New Roman"/>
+                <w:sz w:val="28"/>
+                <w:szCs w:val="28"/>
+                <w:lang w:val="vi"/>
+              </w:rPr>
+              <w:t>Kết thúc phiên sử dụng của khách, tính toán tổng tiền giờ</w:t>
+            </w:r>
+            <w:r>
+              <w:rPr>
+                <w:rFonts w:hint="default" w:ascii="Times New Roman" w:hAnsi="Times New Roman"/>
+                <w:sz w:val="28"/>
+                <w:szCs w:val="28"/>
+                <w:lang w:val="en-US"/>
+              </w:rPr>
+              <w:t xml:space="preserve"> (Tiền phòng)</w:t>
+            </w:r>
+            <w:r>
+              <w:rPr>
+                <w:rFonts w:hint="default" w:ascii="Times New Roman" w:hAnsi="Times New Roman"/>
+                <w:sz w:val="28"/>
+                <w:szCs w:val="28"/>
+                <w:lang w:val="vi"/>
+              </w:rPr>
+              <w:t xml:space="preserve"> và dịch vụ, áp dụng giảm giá/thuế và chuyển trạng thái phòng về </w:t>
+            </w:r>
+            <w:r>
+              <w:rPr>
+                <w:rFonts w:hint="default" w:ascii="Times New Roman" w:hAnsi="Times New Roman"/>
+                <w:sz w:val="28"/>
+                <w:szCs w:val="28"/>
+                <w:lang w:val="en-US"/>
+              </w:rPr>
+              <w:t>“</w:t>
+            </w:r>
+            <w:r>
+              <w:rPr>
+                <w:rFonts w:hint="default" w:ascii="Times New Roman" w:hAnsi="Times New Roman"/>
+                <w:sz w:val="28"/>
+                <w:szCs w:val="28"/>
+                <w:lang w:val="vi"/>
+              </w:rPr>
+              <w:t>Trống</w:t>
+            </w:r>
+            <w:r>
+              <w:rPr>
+                <w:rFonts w:hint="default" w:ascii="Times New Roman" w:hAnsi="Times New Roman"/>
+                <w:sz w:val="28"/>
+                <w:szCs w:val="28"/>
+                <w:lang w:val="en-US"/>
+              </w:rPr>
+              <w:t>” hoặc “Phòng chờ”</w:t>
+            </w:r>
+            <w:r>
+              <w:rPr>
+                <w:rFonts w:hint="default" w:ascii="Times New Roman" w:hAnsi="Times New Roman"/>
+                <w:sz w:val="28"/>
+                <w:szCs w:val="28"/>
+                <w:lang w:val="vi"/>
+              </w:rPr>
+              <w:t>.</w:t>
+            </w:r>
+          </w:p>
+        </w:tc>
+      </w:tr>
+      <w:tr>
+        <w:tblPrEx>
+          <w:tblBorders>
+            <w:top w:val="single" w:color="auto" w:sz="4" w:space="0"/>
+            <w:left w:val="single" w:color="auto" w:sz="4" w:space="0"/>
+            <w:bottom w:val="single" w:color="auto" w:sz="4" w:space="0"/>
+            <w:right w:val="single" w:color="auto" w:sz="4" w:space="0"/>
+            <w:insideH w:val="single" w:color="auto" w:sz="4" w:space="0"/>
+            <w:insideV w:val="single" w:color="auto" w:sz="4" w:space="0"/>
+          </w:tblBorders>
+          <w:tblCellMar>
+            <w:top w:w="0" w:type="dxa"/>
+            <w:left w:w="108" w:type="dxa"/>
+            <w:bottom w:w="0" w:type="dxa"/>
+            <w:right w:w="108" w:type="dxa"/>
+          </w:tblCellMar>
+        </w:tblPrEx>
+        <w:trPr>
+          <w:jc w:val="center"/>
+        </w:trPr>
+        <w:tc>
+          <w:tcPr>
+            <w:tcW w:w="2925" w:type="dxa"/>
+            <w:vAlign w:val="center"/>
+          </w:tcPr>
+          <w:p>
+            <w:pPr>
+              <w:spacing w:line="336" w:lineRule="auto"/>
+              <w:jc w:val="center"/>
+              <w:rPr>
+                <w:rFonts w:hint="default" w:ascii="Times New Roman" w:hAnsi="Times New Roman" w:cs="Times New Roman"/>
+                <w:sz w:val="28"/>
+                <w:szCs w:val="28"/>
+              </w:rPr>
+            </w:pPr>
+            <w:r>
+              <w:rPr>
+                <w:rStyle w:val="11"/>
+                <w:rFonts w:hint="default" w:ascii="Times New Roman" w:hAnsi="Times New Roman" w:cs="Times New Roman" w:eastAsiaTheme="majorEastAsia"/>
+                <w:sz w:val="28"/>
+                <w:szCs w:val="28"/>
+              </w:rPr>
+              <w:t>Tác nhân chính</w:t>
+            </w:r>
+          </w:p>
+        </w:tc>
+        <w:tc>
+          <w:tcPr>
+            <w:tcW w:w="6430" w:type="dxa"/>
+            <w:vAlign w:val="center"/>
+          </w:tcPr>
+          <w:p>
+            <w:pPr>
+              <w:spacing w:line="336" w:lineRule="auto"/>
+              <w:jc w:val="both"/>
+              <w:rPr>
+                <w:rFonts w:hint="default" w:ascii="Times New Roman" w:hAnsi="Times New Roman" w:cs="Times New Roman"/>
+                <w:sz w:val="28"/>
+                <w:szCs w:val="28"/>
+                <w:lang w:val="en-US"/>
+              </w:rPr>
+            </w:pPr>
+            <w:r>
+              <w:rPr>
+                <w:rFonts w:hint="default" w:ascii="Times New Roman" w:hAnsi="Times New Roman" w:cs="Times New Roman"/>
+                <w:sz w:val="28"/>
+                <w:szCs w:val="28"/>
+                <w:lang w:val="en-US"/>
+              </w:rPr>
+              <w:t>Admin</w:t>
+            </w:r>
+          </w:p>
+        </w:tc>
+      </w:tr>
+      <w:tr>
+        <w:tblPrEx>
+          <w:tblBorders>
+            <w:top w:val="single" w:color="auto" w:sz="4" w:space="0"/>
+            <w:left w:val="single" w:color="auto" w:sz="4" w:space="0"/>
+            <w:bottom w:val="single" w:color="auto" w:sz="4" w:space="0"/>
+            <w:right w:val="single" w:color="auto" w:sz="4" w:space="0"/>
+            <w:insideH w:val="single" w:color="auto" w:sz="4" w:space="0"/>
+            <w:insideV w:val="single" w:color="auto" w:sz="4" w:space="0"/>
+          </w:tblBorders>
+          <w:tblCellMar>
+            <w:top w:w="0" w:type="dxa"/>
+            <w:left w:w="108" w:type="dxa"/>
+            <w:bottom w:w="0" w:type="dxa"/>
+            <w:right w:w="108" w:type="dxa"/>
+          </w:tblCellMar>
+        </w:tblPrEx>
+        <w:trPr>
+          <w:jc w:val="center"/>
+        </w:trPr>
+        <w:tc>
+          <w:tcPr>
+            <w:tcW w:w="2925" w:type="dxa"/>
+            <w:vAlign w:val="center"/>
+          </w:tcPr>
+          <w:p>
+            <w:pPr>
+              <w:spacing w:line="336" w:lineRule="auto"/>
+              <w:jc w:val="center"/>
+              <w:rPr>
+                <w:rFonts w:hint="default" w:ascii="Times New Roman" w:hAnsi="Times New Roman" w:cs="Times New Roman"/>
+                <w:sz w:val="28"/>
+                <w:szCs w:val="28"/>
+              </w:rPr>
+            </w:pPr>
+            <w:r>
+              <w:rPr>
+                <w:rStyle w:val="11"/>
+                <w:rFonts w:hint="default" w:ascii="Times New Roman" w:hAnsi="Times New Roman" w:cs="Times New Roman" w:eastAsiaTheme="majorEastAsia"/>
+                <w:sz w:val="28"/>
+                <w:szCs w:val="28"/>
+              </w:rPr>
+              <w:t>Tiền điều kiện</w:t>
+            </w:r>
+          </w:p>
+        </w:tc>
+        <w:tc>
+          <w:tcPr>
+            <w:tcW w:w="6430" w:type="dxa"/>
+            <w:vAlign w:val="center"/>
+          </w:tcPr>
+          <w:p>
+            <w:pPr>
+              <w:spacing w:line="336" w:lineRule="auto"/>
+              <w:jc w:val="both"/>
+              <w:rPr>
+                <w:rFonts w:hint="default" w:ascii="Times New Roman" w:hAnsi="Times New Roman" w:cs="Times New Roman"/>
+                <w:sz w:val="28"/>
+                <w:szCs w:val="28"/>
+                <w:lang w:val="en-US"/>
+              </w:rPr>
+            </w:pPr>
+            <w:r>
+              <w:rPr>
+                <w:rFonts w:hint="default" w:ascii="Times New Roman" w:hAnsi="Times New Roman" w:cs="Times New Roman"/>
+                <w:sz w:val="28"/>
+                <w:szCs w:val="28"/>
+                <w:lang w:val="en-US"/>
+              </w:rPr>
+              <w:t>Admin đã đăng nhập vào hệ thống và đang xem thông tin chi tiết một phòng. Phòng đang xem phải là phòng đang sử dụng hoặc phòng tạm</w:t>
+            </w:r>
+          </w:p>
+        </w:tc>
+      </w:tr>
+      <w:tr>
+        <w:tblPrEx>
+          <w:tblBorders>
+            <w:top w:val="single" w:color="auto" w:sz="4" w:space="0"/>
+            <w:left w:val="single" w:color="auto" w:sz="4" w:space="0"/>
+            <w:bottom w:val="single" w:color="auto" w:sz="4" w:space="0"/>
+            <w:right w:val="single" w:color="auto" w:sz="4" w:space="0"/>
+            <w:insideH w:val="single" w:color="auto" w:sz="4" w:space="0"/>
+            <w:insideV w:val="single" w:color="auto" w:sz="4" w:space="0"/>
+          </w:tblBorders>
+          <w:tblCellMar>
+            <w:top w:w="0" w:type="dxa"/>
+            <w:left w:w="108" w:type="dxa"/>
+            <w:bottom w:w="0" w:type="dxa"/>
+            <w:right w:w="108" w:type="dxa"/>
+          </w:tblCellMar>
+        </w:tblPrEx>
+        <w:trPr>
+          <w:jc w:val="center"/>
+        </w:trPr>
+        <w:tc>
+          <w:tcPr>
+            <w:tcW w:w="2925" w:type="dxa"/>
+            <w:vAlign w:val="center"/>
+          </w:tcPr>
+          <w:p>
+            <w:pPr>
+              <w:spacing w:line="336" w:lineRule="auto"/>
+              <w:jc w:val="center"/>
+              <w:rPr>
+                <w:rFonts w:hint="default" w:ascii="Times New Roman" w:hAnsi="Times New Roman" w:cs="Times New Roman"/>
+                <w:sz w:val="28"/>
+                <w:szCs w:val="28"/>
+              </w:rPr>
+            </w:pPr>
+            <w:r>
+              <w:rPr>
+                <w:rStyle w:val="11"/>
+                <w:rFonts w:hint="default" w:ascii="Times New Roman" w:hAnsi="Times New Roman" w:cs="Times New Roman" w:eastAsiaTheme="majorEastAsia"/>
+                <w:sz w:val="28"/>
+                <w:szCs w:val="28"/>
+              </w:rPr>
+              <w:t>Hậu điều kiện</w:t>
+            </w:r>
+          </w:p>
+        </w:tc>
+        <w:tc>
+          <w:tcPr>
+            <w:tcW w:w="6430" w:type="dxa"/>
+            <w:vAlign w:val="center"/>
+          </w:tcPr>
+          <w:p>
+            <w:pPr>
+              <w:pStyle w:val="10"/>
+              <w:spacing w:before="0" w:beforeAutospacing="0" w:after="0" w:afterAutospacing="0" w:line="336" w:lineRule="auto"/>
+              <w:jc w:val="both"/>
+              <w:rPr>
+                <w:rFonts w:hint="default" w:ascii="Times New Roman" w:hAnsi="Times New Roman" w:cs="Times New Roman"/>
+                <w:sz w:val="28"/>
+                <w:szCs w:val="28"/>
+                <w:lang w:val="en-US"/>
+              </w:rPr>
+            </w:pPr>
+            <w:r>
+              <w:rPr>
+                <w:rFonts w:hint="default" w:ascii="Times New Roman" w:hAnsi="Times New Roman" w:cs="Times New Roman"/>
+                <w:sz w:val="28"/>
+                <w:szCs w:val="28"/>
+                <w:lang w:val="en-US"/>
+              </w:rPr>
+              <w:t>Trạng thái phòng được chuyển thành “Phòng trống” hoặc “Phòng chờ”. Tính tổng tiền của hóa đơn và chuyển trạng thái của hóa đơn sang “Chưa thanh toán”.</w:t>
+            </w:r>
+          </w:p>
+        </w:tc>
+      </w:tr>
+      <w:tr>
+        <w:tblPrEx>
+          <w:tblBorders>
+            <w:top w:val="single" w:color="auto" w:sz="4" w:space="0"/>
+            <w:left w:val="single" w:color="auto" w:sz="4" w:space="0"/>
+            <w:bottom w:val="single" w:color="auto" w:sz="4" w:space="0"/>
+            <w:right w:val="single" w:color="auto" w:sz="4" w:space="0"/>
+            <w:insideH w:val="single" w:color="auto" w:sz="4" w:space="0"/>
+            <w:insideV w:val="single" w:color="auto" w:sz="4" w:space="0"/>
+          </w:tblBorders>
+          <w:tblCellMar>
+            <w:top w:w="0" w:type="dxa"/>
+            <w:left w:w="108" w:type="dxa"/>
+            <w:bottom w:w="0" w:type="dxa"/>
+            <w:right w:w="108" w:type="dxa"/>
+          </w:tblCellMar>
+        </w:tblPrEx>
+        <w:trPr>
+          <w:jc w:val="center"/>
+        </w:trPr>
+        <w:tc>
+          <w:tcPr>
+            <w:tcW w:w="2925" w:type="dxa"/>
+            <w:vAlign w:val="center"/>
+          </w:tcPr>
+          <w:p>
+            <w:pPr>
+              <w:spacing w:line="336" w:lineRule="auto"/>
+              <w:jc w:val="center"/>
+              <w:rPr>
+                <w:rFonts w:hint="default" w:ascii="Times New Roman" w:hAnsi="Times New Roman" w:cs="Times New Roman"/>
+                <w:sz w:val="28"/>
+                <w:szCs w:val="28"/>
+              </w:rPr>
+            </w:pPr>
+            <w:r>
+              <w:rPr>
+                <w:rStyle w:val="11"/>
+                <w:rFonts w:hint="default" w:ascii="Times New Roman" w:hAnsi="Times New Roman" w:cs="Times New Roman" w:eastAsiaTheme="majorEastAsia"/>
+                <w:sz w:val="28"/>
+                <w:szCs w:val="28"/>
+              </w:rPr>
+              <w:t>Luồng chính</w:t>
+            </w:r>
+          </w:p>
+        </w:tc>
+        <w:tc>
+          <w:tcPr>
+            <w:tcW w:w="6430" w:type="dxa"/>
+            <w:vAlign w:val="center"/>
+          </w:tcPr>
+          <w:p>
+            <w:pPr>
+              <w:pStyle w:val="10"/>
+              <w:numPr>
+                <w:ilvl w:val="0"/>
+                <w:numId w:val="13"/>
+              </w:numPr>
+              <w:spacing w:before="0" w:beforeAutospacing="0" w:after="0" w:afterAutospacing="0" w:line="336" w:lineRule="auto"/>
+              <w:jc w:val="both"/>
+              <w:rPr>
+                <w:rFonts w:hint="default" w:ascii="Times New Roman" w:hAnsi="Times New Roman" w:cs="Times New Roman"/>
+                <w:sz w:val="28"/>
+                <w:szCs w:val="28"/>
+                <w:lang w:val="en-US"/>
+              </w:rPr>
+            </w:pPr>
+            <w:r>
+              <w:rPr>
+                <w:rFonts w:hint="default" w:ascii="Times New Roman" w:hAnsi="Times New Roman" w:cs="Times New Roman"/>
+                <w:sz w:val="28"/>
+                <w:szCs w:val="28"/>
+                <w:lang w:val="en-US"/>
+              </w:rPr>
+              <w:t>Admin nhấn nút [Trả phòng]</w:t>
+            </w:r>
+          </w:p>
+          <w:p>
+            <w:pPr>
+              <w:pStyle w:val="10"/>
+              <w:numPr>
+                <w:ilvl w:val="0"/>
+                <w:numId w:val="13"/>
+              </w:numPr>
+              <w:spacing w:before="0" w:beforeAutospacing="0" w:after="0" w:afterAutospacing="0" w:line="336" w:lineRule="auto"/>
+              <w:jc w:val="both"/>
+              <w:rPr>
+                <w:rFonts w:hint="default" w:ascii="Times New Roman" w:hAnsi="Times New Roman" w:cs="Times New Roman"/>
+                <w:sz w:val="28"/>
+                <w:szCs w:val="28"/>
+                <w:lang w:val="en-US"/>
+              </w:rPr>
+            </w:pPr>
+            <w:r>
+              <w:rPr>
+                <w:rFonts w:hint="default" w:ascii="Times New Roman" w:hAnsi="Times New Roman" w:cs="Times New Roman"/>
+                <w:sz w:val="28"/>
+                <w:szCs w:val="28"/>
+                <w:lang w:val="en-US"/>
+              </w:rPr>
+              <w:t>Hệ thống hiển thị hộp thoại xác nhận</w:t>
+            </w:r>
+          </w:p>
+          <w:p>
+            <w:pPr>
+              <w:pStyle w:val="10"/>
+              <w:numPr>
+                <w:ilvl w:val="0"/>
+                <w:numId w:val="13"/>
+              </w:numPr>
+              <w:spacing w:before="0" w:beforeAutospacing="0" w:after="0" w:afterAutospacing="0" w:line="336" w:lineRule="auto"/>
+              <w:jc w:val="both"/>
+              <w:rPr>
+                <w:rFonts w:hint="default" w:ascii="Times New Roman" w:hAnsi="Times New Roman" w:cs="Times New Roman"/>
+                <w:sz w:val="28"/>
+                <w:szCs w:val="28"/>
+                <w:lang w:val="en-US"/>
+              </w:rPr>
+            </w:pPr>
+            <w:r>
+              <w:rPr>
+                <w:rFonts w:hint="default" w:ascii="Times New Roman" w:hAnsi="Times New Roman" w:cs="Times New Roman"/>
+                <w:sz w:val="28"/>
+                <w:szCs w:val="28"/>
+                <w:lang w:val="en-US"/>
+              </w:rPr>
+              <w:t>Admin chọn “Đồng ý” thì hệ thống tiến hành ghi nhận thời điểm kết thúc, sau đó tính tổng tiền giờ (tiền phòng), tiền dịch vụ, áp dụng giảm giá (dựa vào điểm tích lũy của hội viên) và thuế. Từ đó tính tổng tiền cuối cùng của hóa đơn.</w:t>
+            </w:r>
+          </w:p>
+          <w:p>
+            <w:pPr>
+              <w:pStyle w:val="10"/>
               <w:numPr>
                 <w:numId w:val="0"/>
               </w:numPr>
-              <w:spacing w:line="336" w:lineRule="auto"/>
-              <w:ind w:left="70" w:leftChars="0"/>
-              <w:jc w:val="both"/>
-              <w:rPr>
-                <w:rFonts w:hint="default" w:ascii="Times New Roman" w:hAnsi="Times New Roman" w:cs="Times New Roman"/>
-                <w:sz w:val="28"/>
-                <w:szCs w:val="28"/>
-                <w:lang w:val="en-US"/>
-              </w:rPr>
-            </w:pPr>
-            <w:r>
-              <w:rPr>
-                <w:rFonts w:hint="default" w:ascii="Times New Roman" w:hAnsi="Times New Roman" w:cs="Times New Roman"/>
-                <w:sz w:val="28"/>
-                <w:szCs w:val="28"/>
-                <w:lang w:val="en-US"/>
-              </w:rPr>
-              <w:t>3.1.1.1 Nếu số lượng thêm mới không hợp lệ thì hệ thống thông báo lỗi số lượng không hợp lệ đến Admin</w:t>
-            </w:r>
-          </w:p>
-          <w:p>
-            <w:pPr>
+              <w:spacing w:before="0" w:beforeAutospacing="0" w:after="0" w:afterAutospacing="0" w:line="336" w:lineRule="auto"/>
+              <w:jc w:val="both"/>
+              <w:rPr>
+                <w:rFonts w:hint="default" w:ascii="Times New Roman" w:hAnsi="Times New Roman" w:cs="Times New Roman"/>
+                <w:sz w:val="28"/>
+                <w:szCs w:val="28"/>
+                <w:lang w:val="en-US"/>
+              </w:rPr>
+            </w:pPr>
+            <w:r>
+              <w:rPr>
+                <w:rFonts w:hint="default" w:ascii="Times New Roman" w:hAnsi="Times New Roman" w:cs="Times New Roman"/>
+                <w:sz w:val="28"/>
+                <w:szCs w:val="28"/>
+                <w:lang w:val="en-US"/>
+              </w:rPr>
+              <w:t xml:space="preserve">  Số tiền được giảm = (Tiền phòng + Tiền dịch vụ) * (Phần trăm giảm giá / 100)</w:t>
+            </w:r>
+          </w:p>
+          <w:p>
+            <w:pPr>
+              <w:pStyle w:val="10"/>
               <w:numPr>
                 <w:numId w:val="0"/>
               </w:numPr>
-              <w:spacing w:line="336" w:lineRule="auto"/>
-              <w:ind w:left="70" w:leftChars="0"/>
-              <w:jc w:val="both"/>
-              <w:rPr>
-                <w:rFonts w:hint="default" w:ascii="Times New Roman" w:hAnsi="Times New Roman" w:cs="Times New Roman"/>
-                <w:sz w:val="28"/>
-                <w:szCs w:val="28"/>
-                <w:lang w:val="en-US"/>
-              </w:rPr>
-            </w:pPr>
-            <w:r>
-              <w:rPr>
-                <w:rFonts w:hint="default" w:ascii="Times New Roman" w:hAnsi="Times New Roman" w:cs="Times New Roman"/>
-                <w:sz w:val="28"/>
-                <w:szCs w:val="28"/>
-                <w:lang w:val="en-US"/>
-              </w:rPr>
-              <w:t>3.2.2 Nếu không hợp lệ thì hệ thống thông báo lỗi số lượng không hợp lệ đến Admin</w:t>
-            </w:r>
-          </w:p>
-          <w:p>
-            <w:pPr>
+              <w:spacing w:before="0" w:beforeAutospacing="0" w:after="0" w:afterAutospacing="0" w:line="336" w:lineRule="auto"/>
+              <w:jc w:val="both"/>
+              <w:rPr>
+                <w:rFonts w:hint="default" w:ascii="Times New Roman" w:hAnsi="Times New Roman" w:cs="Times New Roman"/>
+                <w:sz w:val="28"/>
+                <w:szCs w:val="28"/>
+                <w:lang w:val="en-US"/>
+              </w:rPr>
+            </w:pPr>
+            <w:r>
+              <w:rPr>
+                <w:rFonts w:hint="default" w:ascii="Times New Roman" w:hAnsi="Times New Roman" w:cs="Times New Roman"/>
+                <w:sz w:val="28"/>
+                <w:szCs w:val="28"/>
+                <w:lang w:val="en-US"/>
+              </w:rPr>
+              <w:t xml:space="preserve">  Tiền thuế VAT = (Tiền phòng + Tiền dịch vu - Số tiền được giảm) * (Thuế suất VAT / 100) </w:t>
+            </w:r>
+          </w:p>
+          <w:p>
+            <w:pPr>
+              <w:pStyle w:val="10"/>
               <w:numPr>
                 <w:numId w:val="0"/>
               </w:numPr>
-              <w:spacing w:line="336" w:lineRule="auto"/>
-              <w:ind w:left="70" w:leftChars="0"/>
-              <w:jc w:val="both"/>
-              <w:rPr>
-                <w:rFonts w:hint="default" w:ascii="Times New Roman" w:hAnsi="Times New Roman" w:cs="Times New Roman"/>
-                <w:sz w:val="28"/>
-                <w:szCs w:val="28"/>
-                <w:lang w:val="en-US"/>
-              </w:rPr>
-            </w:pPr>
-            <w:r>
-              <w:rPr>
-                <w:rFonts w:hint="default" w:ascii="Times New Roman" w:hAnsi="Times New Roman" w:cs="Times New Roman"/>
-                <w:sz w:val="28"/>
-                <w:szCs w:val="28"/>
-                <w:lang w:val="en-US"/>
-              </w:rPr>
-              <w:t>3.3.2 Nếu Admin chọn hủy thì hệ thống đóng hội hoại và quay về màn hình cập nhật dịch vụ của phòng</w:t>
+              <w:spacing w:before="0" w:beforeAutospacing="0" w:after="0" w:afterAutospacing="0" w:line="336" w:lineRule="auto"/>
+              <w:ind w:firstLine="140" w:firstLineChars="50"/>
+              <w:jc w:val="both"/>
+              <w:rPr>
+                <w:rFonts w:hint="default" w:ascii="Times New Roman" w:hAnsi="Times New Roman" w:cs="Times New Roman"/>
+                <w:sz w:val="28"/>
+                <w:szCs w:val="28"/>
+                <w:lang w:val="en-US"/>
+              </w:rPr>
+            </w:pPr>
+            <w:r>
+              <w:rPr>
+                <w:rFonts w:hint="default" w:ascii="Times New Roman" w:hAnsi="Times New Roman" w:cs="Times New Roman"/>
+                <w:sz w:val="28"/>
+                <w:szCs w:val="28"/>
+                <w:lang w:val="en-US"/>
+              </w:rPr>
+              <w:t>Tổng tiền cuối cùng = Tiền phòng + Tiền dịch vụ  - Số tiền được giảm + Tiền thuế VAT</w:t>
+            </w:r>
+          </w:p>
+          <w:p>
+            <w:pPr>
+              <w:pStyle w:val="10"/>
+              <w:numPr>
+                <w:numId w:val="0"/>
+              </w:numPr>
+              <w:spacing w:before="0" w:beforeAutospacing="0" w:after="0" w:afterAutospacing="0" w:line="336" w:lineRule="auto"/>
+              <w:jc w:val="both"/>
+              <w:rPr>
+                <w:rFonts w:hint="default" w:ascii="Times New Roman" w:hAnsi="Times New Roman" w:cs="Times New Roman"/>
+                <w:sz w:val="28"/>
+                <w:szCs w:val="28"/>
+                <w:lang w:val="en-US"/>
+              </w:rPr>
+            </w:pPr>
+            <w:r>
+              <w:rPr>
+                <w:rFonts w:hint="default" w:ascii="Times New Roman" w:hAnsi="Times New Roman" w:cs="Times New Roman"/>
+                <w:sz w:val="28"/>
+                <w:szCs w:val="28"/>
+                <w:lang w:val="en-US"/>
+              </w:rPr>
+              <w:t>Chuyển hóa đơn sang trạng thái “Chưa thanh toán”.</w:t>
+            </w:r>
+          </w:p>
+          <w:p>
+            <w:pPr>
+              <w:pStyle w:val="10"/>
+              <w:numPr>
+                <w:ilvl w:val="0"/>
+                <w:numId w:val="13"/>
+              </w:numPr>
+              <w:spacing w:before="0" w:beforeAutospacing="0" w:after="0" w:afterAutospacing="0" w:line="336" w:lineRule="auto"/>
+              <w:jc w:val="both"/>
+              <w:rPr>
+                <w:rFonts w:hint="default" w:ascii="Times New Roman" w:hAnsi="Times New Roman" w:cs="Times New Roman"/>
+                <w:sz w:val="28"/>
+                <w:szCs w:val="28"/>
+                <w:lang w:val="en-US"/>
+              </w:rPr>
+            </w:pPr>
+            <w:r>
+              <w:rPr>
+                <w:rFonts w:hint="default" w:ascii="Times New Roman" w:hAnsi="Times New Roman" w:cs="Times New Roman"/>
+                <w:sz w:val="28"/>
+                <w:szCs w:val="28"/>
+                <w:lang w:val="en-US"/>
+              </w:rPr>
+              <w:t>Hệ thống thông báo trả phòng thành công kèm theo các lự chọn “Xuất hóa đơn” và “Xác nhận khách hàng đã thanh toán”</w:t>
+            </w:r>
+          </w:p>
+        </w:tc>
+      </w:tr>
+      <w:tr>
+        <w:tblPrEx>
+          <w:tblBorders>
+            <w:top w:val="single" w:color="auto" w:sz="4" w:space="0"/>
+            <w:left w:val="single" w:color="auto" w:sz="4" w:space="0"/>
+            <w:bottom w:val="single" w:color="auto" w:sz="4" w:space="0"/>
+            <w:right w:val="single" w:color="auto" w:sz="4" w:space="0"/>
+            <w:insideH w:val="single" w:color="auto" w:sz="4" w:space="0"/>
+            <w:insideV w:val="single" w:color="auto" w:sz="4" w:space="0"/>
+          </w:tblBorders>
+          <w:tblCellMar>
+            <w:top w:w="0" w:type="dxa"/>
+            <w:left w:w="108" w:type="dxa"/>
+            <w:bottom w:w="0" w:type="dxa"/>
+            <w:right w:w="108" w:type="dxa"/>
+          </w:tblCellMar>
+        </w:tblPrEx>
+        <w:trPr>
+          <w:jc w:val="center"/>
+        </w:trPr>
+        <w:tc>
+          <w:tcPr>
+            <w:tcW w:w="2925" w:type="dxa"/>
+            <w:vAlign w:val="center"/>
+          </w:tcPr>
+          <w:p>
+            <w:pPr>
+              <w:spacing w:line="336" w:lineRule="auto"/>
+              <w:jc w:val="center"/>
+              <w:rPr>
+                <w:rFonts w:hint="default" w:ascii="Times New Roman" w:hAnsi="Times New Roman" w:cs="Times New Roman"/>
+                <w:sz w:val="28"/>
+                <w:szCs w:val="28"/>
+              </w:rPr>
+            </w:pPr>
+            <w:r>
+              <w:rPr>
+                <w:rStyle w:val="11"/>
+                <w:rFonts w:hint="default" w:ascii="Times New Roman" w:hAnsi="Times New Roman" w:cs="Times New Roman" w:eastAsiaTheme="majorEastAsia"/>
+                <w:sz w:val="28"/>
+                <w:szCs w:val="28"/>
+              </w:rPr>
+              <w:t>Luồng thay thế</w:t>
+            </w:r>
+          </w:p>
+        </w:tc>
+        <w:tc>
+          <w:tcPr>
+            <w:tcW w:w="6430" w:type="dxa"/>
+            <w:vAlign w:val="center"/>
+          </w:tcPr>
+          <w:p>
+            <w:pPr>
+              <w:spacing w:line="336" w:lineRule="auto"/>
+              <w:jc w:val="both"/>
+              <w:rPr>
+                <w:rFonts w:hint="default" w:ascii="Times New Roman" w:hAnsi="Times New Roman" w:cs="Times New Roman"/>
+                <w:sz w:val="28"/>
+                <w:szCs w:val="28"/>
+                <w:lang w:val="en-US"/>
+              </w:rPr>
+            </w:pPr>
+            <w:r>
+              <w:rPr>
+                <w:rFonts w:hint="default" w:ascii="Times New Roman" w:hAnsi="Times New Roman" w:cs="Times New Roman"/>
+                <w:sz w:val="28"/>
+                <w:szCs w:val="28"/>
+                <w:lang w:val="en-US"/>
+              </w:rPr>
+              <w:t xml:space="preserve">2.1 Admin chọn hủy thì hệ thống đóng hộp thoại xác nhận và quay về màn hình xem chi tiết phòng </w:t>
+            </w:r>
+          </w:p>
+        </w:tc>
+      </w:tr>
+    </w:tbl>
+    <w:p>
+      <w:pPr>
+        <w:numPr>
+          <w:ilvl w:val="0"/>
+          <w:numId w:val="0"/>
+        </w:numPr>
+        <w:ind w:leftChars="0"/>
+        <w:rPr>
+          <w:rFonts w:hint="default" w:ascii="Times New Roman" w:hAnsi="Times New Roman" w:cs="Times New Roman"/>
+          <w:lang w:val="en-US"/>
+        </w:rPr>
+      </w:pPr>
+    </w:p>
+    <w:p>
+      <w:pPr>
+        <w:pStyle w:val="6"/>
+        <w:bidi w:val="0"/>
+        <w:rPr>
+          <w:rFonts w:hint="default"/>
+          <w:lang w:val="en-US"/>
+        </w:rPr>
+      </w:pPr>
+      <w:r>
+        <w:rPr>
+          <w:rFonts w:hint="default"/>
+          <w:lang w:val="en-US"/>
+        </w:rPr>
+        <w:t>2.2.1.13 Đặc tả usecase xem danh sách lịch đặt</w:t>
+      </w:r>
+    </w:p>
+    <w:tbl>
+      <w:tblPr>
+        <w:tblStyle w:val="8"/>
+        <w:tblW w:w="9355" w:type="dxa"/>
+        <w:jc w:val="center"/>
+        <w:tblBorders>
+          <w:top w:val="single" w:color="auto" w:sz="4" w:space="0"/>
+          <w:left w:val="single" w:color="auto" w:sz="4" w:space="0"/>
+          <w:bottom w:val="single" w:color="auto" w:sz="4" w:space="0"/>
+          <w:right w:val="single" w:color="auto" w:sz="4" w:space="0"/>
+          <w:insideH w:val="single" w:color="auto" w:sz="4" w:space="0"/>
+          <w:insideV w:val="single" w:color="auto" w:sz="4" w:space="0"/>
+        </w:tblBorders>
+        <w:tblLayout w:type="autofit"/>
+        <w:tblCellMar>
+          <w:top w:w="0" w:type="dxa"/>
+          <w:left w:w="108" w:type="dxa"/>
+          <w:bottom w:w="0" w:type="dxa"/>
+          <w:right w:w="108" w:type="dxa"/>
+        </w:tblCellMar>
+      </w:tblPr>
+      <w:tblGrid>
+        <w:gridCol w:w="2925"/>
+        <w:gridCol w:w="6430"/>
+      </w:tblGrid>
+      <w:tr>
+        <w:tblPrEx>
+          <w:tblBorders>
+            <w:top w:val="single" w:color="auto" w:sz="4" w:space="0"/>
+            <w:left w:val="single" w:color="auto" w:sz="4" w:space="0"/>
+            <w:bottom w:val="single" w:color="auto" w:sz="4" w:space="0"/>
+            <w:right w:val="single" w:color="auto" w:sz="4" w:space="0"/>
+            <w:insideH w:val="single" w:color="auto" w:sz="4" w:space="0"/>
+            <w:insideV w:val="single" w:color="auto" w:sz="4" w:space="0"/>
+          </w:tblBorders>
+          <w:tblCellMar>
+            <w:top w:w="0" w:type="dxa"/>
+            <w:left w:w="108" w:type="dxa"/>
+            <w:bottom w:w="0" w:type="dxa"/>
+            <w:right w:w="108" w:type="dxa"/>
+          </w:tblCellMar>
+        </w:tblPrEx>
+        <w:trPr>
+          <w:jc w:val="center"/>
+        </w:trPr>
+        <w:tc>
+          <w:tcPr>
+            <w:tcW w:w="2925" w:type="dxa"/>
+            <w:vAlign w:val="center"/>
+          </w:tcPr>
+          <w:p>
+            <w:pPr>
+              <w:spacing w:line="336" w:lineRule="auto"/>
+              <w:jc w:val="center"/>
+              <w:rPr>
+                <w:rFonts w:hint="default" w:ascii="Times New Roman" w:hAnsi="Times New Roman" w:cs="Times New Roman"/>
+                <w:b/>
+                <w:bCs/>
+                <w:sz w:val="28"/>
+                <w:szCs w:val="28"/>
+              </w:rPr>
+            </w:pPr>
+            <w:r>
+              <w:rPr>
+                <w:rStyle w:val="11"/>
+                <w:rFonts w:hint="default" w:ascii="Times New Roman" w:hAnsi="Times New Roman" w:cs="Times New Roman" w:eastAsiaTheme="majorEastAsia"/>
+                <w:sz w:val="28"/>
+                <w:szCs w:val="28"/>
+              </w:rPr>
+              <w:t>Thuộc tính</w:t>
+            </w:r>
+          </w:p>
+        </w:tc>
+        <w:tc>
+          <w:tcPr>
+            <w:tcW w:w="6430" w:type="dxa"/>
+            <w:vAlign w:val="center"/>
+          </w:tcPr>
+          <w:p>
+            <w:pPr>
+              <w:spacing w:line="336" w:lineRule="auto"/>
+              <w:jc w:val="center"/>
+              <w:rPr>
+                <w:rFonts w:hint="default" w:ascii="Times New Roman" w:hAnsi="Times New Roman" w:cs="Times New Roman"/>
+                <w:b/>
+                <w:bCs/>
+                <w:sz w:val="28"/>
+                <w:szCs w:val="28"/>
+              </w:rPr>
+            </w:pPr>
+            <w:r>
+              <w:rPr>
+                <w:rStyle w:val="11"/>
+                <w:rFonts w:hint="default" w:ascii="Times New Roman" w:hAnsi="Times New Roman" w:cs="Times New Roman" w:eastAsiaTheme="majorEastAsia"/>
+                <w:sz w:val="28"/>
+                <w:szCs w:val="28"/>
+              </w:rPr>
+              <w:t>Mô tả</w:t>
+            </w:r>
+          </w:p>
+        </w:tc>
+      </w:tr>
+      <w:tr>
+        <w:tblPrEx>
+          <w:tblBorders>
+            <w:top w:val="single" w:color="auto" w:sz="4" w:space="0"/>
+            <w:left w:val="single" w:color="auto" w:sz="4" w:space="0"/>
+            <w:bottom w:val="single" w:color="auto" w:sz="4" w:space="0"/>
+            <w:right w:val="single" w:color="auto" w:sz="4" w:space="0"/>
+            <w:insideH w:val="single" w:color="auto" w:sz="4" w:space="0"/>
+            <w:insideV w:val="single" w:color="auto" w:sz="4" w:space="0"/>
+          </w:tblBorders>
+          <w:tblCellMar>
+            <w:top w:w="0" w:type="dxa"/>
+            <w:left w:w="108" w:type="dxa"/>
+            <w:bottom w:w="0" w:type="dxa"/>
+            <w:right w:w="108" w:type="dxa"/>
+          </w:tblCellMar>
+        </w:tblPrEx>
+        <w:trPr>
+          <w:jc w:val="center"/>
+        </w:trPr>
+        <w:tc>
+          <w:tcPr>
+            <w:tcW w:w="2925" w:type="dxa"/>
+            <w:vAlign w:val="center"/>
+          </w:tcPr>
+          <w:p>
+            <w:pPr>
+              <w:spacing w:line="336" w:lineRule="auto"/>
+              <w:jc w:val="center"/>
+              <w:rPr>
+                <w:rFonts w:hint="default" w:ascii="Times New Roman" w:hAnsi="Times New Roman" w:cs="Times New Roman"/>
+                <w:sz w:val="28"/>
+                <w:szCs w:val="28"/>
+              </w:rPr>
+            </w:pPr>
+            <w:r>
+              <w:rPr>
+                <w:rStyle w:val="11"/>
+                <w:rFonts w:hint="default" w:ascii="Times New Roman" w:hAnsi="Times New Roman" w:cs="Times New Roman" w:eastAsiaTheme="majorEastAsia"/>
+                <w:sz w:val="28"/>
+                <w:szCs w:val="28"/>
+              </w:rPr>
+              <w:t>Tên Use Case</w:t>
+            </w:r>
+          </w:p>
+        </w:tc>
+        <w:tc>
+          <w:tcPr>
+            <w:tcW w:w="6430" w:type="dxa"/>
+            <w:vAlign w:val="center"/>
+          </w:tcPr>
+          <w:p>
+            <w:pPr>
+              <w:spacing w:line="336" w:lineRule="auto"/>
+              <w:jc w:val="both"/>
+              <w:rPr>
+                <w:rFonts w:hint="default" w:ascii="Times New Roman" w:hAnsi="Times New Roman" w:cs="Times New Roman"/>
+                <w:sz w:val="28"/>
+                <w:szCs w:val="28"/>
+                <w:lang w:val="en-US"/>
+              </w:rPr>
+            </w:pPr>
+            <w:r>
+              <w:rPr>
+                <w:rFonts w:hint="default" w:ascii="Times New Roman" w:hAnsi="Times New Roman" w:cs="Times New Roman"/>
+                <w:sz w:val="28"/>
+                <w:szCs w:val="28"/>
+                <w:lang w:val="en-US"/>
+              </w:rPr>
+              <w:t>Xem danh sách lịch đặt</w:t>
+            </w:r>
+          </w:p>
+        </w:tc>
+      </w:tr>
+      <w:tr>
+        <w:tblPrEx>
+          <w:tblBorders>
+            <w:top w:val="single" w:color="auto" w:sz="4" w:space="0"/>
+            <w:left w:val="single" w:color="auto" w:sz="4" w:space="0"/>
+            <w:bottom w:val="single" w:color="auto" w:sz="4" w:space="0"/>
+            <w:right w:val="single" w:color="auto" w:sz="4" w:space="0"/>
+            <w:insideH w:val="single" w:color="auto" w:sz="4" w:space="0"/>
+            <w:insideV w:val="single" w:color="auto" w:sz="4" w:space="0"/>
+          </w:tblBorders>
+          <w:tblCellMar>
+            <w:top w:w="0" w:type="dxa"/>
+            <w:left w:w="108" w:type="dxa"/>
+            <w:bottom w:w="0" w:type="dxa"/>
+            <w:right w:w="108" w:type="dxa"/>
+          </w:tblCellMar>
+        </w:tblPrEx>
+        <w:trPr>
+          <w:jc w:val="center"/>
+        </w:trPr>
+        <w:tc>
+          <w:tcPr>
+            <w:tcW w:w="2925" w:type="dxa"/>
+            <w:vAlign w:val="center"/>
+          </w:tcPr>
+          <w:p>
+            <w:pPr>
+              <w:spacing w:line="336" w:lineRule="auto"/>
+              <w:jc w:val="center"/>
+              <w:rPr>
+                <w:rFonts w:hint="default" w:ascii="Times New Roman" w:hAnsi="Times New Roman" w:cs="Times New Roman"/>
+                <w:sz w:val="28"/>
+                <w:szCs w:val="28"/>
+              </w:rPr>
+            </w:pPr>
+            <w:r>
+              <w:rPr>
+                <w:rStyle w:val="11"/>
+                <w:rFonts w:hint="default" w:ascii="Times New Roman" w:hAnsi="Times New Roman" w:cs="Times New Roman" w:eastAsiaTheme="majorEastAsia"/>
+                <w:sz w:val="28"/>
+                <w:szCs w:val="28"/>
+              </w:rPr>
+              <w:t>Mô tả</w:t>
+            </w:r>
+          </w:p>
+        </w:tc>
+        <w:tc>
+          <w:tcPr>
+            <w:tcW w:w="6430" w:type="dxa"/>
+            <w:vAlign w:val="center"/>
+          </w:tcPr>
+          <w:p>
+            <w:pPr>
+              <w:pStyle w:val="10"/>
+              <w:spacing w:before="0" w:beforeAutospacing="0" w:after="0" w:afterAutospacing="0" w:line="336" w:lineRule="auto"/>
+              <w:jc w:val="both"/>
+              <w:rPr>
+                <w:rFonts w:hint="default" w:ascii="Times New Roman" w:hAnsi="Times New Roman" w:cs="Times New Roman"/>
+                <w:sz w:val="28"/>
+                <w:szCs w:val="28"/>
+                <w:lang w:val="en-US"/>
+              </w:rPr>
+            </w:pPr>
+            <w:r>
+              <w:rPr>
+                <w:rFonts w:hint="default" w:ascii="Times New Roman" w:hAnsi="Times New Roman" w:cs="Times New Roman"/>
+                <w:sz w:val="28"/>
+                <w:szCs w:val="28"/>
+                <w:lang w:val="en-US"/>
+              </w:rPr>
+              <w:t>Hiển thị danh sách các lịch đặt của phòng hiện tại</w:t>
+            </w:r>
+          </w:p>
+        </w:tc>
+      </w:tr>
+      <w:tr>
+        <w:tblPrEx>
+          <w:tblBorders>
+            <w:top w:val="single" w:color="auto" w:sz="4" w:space="0"/>
+            <w:left w:val="single" w:color="auto" w:sz="4" w:space="0"/>
+            <w:bottom w:val="single" w:color="auto" w:sz="4" w:space="0"/>
+            <w:right w:val="single" w:color="auto" w:sz="4" w:space="0"/>
+            <w:insideH w:val="single" w:color="auto" w:sz="4" w:space="0"/>
+            <w:insideV w:val="single" w:color="auto" w:sz="4" w:space="0"/>
+          </w:tblBorders>
+          <w:tblCellMar>
+            <w:top w:w="0" w:type="dxa"/>
+            <w:left w:w="108" w:type="dxa"/>
+            <w:bottom w:w="0" w:type="dxa"/>
+            <w:right w:w="108" w:type="dxa"/>
+          </w:tblCellMar>
+        </w:tblPrEx>
+        <w:trPr>
+          <w:jc w:val="center"/>
+        </w:trPr>
+        <w:tc>
+          <w:tcPr>
+            <w:tcW w:w="2925" w:type="dxa"/>
+            <w:vAlign w:val="center"/>
+          </w:tcPr>
+          <w:p>
+            <w:pPr>
+              <w:spacing w:line="336" w:lineRule="auto"/>
+              <w:jc w:val="center"/>
+              <w:rPr>
+                <w:rFonts w:hint="default" w:ascii="Times New Roman" w:hAnsi="Times New Roman" w:cs="Times New Roman"/>
+                <w:sz w:val="28"/>
+                <w:szCs w:val="28"/>
+              </w:rPr>
+            </w:pPr>
+            <w:r>
+              <w:rPr>
+                <w:rStyle w:val="11"/>
+                <w:rFonts w:hint="default" w:ascii="Times New Roman" w:hAnsi="Times New Roman" w:cs="Times New Roman" w:eastAsiaTheme="majorEastAsia"/>
+                <w:sz w:val="28"/>
+                <w:szCs w:val="28"/>
+              </w:rPr>
+              <w:t>Tác nhân chính</w:t>
+            </w:r>
+          </w:p>
+        </w:tc>
+        <w:tc>
+          <w:tcPr>
+            <w:tcW w:w="6430" w:type="dxa"/>
+            <w:vAlign w:val="center"/>
+          </w:tcPr>
+          <w:p>
+            <w:pPr>
+              <w:spacing w:line="336" w:lineRule="auto"/>
+              <w:jc w:val="both"/>
+              <w:rPr>
+                <w:rFonts w:hint="default" w:ascii="Times New Roman" w:hAnsi="Times New Roman" w:cs="Times New Roman"/>
+                <w:sz w:val="28"/>
+                <w:szCs w:val="28"/>
+                <w:lang w:val="en-US"/>
+              </w:rPr>
+            </w:pPr>
+            <w:r>
+              <w:rPr>
+                <w:rFonts w:hint="default" w:ascii="Times New Roman" w:hAnsi="Times New Roman" w:cs="Times New Roman"/>
+                <w:sz w:val="28"/>
+                <w:szCs w:val="28"/>
+                <w:lang w:val="en-US"/>
+              </w:rPr>
+              <w:t>Admin</w:t>
+            </w:r>
+          </w:p>
+        </w:tc>
+      </w:tr>
+      <w:tr>
+        <w:tblPrEx>
+          <w:tblBorders>
+            <w:top w:val="single" w:color="auto" w:sz="4" w:space="0"/>
+            <w:left w:val="single" w:color="auto" w:sz="4" w:space="0"/>
+            <w:bottom w:val="single" w:color="auto" w:sz="4" w:space="0"/>
+            <w:right w:val="single" w:color="auto" w:sz="4" w:space="0"/>
+            <w:insideH w:val="single" w:color="auto" w:sz="4" w:space="0"/>
+            <w:insideV w:val="single" w:color="auto" w:sz="4" w:space="0"/>
+          </w:tblBorders>
+          <w:tblCellMar>
+            <w:top w:w="0" w:type="dxa"/>
+            <w:left w:w="108" w:type="dxa"/>
+            <w:bottom w:w="0" w:type="dxa"/>
+            <w:right w:w="108" w:type="dxa"/>
+          </w:tblCellMar>
+        </w:tblPrEx>
+        <w:trPr>
+          <w:jc w:val="center"/>
+        </w:trPr>
+        <w:tc>
+          <w:tcPr>
+            <w:tcW w:w="2925" w:type="dxa"/>
+            <w:vAlign w:val="center"/>
+          </w:tcPr>
+          <w:p>
+            <w:pPr>
+              <w:spacing w:line="336" w:lineRule="auto"/>
+              <w:jc w:val="center"/>
+              <w:rPr>
+                <w:rFonts w:hint="default" w:ascii="Times New Roman" w:hAnsi="Times New Roman" w:cs="Times New Roman"/>
+                <w:sz w:val="28"/>
+                <w:szCs w:val="28"/>
+              </w:rPr>
+            </w:pPr>
+            <w:r>
+              <w:rPr>
+                <w:rStyle w:val="11"/>
+                <w:rFonts w:hint="default" w:ascii="Times New Roman" w:hAnsi="Times New Roman" w:cs="Times New Roman" w:eastAsiaTheme="majorEastAsia"/>
+                <w:sz w:val="28"/>
+                <w:szCs w:val="28"/>
+              </w:rPr>
+              <w:t>Tiền điều kiện</w:t>
+            </w:r>
+          </w:p>
+        </w:tc>
+        <w:tc>
+          <w:tcPr>
+            <w:tcW w:w="6430" w:type="dxa"/>
+            <w:vAlign w:val="center"/>
+          </w:tcPr>
+          <w:p>
+            <w:pPr>
+              <w:spacing w:line="336" w:lineRule="auto"/>
+              <w:jc w:val="both"/>
+              <w:rPr>
+                <w:rFonts w:hint="default" w:ascii="Times New Roman" w:hAnsi="Times New Roman" w:cs="Times New Roman"/>
+                <w:sz w:val="28"/>
+                <w:szCs w:val="28"/>
+                <w:lang w:val="en-US"/>
+              </w:rPr>
+            </w:pPr>
+            <w:r>
+              <w:rPr>
+                <w:rFonts w:hint="default" w:ascii="Times New Roman" w:hAnsi="Times New Roman" w:cs="Times New Roman"/>
+                <w:sz w:val="28"/>
+                <w:szCs w:val="28"/>
+                <w:lang w:val="en-US"/>
+              </w:rPr>
+              <w:t xml:space="preserve">Admin đã đăng nhập vào hệ thống và đang xem thông tin chi tiết một phòng (phòng vẫn còn hoạt động). </w:t>
+            </w:r>
+          </w:p>
+        </w:tc>
+      </w:tr>
+      <w:tr>
+        <w:tblPrEx>
+          <w:tblBorders>
+            <w:top w:val="single" w:color="auto" w:sz="4" w:space="0"/>
+            <w:left w:val="single" w:color="auto" w:sz="4" w:space="0"/>
+            <w:bottom w:val="single" w:color="auto" w:sz="4" w:space="0"/>
+            <w:right w:val="single" w:color="auto" w:sz="4" w:space="0"/>
+            <w:insideH w:val="single" w:color="auto" w:sz="4" w:space="0"/>
+            <w:insideV w:val="single" w:color="auto" w:sz="4" w:space="0"/>
+          </w:tblBorders>
+          <w:tblCellMar>
+            <w:top w:w="0" w:type="dxa"/>
+            <w:left w:w="108" w:type="dxa"/>
+            <w:bottom w:w="0" w:type="dxa"/>
+            <w:right w:w="108" w:type="dxa"/>
+          </w:tblCellMar>
+        </w:tblPrEx>
+        <w:trPr>
+          <w:jc w:val="center"/>
+        </w:trPr>
+        <w:tc>
+          <w:tcPr>
+            <w:tcW w:w="2925" w:type="dxa"/>
+            <w:vAlign w:val="center"/>
+          </w:tcPr>
+          <w:p>
+            <w:pPr>
+              <w:spacing w:line="336" w:lineRule="auto"/>
+              <w:jc w:val="center"/>
+              <w:rPr>
+                <w:rFonts w:hint="default" w:ascii="Times New Roman" w:hAnsi="Times New Roman" w:cs="Times New Roman"/>
+                <w:sz w:val="28"/>
+                <w:szCs w:val="28"/>
+              </w:rPr>
+            </w:pPr>
+            <w:r>
+              <w:rPr>
+                <w:rStyle w:val="11"/>
+                <w:rFonts w:hint="default" w:ascii="Times New Roman" w:hAnsi="Times New Roman" w:cs="Times New Roman" w:eastAsiaTheme="majorEastAsia"/>
+                <w:sz w:val="28"/>
+                <w:szCs w:val="28"/>
+              </w:rPr>
+              <w:t>Hậu điều kiện</w:t>
+            </w:r>
+          </w:p>
+        </w:tc>
+        <w:tc>
+          <w:tcPr>
+            <w:tcW w:w="6430" w:type="dxa"/>
+            <w:vAlign w:val="center"/>
+          </w:tcPr>
+          <w:p>
+            <w:pPr>
+              <w:pStyle w:val="10"/>
+              <w:spacing w:before="0" w:beforeAutospacing="0" w:after="0" w:afterAutospacing="0" w:line="336" w:lineRule="auto"/>
+              <w:jc w:val="both"/>
+              <w:rPr>
+                <w:rFonts w:hint="default" w:ascii="Times New Roman" w:hAnsi="Times New Roman" w:cs="Times New Roman"/>
+                <w:sz w:val="28"/>
+                <w:szCs w:val="28"/>
+                <w:lang w:val="en-US"/>
+              </w:rPr>
+            </w:pPr>
+            <w:r>
+              <w:rPr>
+                <w:rFonts w:hint="default" w:ascii="Times New Roman" w:hAnsi="Times New Roman" w:cs="Times New Roman"/>
+                <w:sz w:val="28"/>
+                <w:szCs w:val="28"/>
+                <w:lang w:val="en-US"/>
+              </w:rPr>
+              <w:t>Danh sách lịch đặt của phòng được hiển thị lên màn hình</w:t>
+            </w:r>
+          </w:p>
+        </w:tc>
+      </w:tr>
+      <w:tr>
+        <w:tblPrEx>
+          <w:tblBorders>
+            <w:top w:val="single" w:color="auto" w:sz="4" w:space="0"/>
+            <w:left w:val="single" w:color="auto" w:sz="4" w:space="0"/>
+            <w:bottom w:val="single" w:color="auto" w:sz="4" w:space="0"/>
+            <w:right w:val="single" w:color="auto" w:sz="4" w:space="0"/>
+            <w:insideH w:val="single" w:color="auto" w:sz="4" w:space="0"/>
+            <w:insideV w:val="single" w:color="auto" w:sz="4" w:space="0"/>
+          </w:tblBorders>
+          <w:tblCellMar>
+            <w:top w:w="0" w:type="dxa"/>
+            <w:left w:w="108" w:type="dxa"/>
+            <w:bottom w:w="0" w:type="dxa"/>
+            <w:right w:w="108" w:type="dxa"/>
+          </w:tblCellMar>
+        </w:tblPrEx>
+        <w:trPr>
+          <w:jc w:val="center"/>
+        </w:trPr>
+        <w:tc>
+          <w:tcPr>
+            <w:tcW w:w="2925" w:type="dxa"/>
+            <w:vAlign w:val="center"/>
+          </w:tcPr>
+          <w:p>
+            <w:pPr>
+              <w:spacing w:line="336" w:lineRule="auto"/>
+              <w:jc w:val="center"/>
+              <w:rPr>
+                <w:rFonts w:hint="default" w:ascii="Times New Roman" w:hAnsi="Times New Roman" w:cs="Times New Roman"/>
+                <w:sz w:val="28"/>
+                <w:szCs w:val="28"/>
+              </w:rPr>
+            </w:pPr>
+            <w:r>
+              <w:rPr>
+                <w:rStyle w:val="11"/>
+                <w:rFonts w:hint="default" w:ascii="Times New Roman" w:hAnsi="Times New Roman" w:cs="Times New Roman" w:eastAsiaTheme="majorEastAsia"/>
+                <w:sz w:val="28"/>
+                <w:szCs w:val="28"/>
+              </w:rPr>
+              <w:t>Luồng chính</w:t>
+            </w:r>
+          </w:p>
+        </w:tc>
+        <w:tc>
+          <w:tcPr>
+            <w:tcW w:w="6430" w:type="dxa"/>
+            <w:vAlign w:val="center"/>
+          </w:tcPr>
+          <w:p>
+            <w:pPr>
+              <w:pStyle w:val="10"/>
+              <w:numPr>
+                <w:ilvl w:val="0"/>
+                <w:numId w:val="14"/>
+              </w:numPr>
+              <w:spacing w:before="0" w:beforeAutospacing="0" w:after="0" w:afterAutospacing="0" w:line="336" w:lineRule="auto"/>
+              <w:jc w:val="both"/>
+              <w:rPr>
+                <w:rFonts w:hint="default" w:ascii="Times New Roman" w:hAnsi="Times New Roman" w:cs="Times New Roman"/>
+                <w:sz w:val="28"/>
+                <w:szCs w:val="28"/>
+                <w:lang w:val="en-US"/>
+              </w:rPr>
+            </w:pPr>
+            <w:r>
+              <w:rPr>
+                <w:rFonts w:hint="default" w:ascii="Times New Roman" w:hAnsi="Times New Roman" w:cs="Times New Roman"/>
+                <w:sz w:val="28"/>
+                <w:szCs w:val="28"/>
+                <w:lang w:val="en-US"/>
+              </w:rPr>
+              <w:t>Admin nhấn nút [Xem danh sách lịch đặt]</w:t>
+            </w:r>
+          </w:p>
+          <w:p>
+            <w:pPr>
+              <w:pStyle w:val="10"/>
+              <w:numPr>
+                <w:ilvl w:val="0"/>
+                <w:numId w:val="14"/>
+              </w:numPr>
+              <w:spacing w:before="0" w:beforeAutospacing="0" w:after="0" w:afterAutospacing="0" w:line="336" w:lineRule="auto"/>
+              <w:jc w:val="both"/>
+              <w:rPr>
+                <w:rFonts w:hint="default" w:ascii="Times New Roman" w:hAnsi="Times New Roman" w:cs="Times New Roman"/>
+                <w:sz w:val="28"/>
+                <w:szCs w:val="28"/>
+                <w:lang w:val="en-US"/>
+              </w:rPr>
+            </w:pPr>
+            <w:r>
+              <w:rPr>
+                <w:rFonts w:hint="default" w:ascii="Times New Roman" w:hAnsi="Times New Roman" w:cs="Times New Roman"/>
+                <w:sz w:val="28"/>
+                <w:szCs w:val="28"/>
+                <w:lang w:val="en-US"/>
+              </w:rPr>
+              <w:t>Hệ thống hiển thị danh sách lịch đặt của phòng lên màn hình</w:t>
+            </w:r>
+          </w:p>
+        </w:tc>
+      </w:tr>
+      <w:tr>
+        <w:tblPrEx>
+          <w:tblBorders>
+            <w:top w:val="single" w:color="auto" w:sz="4" w:space="0"/>
+            <w:left w:val="single" w:color="auto" w:sz="4" w:space="0"/>
+            <w:bottom w:val="single" w:color="auto" w:sz="4" w:space="0"/>
+            <w:right w:val="single" w:color="auto" w:sz="4" w:space="0"/>
+            <w:insideH w:val="single" w:color="auto" w:sz="4" w:space="0"/>
+            <w:insideV w:val="single" w:color="auto" w:sz="4" w:space="0"/>
+          </w:tblBorders>
+          <w:tblCellMar>
+            <w:top w:w="0" w:type="dxa"/>
+            <w:left w:w="108" w:type="dxa"/>
+            <w:bottom w:w="0" w:type="dxa"/>
+            <w:right w:w="108" w:type="dxa"/>
+          </w:tblCellMar>
+        </w:tblPrEx>
+        <w:trPr>
+          <w:jc w:val="center"/>
+        </w:trPr>
+        <w:tc>
+          <w:tcPr>
+            <w:tcW w:w="2925" w:type="dxa"/>
+            <w:vAlign w:val="center"/>
+          </w:tcPr>
+          <w:p>
+            <w:pPr>
+              <w:spacing w:line="336" w:lineRule="auto"/>
+              <w:jc w:val="center"/>
+              <w:rPr>
+                <w:rFonts w:hint="default" w:ascii="Times New Roman" w:hAnsi="Times New Roman" w:cs="Times New Roman"/>
+                <w:sz w:val="28"/>
+                <w:szCs w:val="28"/>
+              </w:rPr>
+            </w:pPr>
+            <w:r>
+              <w:rPr>
+                <w:rStyle w:val="11"/>
+                <w:rFonts w:hint="default" w:ascii="Times New Roman" w:hAnsi="Times New Roman" w:cs="Times New Roman" w:eastAsiaTheme="majorEastAsia"/>
+                <w:sz w:val="28"/>
+                <w:szCs w:val="28"/>
+              </w:rPr>
+              <w:t>Luồng thay thế</w:t>
+            </w:r>
+          </w:p>
+        </w:tc>
+        <w:tc>
+          <w:tcPr>
+            <w:tcW w:w="6430" w:type="dxa"/>
+            <w:vAlign w:val="center"/>
+          </w:tcPr>
+          <w:p>
+            <w:pPr>
+              <w:spacing w:line="336" w:lineRule="auto"/>
+              <w:jc w:val="both"/>
+              <w:rPr>
+                <w:rFonts w:hint="default" w:ascii="Times New Roman" w:hAnsi="Times New Roman" w:cs="Times New Roman"/>
+                <w:sz w:val="28"/>
+                <w:szCs w:val="28"/>
+              </w:rPr>
+            </w:pPr>
+          </w:p>
+        </w:tc>
+      </w:tr>
+    </w:tbl>
+    <w:p>
+      <w:pPr>
+        <w:numPr>
+          <w:ilvl w:val="0"/>
+          <w:numId w:val="0"/>
+        </w:numPr>
+        <w:ind w:leftChars="0"/>
+        <w:rPr>
+          <w:rFonts w:hint="default" w:ascii="Times New Roman" w:hAnsi="Times New Roman" w:cs="Times New Roman"/>
+          <w:lang w:val="en-US"/>
+        </w:rPr>
+      </w:pPr>
+    </w:p>
+    <w:p>
+      <w:pPr>
+        <w:pStyle w:val="6"/>
+        <w:bidi w:val="0"/>
+        <w:rPr>
+          <w:rFonts w:hint="default"/>
+          <w:lang w:val="en-US"/>
+        </w:rPr>
+      </w:pPr>
+      <w:r>
+        <w:rPr>
+          <w:rFonts w:hint="default"/>
+          <w:lang w:val="en-US"/>
+        </w:rPr>
+        <w:t>2.2.1.14 Đặc tả usecase hủy lịch đặt</w:t>
+      </w:r>
+    </w:p>
+    <w:tbl>
+      <w:tblPr>
+        <w:tblStyle w:val="8"/>
+        <w:tblW w:w="9355" w:type="dxa"/>
+        <w:jc w:val="center"/>
+        <w:tblBorders>
+          <w:top w:val="single" w:color="auto" w:sz="4" w:space="0"/>
+          <w:left w:val="single" w:color="auto" w:sz="4" w:space="0"/>
+          <w:bottom w:val="single" w:color="auto" w:sz="4" w:space="0"/>
+          <w:right w:val="single" w:color="auto" w:sz="4" w:space="0"/>
+          <w:insideH w:val="single" w:color="auto" w:sz="4" w:space="0"/>
+          <w:insideV w:val="single" w:color="auto" w:sz="4" w:space="0"/>
+        </w:tblBorders>
+        <w:tblLayout w:type="autofit"/>
+        <w:tblCellMar>
+          <w:top w:w="0" w:type="dxa"/>
+          <w:left w:w="108" w:type="dxa"/>
+          <w:bottom w:w="0" w:type="dxa"/>
+          <w:right w:w="108" w:type="dxa"/>
+        </w:tblCellMar>
+      </w:tblPr>
+      <w:tblGrid>
+        <w:gridCol w:w="2925"/>
+        <w:gridCol w:w="6430"/>
+      </w:tblGrid>
+      <w:tr>
+        <w:tblPrEx>
+          <w:tblBorders>
+            <w:top w:val="single" w:color="auto" w:sz="4" w:space="0"/>
+            <w:left w:val="single" w:color="auto" w:sz="4" w:space="0"/>
+            <w:bottom w:val="single" w:color="auto" w:sz="4" w:space="0"/>
+            <w:right w:val="single" w:color="auto" w:sz="4" w:space="0"/>
+            <w:insideH w:val="single" w:color="auto" w:sz="4" w:space="0"/>
+            <w:insideV w:val="single" w:color="auto" w:sz="4" w:space="0"/>
+          </w:tblBorders>
+          <w:tblCellMar>
+            <w:top w:w="0" w:type="dxa"/>
+            <w:left w:w="108" w:type="dxa"/>
+            <w:bottom w:w="0" w:type="dxa"/>
+            <w:right w:w="108" w:type="dxa"/>
+          </w:tblCellMar>
+        </w:tblPrEx>
+        <w:trPr>
+          <w:jc w:val="center"/>
+        </w:trPr>
+        <w:tc>
+          <w:tcPr>
+            <w:tcW w:w="2925" w:type="dxa"/>
+            <w:vAlign w:val="center"/>
+          </w:tcPr>
+          <w:p>
+            <w:pPr>
+              <w:spacing w:line="336" w:lineRule="auto"/>
+              <w:jc w:val="center"/>
+              <w:rPr>
+                <w:rFonts w:hint="default" w:ascii="Times New Roman" w:hAnsi="Times New Roman" w:cs="Times New Roman"/>
+                <w:b/>
+                <w:bCs/>
+                <w:sz w:val="28"/>
+                <w:szCs w:val="28"/>
+              </w:rPr>
+            </w:pPr>
+            <w:r>
+              <w:rPr>
+                <w:rStyle w:val="11"/>
+                <w:rFonts w:hint="default" w:ascii="Times New Roman" w:hAnsi="Times New Roman" w:cs="Times New Roman" w:eastAsiaTheme="majorEastAsia"/>
+                <w:sz w:val="28"/>
+                <w:szCs w:val="28"/>
+              </w:rPr>
+              <w:t>Thuộc tính</w:t>
+            </w:r>
+          </w:p>
+        </w:tc>
+        <w:tc>
+          <w:tcPr>
+            <w:tcW w:w="6430" w:type="dxa"/>
+            <w:vAlign w:val="center"/>
+          </w:tcPr>
+          <w:p>
+            <w:pPr>
+              <w:spacing w:line="336" w:lineRule="auto"/>
+              <w:jc w:val="center"/>
+              <w:rPr>
+                <w:rFonts w:hint="default" w:ascii="Times New Roman" w:hAnsi="Times New Roman" w:cs="Times New Roman"/>
+                <w:b/>
+                <w:bCs/>
+                <w:sz w:val="28"/>
+                <w:szCs w:val="28"/>
+              </w:rPr>
+            </w:pPr>
+            <w:r>
+              <w:rPr>
+                <w:rStyle w:val="11"/>
+                <w:rFonts w:hint="default" w:ascii="Times New Roman" w:hAnsi="Times New Roman" w:cs="Times New Roman" w:eastAsiaTheme="majorEastAsia"/>
+                <w:sz w:val="28"/>
+                <w:szCs w:val="28"/>
+              </w:rPr>
+              <w:t>Mô tả</w:t>
+            </w:r>
+          </w:p>
+        </w:tc>
+      </w:tr>
+      <w:tr>
+        <w:tblPrEx>
+          <w:tblBorders>
+            <w:top w:val="single" w:color="auto" w:sz="4" w:space="0"/>
+            <w:left w:val="single" w:color="auto" w:sz="4" w:space="0"/>
+            <w:bottom w:val="single" w:color="auto" w:sz="4" w:space="0"/>
+            <w:right w:val="single" w:color="auto" w:sz="4" w:space="0"/>
+            <w:insideH w:val="single" w:color="auto" w:sz="4" w:space="0"/>
+            <w:insideV w:val="single" w:color="auto" w:sz="4" w:space="0"/>
+          </w:tblBorders>
+          <w:tblCellMar>
+            <w:top w:w="0" w:type="dxa"/>
+            <w:left w:w="108" w:type="dxa"/>
+            <w:bottom w:w="0" w:type="dxa"/>
+            <w:right w:w="108" w:type="dxa"/>
+          </w:tblCellMar>
+        </w:tblPrEx>
+        <w:trPr>
+          <w:jc w:val="center"/>
+        </w:trPr>
+        <w:tc>
+          <w:tcPr>
+            <w:tcW w:w="2925" w:type="dxa"/>
+            <w:vAlign w:val="center"/>
+          </w:tcPr>
+          <w:p>
+            <w:pPr>
+              <w:spacing w:line="336" w:lineRule="auto"/>
+              <w:jc w:val="center"/>
+              <w:rPr>
+                <w:rFonts w:hint="default" w:ascii="Times New Roman" w:hAnsi="Times New Roman" w:cs="Times New Roman"/>
+                <w:sz w:val="28"/>
+                <w:szCs w:val="28"/>
+              </w:rPr>
+            </w:pPr>
+            <w:r>
+              <w:rPr>
+                <w:rStyle w:val="11"/>
+                <w:rFonts w:hint="default" w:ascii="Times New Roman" w:hAnsi="Times New Roman" w:cs="Times New Roman" w:eastAsiaTheme="majorEastAsia"/>
+                <w:sz w:val="28"/>
+                <w:szCs w:val="28"/>
+              </w:rPr>
+              <w:t>Tên Use Case</w:t>
+            </w:r>
+          </w:p>
+        </w:tc>
+        <w:tc>
+          <w:tcPr>
+            <w:tcW w:w="6430" w:type="dxa"/>
+            <w:vAlign w:val="center"/>
+          </w:tcPr>
+          <w:p>
+            <w:pPr>
+              <w:spacing w:line="336" w:lineRule="auto"/>
+              <w:jc w:val="both"/>
+              <w:rPr>
+                <w:rFonts w:hint="default" w:ascii="Times New Roman" w:hAnsi="Times New Roman" w:cs="Times New Roman"/>
+                <w:sz w:val="28"/>
+                <w:szCs w:val="28"/>
+                <w:lang w:val="en-US"/>
+              </w:rPr>
+            </w:pPr>
+            <w:r>
+              <w:rPr>
+                <w:rFonts w:hint="default" w:ascii="Times New Roman" w:hAnsi="Times New Roman" w:cs="Times New Roman"/>
+                <w:sz w:val="28"/>
+                <w:szCs w:val="28"/>
+                <w:lang w:val="en-US"/>
+              </w:rPr>
+              <w:t>Hủy lịch đặt</w:t>
+            </w:r>
+          </w:p>
+        </w:tc>
+      </w:tr>
+      <w:tr>
+        <w:tblPrEx>
+          <w:tblBorders>
+            <w:top w:val="single" w:color="auto" w:sz="4" w:space="0"/>
+            <w:left w:val="single" w:color="auto" w:sz="4" w:space="0"/>
+            <w:bottom w:val="single" w:color="auto" w:sz="4" w:space="0"/>
+            <w:right w:val="single" w:color="auto" w:sz="4" w:space="0"/>
+            <w:insideH w:val="single" w:color="auto" w:sz="4" w:space="0"/>
+            <w:insideV w:val="single" w:color="auto" w:sz="4" w:space="0"/>
+          </w:tblBorders>
+          <w:tblCellMar>
+            <w:top w:w="0" w:type="dxa"/>
+            <w:left w:w="108" w:type="dxa"/>
+            <w:bottom w:w="0" w:type="dxa"/>
+            <w:right w:w="108" w:type="dxa"/>
+          </w:tblCellMar>
+        </w:tblPrEx>
+        <w:trPr>
+          <w:jc w:val="center"/>
+        </w:trPr>
+        <w:tc>
+          <w:tcPr>
+            <w:tcW w:w="2925" w:type="dxa"/>
+            <w:vAlign w:val="center"/>
+          </w:tcPr>
+          <w:p>
+            <w:pPr>
+              <w:spacing w:line="336" w:lineRule="auto"/>
+              <w:jc w:val="center"/>
+              <w:rPr>
+                <w:rFonts w:hint="default" w:ascii="Times New Roman" w:hAnsi="Times New Roman" w:cs="Times New Roman"/>
+                <w:sz w:val="28"/>
+                <w:szCs w:val="28"/>
+              </w:rPr>
+            </w:pPr>
+            <w:r>
+              <w:rPr>
+                <w:rStyle w:val="11"/>
+                <w:rFonts w:hint="default" w:ascii="Times New Roman" w:hAnsi="Times New Roman" w:cs="Times New Roman" w:eastAsiaTheme="majorEastAsia"/>
+                <w:sz w:val="28"/>
+                <w:szCs w:val="28"/>
+              </w:rPr>
+              <w:t>Mô tả</w:t>
+            </w:r>
+          </w:p>
+        </w:tc>
+        <w:tc>
+          <w:tcPr>
+            <w:tcW w:w="6430" w:type="dxa"/>
+            <w:vAlign w:val="center"/>
+          </w:tcPr>
+          <w:p>
+            <w:pPr>
+              <w:pStyle w:val="10"/>
+              <w:spacing w:before="0" w:beforeAutospacing="0" w:after="0" w:afterAutospacing="0" w:line="336" w:lineRule="auto"/>
+              <w:jc w:val="both"/>
+              <w:rPr>
+                <w:rFonts w:hint="default" w:ascii="Times New Roman" w:hAnsi="Times New Roman" w:cs="Times New Roman"/>
+                <w:sz w:val="28"/>
+                <w:szCs w:val="28"/>
+                <w:lang w:val="en-US"/>
+              </w:rPr>
+            </w:pPr>
+            <w:r>
+              <w:rPr>
+                <w:rFonts w:hint="default" w:ascii="Times New Roman" w:hAnsi="Times New Roman"/>
+                <w:sz w:val="28"/>
+                <w:szCs w:val="28"/>
+                <w:lang w:val="en-US"/>
+              </w:rPr>
+              <w:t>Cho phép Admin thay đổi trạng thái của một yêu cầu đặt phòng sang “Đã hủy” nếu hội viên không đến sau thời điểm đã đặt một khoảng thời gian được quy định</w:t>
+            </w:r>
+          </w:p>
+        </w:tc>
+      </w:tr>
+      <w:tr>
+        <w:tblPrEx>
+          <w:tblBorders>
+            <w:top w:val="single" w:color="auto" w:sz="4" w:space="0"/>
+            <w:left w:val="single" w:color="auto" w:sz="4" w:space="0"/>
+            <w:bottom w:val="single" w:color="auto" w:sz="4" w:space="0"/>
+            <w:right w:val="single" w:color="auto" w:sz="4" w:space="0"/>
+            <w:insideH w:val="single" w:color="auto" w:sz="4" w:space="0"/>
+            <w:insideV w:val="single" w:color="auto" w:sz="4" w:space="0"/>
+          </w:tblBorders>
+          <w:tblCellMar>
+            <w:top w:w="0" w:type="dxa"/>
+            <w:left w:w="108" w:type="dxa"/>
+            <w:bottom w:w="0" w:type="dxa"/>
+            <w:right w:w="108" w:type="dxa"/>
+          </w:tblCellMar>
+        </w:tblPrEx>
+        <w:trPr>
+          <w:jc w:val="center"/>
+        </w:trPr>
+        <w:tc>
+          <w:tcPr>
+            <w:tcW w:w="2925" w:type="dxa"/>
+            <w:vAlign w:val="center"/>
+          </w:tcPr>
+          <w:p>
+            <w:pPr>
+              <w:spacing w:line="336" w:lineRule="auto"/>
+              <w:jc w:val="center"/>
+              <w:rPr>
+                <w:rFonts w:hint="default" w:ascii="Times New Roman" w:hAnsi="Times New Roman" w:cs="Times New Roman"/>
+                <w:sz w:val="28"/>
+                <w:szCs w:val="28"/>
+              </w:rPr>
+            </w:pPr>
+            <w:r>
+              <w:rPr>
+                <w:rStyle w:val="11"/>
+                <w:rFonts w:hint="default" w:ascii="Times New Roman" w:hAnsi="Times New Roman" w:cs="Times New Roman" w:eastAsiaTheme="majorEastAsia"/>
+                <w:sz w:val="28"/>
+                <w:szCs w:val="28"/>
+              </w:rPr>
+              <w:t>Tác nhân chính</w:t>
+            </w:r>
+          </w:p>
+        </w:tc>
+        <w:tc>
+          <w:tcPr>
+            <w:tcW w:w="6430" w:type="dxa"/>
+            <w:vAlign w:val="center"/>
+          </w:tcPr>
+          <w:p>
+            <w:pPr>
+              <w:spacing w:line="336" w:lineRule="auto"/>
+              <w:jc w:val="both"/>
+              <w:rPr>
+                <w:rFonts w:hint="default" w:ascii="Times New Roman" w:hAnsi="Times New Roman" w:cs="Times New Roman"/>
+                <w:sz w:val="28"/>
+                <w:szCs w:val="28"/>
+                <w:lang w:val="en-US"/>
+              </w:rPr>
+            </w:pPr>
+            <w:r>
+              <w:rPr>
+                <w:rFonts w:hint="default" w:ascii="Times New Roman" w:hAnsi="Times New Roman" w:cs="Times New Roman"/>
+                <w:sz w:val="28"/>
+                <w:szCs w:val="28"/>
+                <w:lang w:val="en-US"/>
+              </w:rPr>
+              <w:t>Admin</w:t>
+            </w:r>
+          </w:p>
+        </w:tc>
+      </w:tr>
+      <w:tr>
+        <w:tblPrEx>
+          <w:tblBorders>
+            <w:top w:val="single" w:color="auto" w:sz="4" w:space="0"/>
+            <w:left w:val="single" w:color="auto" w:sz="4" w:space="0"/>
+            <w:bottom w:val="single" w:color="auto" w:sz="4" w:space="0"/>
+            <w:right w:val="single" w:color="auto" w:sz="4" w:space="0"/>
+            <w:insideH w:val="single" w:color="auto" w:sz="4" w:space="0"/>
+            <w:insideV w:val="single" w:color="auto" w:sz="4" w:space="0"/>
+          </w:tblBorders>
+          <w:tblCellMar>
+            <w:top w:w="0" w:type="dxa"/>
+            <w:left w:w="108" w:type="dxa"/>
+            <w:bottom w:w="0" w:type="dxa"/>
+            <w:right w:w="108" w:type="dxa"/>
+          </w:tblCellMar>
+        </w:tblPrEx>
+        <w:trPr>
+          <w:jc w:val="center"/>
+        </w:trPr>
+        <w:tc>
+          <w:tcPr>
+            <w:tcW w:w="2925" w:type="dxa"/>
+            <w:vAlign w:val="center"/>
+          </w:tcPr>
+          <w:p>
+            <w:pPr>
+              <w:spacing w:line="336" w:lineRule="auto"/>
+              <w:jc w:val="center"/>
+              <w:rPr>
+                <w:rFonts w:hint="default" w:ascii="Times New Roman" w:hAnsi="Times New Roman" w:cs="Times New Roman"/>
+                <w:sz w:val="28"/>
+                <w:szCs w:val="28"/>
+              </w:rPr>
+            </w:pPr>
+            <w:r>
+              <w:rPr>
+                <w:rStyle w:val="11"/>
+                <w:rFonts w:hint="default" w:ascii="Times New Roman" w:hAnsi="Times New Roman" w:cs="Times New Roman" w:eastAsiaTheme="majorEastAsia"/>
+                <w:sz w:val="28"/>
+                <w:szCs w:val="28"/>
+              </w:rPr>
+              <w:t>Tiền điều kiện</w:t>
+            </w:r>
+          </w:p>
+        </w:tc>
+        <w:tc>
+          <w:tcPr>
+            <w:tcW w:w="6430" w:type="dxa"/>
+            <w:vAlign w:val="center"/>
+          </w:tcPr>
+          <w:p>
+            <w:pPr>
+              <w:spacing w:line="336" w:lineRule="auto"/>
+              <w:jc w:val="both"/>
+              <w:rPr>
+                <w:rFonts w:hint="default" w:ascii="Times New Roman" w:hAnsi="Times New Roman" w:cs="Times New Roman"/>
+                <w:sz w:val="28"/>
+                <w:szCs w:val="28"/>
+                <w:lang w:val="en-US"/>
+              </w:rPr>
+            </w:pPr>
+            <w:r>
+              <w:rPr>
+                <w:rFonts w:hint="default" w:ascii="Times New Roman" w:hAnsi="Times New Roman" w:cs="Times New Roman"/>
+                <w:sz w:val="28"/>
+                <w:szCs w:val="28"/>
+                <w:lang w:val="en-US"/>
+              </w:rPr>
+              <w:t>Admin đã đăng nhập vào hệ thống và đang xem danh sách lịch đặt của một phòng</w:t>
+            </w:r>
+          </w:p>
+        </w:tc>
+      </w:tr>
+      <w:tr>
+        <w:tblPrEx>
+          <w:tblBorders>
+            <w:top w:val="single" w:color="auto" w:sz="4" w:space="0"/>
+            <w:left w:val="single" w:color="auto" w:sz="4" w:space="0"/>
+            <w:bottom w:val="single" w:color="auto" w:sz="4" w:space="0"/>
+            <w:right w:val="single" w:color="auto" w:sz="4" w:space="0"/>
+            <w:insideH w:val="single" w:color="auto" w:sz="4" w:space="0"/>
+            <w:insideV w:val="single" w:color="auto" w:sz="4" w:space="0"/>
+          </w:tblBorders>
+          <w:tblCellMar>
+            <w:top w:w="0" w:type="dxa"/>
+            <w:left w:w="108" w:type="dxa"/>
+            <w:bottom w:w="0" w:type="dxa"/>
+            <w:right w:w="108" w:type="dxa"/>
+          </w:tblCellMar>
+        </w:tblPrEx>
+        <w:trPr>
+          <w:jc w:val="center"/>
+        </w:trPr>
+        <w:tc>
+          <w:tcPr>
+            <w:tcW w:w="2925" w:type="dxa"/>
+            <w:vAlign w:val="center"/>
+          </w:tcPr>
+          <w:p>
+            <w:pPr>
+              <w:spacing w:line="336" w:lineRule="auto"/>
+              <w:jc w:val="center"/>
+              <w:rPr>
+                <w:rFonts w:hint="default" w:ascii="Times New Roman" w:hAnsi="Times New Roman" w:cs="Times New Roman"/>
+                <w:sz w:val="28"/>
+                <w:szCs w:val="28"/>
+              </w:rPr>
+            </w:pPr>
+            <w:r>
+              <w:rPr>
+                <w:rStyle w:val="11"/>
+                <w:rFonts w:hint="default" w:ascii="Times New Roman" w:hAnsi="Times New Roman" w:cs="Times New Roman" w:eastAsiaTheme="majorEastAsia"/>
+                <w:sz w:val="28"/>
+                <w:szCs w:val="28"/>
+              </w:rPr>
+              <w:t>Hậu điều kiện</w:t>
+            </w:r>
+          </w:p>
+        </w:tc>
+        <w:tc>
+          <w:tcPr>
+            <w:tcW w:w="6430" w:type="dxa"/>
+            <w:vAlign w:val="center"/>
+          </w:tcPr>
+          <w:p>
+            <w:pPr>
+              <w:pStyle w:val="10"/>
+              <w:spacing w:before="0" w:beforeAutospacing="0" w:after="0" w:afterAutospacing="0" w:line="336" w:lineRule="auto"/>
+              <w:jc w:val="both"/>
+              <w:rPr>
+                <w:rFonts w:hint="default" w:ascii="Times New Roman" w:hAnsi="Times New Roman" w:cs="Times New Roman"/>
+                <w:sz w:val="28"/>
+                <w:szCs w:val="28"/>
+                <w:lang w:val="en-US"/>
+              </w:rPr>
+            </w:pPr>
+            <w:r>
+              <w:rPr>
+                <w:rFonts w:hint="default" w:ascii="Times New Roman" w:hAnsi="Times New Roman" w:cs="Times New Roman"/>
+                <w:sz w:val="28"/>
+                <w:szCs w:val="28"/>
+                <w:lang w:val="en-US"/>
+              </w:rPr>
+              <w:t>Lịch đặt được chọn sẽ chuyển sang trạng thái “Đã hủy”</w:t>
+            </w:r>
+          </w:p>
+        </w:tc>
+      </w:tr>
+      <w:tr>
+        <w:tblPrEx>
+          <w:tblBorders>
+            <w:top w:val="single" w:color="auto" w:sz="4" w:space="0"/>
+            <w:left w:val="single" w:color="auto" w:sz="4" w:space="0"/>
+            <w:bottom w:val="single" w:color="auto" w:sz="4" w:space="0"/>
+            <w:right w:val="single" w:color="auto" w:sz="4" w:space="0"/>
+            <w:insideH w:val="single" w:color="auto" w:sz="4" w:space="0"/>
+            <w:insideV w:val="single" w:color="auto" w:sz="4" w:space="0"/>
+          </w:tblBorders>
+          <w:tblCellMar>
+            <w:top w:w="0" w:type="dxa"/>
+            <w:left w:w="108" w:type="dxa"/>
+            <w:bottom w:w="0" w:type="dxa"/>
+            <w:right w:w="108" w:type="dxa"/>
+          </w:tblCellMar>
+        </w:tblPrEx>
+        <w:trPr>
+          <w:jc w:val="center"/>
+        </w:trPr>
+        <w:tc>
+          <w:tcPr>
+            <w:tcW w:w="2925" w:type="dxa"/>
+            <w:vAlign w:val="center"/>
+          </w:tcPr>
+          <w:p>
+            <w:pPr>
+              <w:spacing w:line="336" w:lineRule="auto"/>
+              <w:jc w:val="center"/>
+              <w:rPr>
+                <w:rFonts w:hint="default" w:ascii="Times New Roman" w:hAnsi="Times New Roman" w:cs="Times New Roman"/>
+                <w:sz w:val="28"/>
+                <w:szCs w:val="28"/>
+              </w:rPr>
+            </w:pPr>
+            <w:r>
+              <w:rPr>
+                <w:rStyle w:val="11"/>
+                <w:rFonts w:hint="default" w:ascii="Times New Roman" w:hAnsi="Times New Roman" w:cs="Times New Roman" w:eastAsiaTheme="majorEastAsia"/>
+                <w:sz w:val="28"/>
+                <w:szCs w:val="28"/>
+              </w:rPr>
+              <w:t>Luồng chính</w:t>
+            </w:r>
+          </w:p>
+        </w:tc>
+        <w:tc>
+          <w:tcPr>
+            <w:tcW w:w="6430" w:type="dxa"/>
+            <w:vAlign w:val="center"/>
+          </w:tcPr>
+          <w:p>
+            <w:pPr>
+              <w:pStyle w:val="10"/>
+              <w:numPr>
+                <w:ilvl w:val="0"/>
+                <w:numId w:val="15"/>
+              </w:numPr>
+              <w:spacing w:before="0" w:beforeAutospacing="0" w:after="0" w:afterAutospacing="0" w:line="336" w:lineRule="auto"/>
+              <w:jc w:val="both"/>
+              <w:rPr>
+                <w:rFonts w:hint="default" w:ascii="Times New Roman" w:hAnsi="Times New Roman" w:cs="Times New Roman"/>
+                <w:sz w:val="28"/>
+                <w:szCs w:val="28"/>
+                <w:lang w:val="en-US"/>
+              </w:rPr>
+            </w:pPr>
+            <w:r>
+              <w:rPr>
+                <w:rFonts w:hint="default" w:ascii="Times New Roman" w:hAnsi="Times New Roman" w:cs="Times New Roman"/>
+                <w:sz w:val="28"/>
+                <w:szCs w:val="28"/>
+                <w:lang w:val="en-US"/>
+              </w:rPr>
+              <w:t>Admin chọn lịch đặt cần hủy</w:t>
+            </w:r>
+          </w:p>
+          <w:p>
+            <w:pPr>
+              <w:pStyle w:val="10"/>
+              <w:numPr>
+                <w:ilvl w:val="0"/>
+                <w:numId w:val="15"/>
+              </w:numPr>
+              <w:spacing w:before="0" w:beforeAutospacing="0" w:after="0" w:afterAutospacing="0" w:line="336" w:lineRule="auto"/>
+              <w:jc w:val="both"/>
+              <w:rPr>
+                <w:rFonts w:hint="default" w:ascii="Times New Roman" w:hAnsi="Times New Roman" w:cs="Times New Roman"/>
+                <w:sz w:val="28"/>
+                <w:szCs w:val="28"/>
+                <w:lang w:val="en-US"/>
+              </w:rPr>
+            </w:pPr>
+            <w:r>
+              <w:rPr>
+                <w:rFonts w:hint="default" w:ascii="Times New Roman" w:hAnsi="Times New Roman" w:cs="Times New Roman"/>
+                <w:sz w:val="28"/>
+                <w:szCs w:val="28"/>
+                <w:lang w:val="en-US"/>
+              </w:rPr>
+              <w:t>Hệ thống hiển thị hộp thoại xác nhận</w:t>
+            </w:r>
+          </w:p>
+          <w:p>
+            <w:pPr>
+              <w:pStyle w:val="10"/>
+              <w:numPr>
+                <w:ilvl w:val="0"/>
+                <w:numId w:val="15"/>
+              </w:numPr>
+              <w:spacing w:before="0" w:beforeAutospacing="0" w:after="0" w:afterAutospacing="0" w:line="336" w:lineRule="auto"/>
+              <w:jc w:val="both"/>
+              <w:rPr>
+                <w:rFonts w:hint="default" w:ascii="Times New Roman" w:hAnsi="Times New Roman" w:cs="Times New Roman"/>
+                <w:sz w:val="28"/>
+                <w:szCs w:val="28"/>
+                <w:lang w:val="en-US"/>
+              </w:rPr>
+            </w:pPr>
+            <w:r>
+              <w:rPr>
+                <w:rFonts w:hint="default" w:ascii="Times New Roman" w:hAnsi="Times New Roman" w:cs="Times New Roman"/>
+                <w:sz w:val="28"/>
+                <w:szCs w:val="28"/>
+                <w:lang w:val="en-US"/>
+              </w:rPr>
+              <w:t>Admin chọn “Đồng ý”</w:t>
+            </w:r>
+          </w:p>
+          <w:p>
+            <w:pPr>
+              <w:pStyle w:val="10"/>
+              <w:numPr>
+                <w:ilvl w:val="0"/>
+                <w:numId w:val="15"/>
+              </w:numPr>
+              <w:spacing w:before="0" w:beforeAutospacing="0" w:after="0" w:afterAutospacing="0" w:line="336" w:lineRule="auto"/>
+              <w:jc w:val="both"/>
+              <w:rPr>
+                <w:rFonts w:hint="default" w:ascii="Times New Roman" w:hAnsi="Times New Roman" w:cs="Times New Roman"/>
+                <w:sz w:val="28"/>
+                <w:szCs w:val="28"/>
+                <w:lang w:val="en-US"/>
+              </w:rPr>
+            </w:pPr>
+            <w:r>
+              <w:rPr>
+                <w:rFonts w:hint="default" w:ascii="Times New Roman" w:hAnsi="Times New Roman" w:cs="Times New Roman"/>
+                <w:sz w:val="28"/>
+                <w:szCs w:val="28"/>
+                <w:lang w:val="en-US"/>
+              </w:rPr>
+              <w:t>Hệ thống kiểm tra thời điểm hiện tại cách thời điểm nhận phòng dự kiến có bé hơn một khoảng thời gian được quy định trước (khoảng thời gian được phép hủy phòng nếu khách không tới) hay không</w:t>
+            </w:r>
+          </w:p>
+          <w:p>
+            <w:pPr>
+              <w:pStyle w:val="10"/>
+              <w:numPr>
+                <w:ilvl w:val="0"/>
+                <w:numId w:val="15"/>
+              </w:numPr>
+              <w:spacing w:before="0" w:beforeAutospacing="0" w:after="0" w:afterAutospacing="0" w:line="336" w:lineRule="auto"/>
+              <w:jc w:val="both"/>
+              <w:rPr>
+                <w:rFonts w:hint="default" w:ascii="Times New Roman" w:hAnsi="Times New Roman" w:cs="Times New Roman"/>
+                <w:sz w:val="28"/>
+                <w:szCs w:val="28"/>
+                <w:lang w:val="en-US"/>
+              </w:rPr>
+            </w:pPr>
+            <w:r>
+              <w:rPr>
+                <w:rFonts w:hint="default" w:ascii="Times New Roman" w:hAnsi="Times New Roman" w:cs="Times New Roman"/>
+                <w:sz w:val="28"/>
+                <w:szCs w:val="28"/>
+                <w:lang w:val="en-US"/>
+              </w:rPr>
+              <w:t>Nếu không bé hơn thì hệ thống tiến hành hủy lịch đặt, chuyển trạng thái của lịch đặt sang “Đã hủy”</w:t>
+            </w:r>
+          </w:p>
+          <w:p>
+            <w:pPr>
+              <w:pStyle w:val="10"/>
+              <w:numPr>
+                <w:ilvl w:val="0"/>
+                <w:numId w:val="15"/>
+              </w:numPr>
+              <w:spacing w:before="0" w:beforeAutospacing="0" w:after="0" w:afterAutospacing="0" w:line="336" w:lineRule="auto"/>
+              <w:jc w:val="both"/>
+              <w:rPr>
+                <w:rFonts w:hint="default" w:ascii="Times New Roman" w:hAnsi="Times New Roman" w:cs="Times New Roman"/>
+                <w:sz w:val="28"/>
+                <w:szCs w:val="28"/>
+                <w:lang w:val="en-US"/>
+              </w:rPr>
+            </w:pPr>
+            <w:r>
+              <w:rPr>
+                <w:rFonts w:hint="default" w:ascii="Times New Roman" w:hAnsi="Times New Roman" w:cs="Times New Roman"/>
+                <w:sz w:val="28"/>
+                <w:szCs w:val="28"/>
+                <w:lang w:val="en-US"/>
+              </w:rPr>
+              <w:t>Hệ thống thông báo hủy lịch đặt thành công</w:t>
+            </w:r>
+          </w:p>
+        </w:tc>
+      </w:tr>
+      <w:tr>
+        <w:tblPrEx>
+          <w:tblBorders>
+            <w:top w:val="single" w:color="auto" w:sz="4" w:space="0"/>
+            <w:left w:val="single" w:color="auto" w:sz="4" w:space="0"/>
+            <w:bottom w:val="single" w:color="auto" w:sz="4" w:space="0"/>
+            <w:right w:val="single" w:color="auto" w:sz="4" w:space="0"/>
+            <w:insideH w:val="single" w:color="auto" w:sz="4" w:space="0"/>
+            <w:insideV w:val="single" w:color="auto" w:sz="4" w:space="0"/>
+          </w:tblBorders>
+          <w:tblCellMar>
+            <w:top w:w="0" w:type="dxa"/>
+            <w:left w:w="108" w:type="dxa"/>
+            <w:bottom w:w="0" w:type="dxa"/>
+            <w:right w:w="108" w:type="dxa"/>
+          </w:tblCellMar>
+        </w:tblPrEx>
+        <w:trPr>
+          <w:jc w:val="center"/>
+        </w:trPr>
+        <w:tc>
+          <w:tcPr>
+            <w:tcW w:w="2925" w:type="dxa"/>
+            <w:vAlign w:val="center"/>
+          </w:tcPr>
+          <w:p>
+            <w:pPr>
+              <w:spacing w:line="336" w:lineRule="auto"/>
+              <w:jc w:val="center"/>
+              <w:rPr>
+                <w:rFonts w:hint="default" w:ascii="Times New Roman" w:hAnsi="Times New Roman" w:cs="Times New Roman"/>
+                <w:sz w:val="28"/>
+                <w:szCs w:val="28"/>
+              </w:rPr>
+            </w:pPr>
+            <w:r>
+              <w:rPr>
+                <w:rStyle w:val="11"/>
+                <w:rFonts w:hint="default" w:ascii="Times New Roman" w:hAnsi="Times New Roman" w:cs="Times New Roman" w:eastAsiaTheme="majorEastAsia"/>
+                <w:sz w:val="28"/>
+                <w:szCs w:val="28"/>
+              </w:rPr>
+              <w:t>Luồng thay thế</w:t>
+            </w:r>
+          </w:p>
+        </w:tc>
+        <w:tc>
+          <w:tcPr>
+            <w:tcW w:w="6430" w:type="dxa"/>
+            <w:vAlign w:val="center"/>
+          </w:tcPr>
+          <w:p>
+            <w:pPr>
+              <w:numPr>
+                <w:ilvl w:val="1"/>
+                <w:numId w:val="14"/>
+              </w:numPr>
+              <w:spacing w:line="336" w:lineRule="auto"/>
+              <w:jc w:val="both"/>
+              <w:rPr>
+                <w:rFonts w:hint="default" w:ascii="Times New Roman" w:hAnsi="Times New Roman" w:cs="Times New Roman"/>
+                <w:sz w:val="28"/>
+                <w:szCs w:val="28"/>
+                <w:lang w:val="en-US"/>
+              </w:rPr>
+            </w:pPr>
+            <w:r>
+              <w:rPr>
+                <w:rFonts w:hint="default" w:ascii="Times New Roman" w:hAnsi="Times New Roman" w:cs="Times New Roman"/>
+                <w:sz w:val="28"/>
+                <w:szCs w:val="28"/>
+                <w:lang w:val="en-US"/>
+              </w:rPr>
+              <w:t>Nếu Admin chọn “Hủy” thì quay về màn hình danh sách lịch đặt</w:t>
+            </w:r>
+          </w:p>
+          <w:p>
+            <w:pPr>
+              <w:numPr>
+                <w:numId w:val="0"/>
+              </w:numPr>
+              <w:spacing w:line="336" w:lineRule="auto"/>
+              <w:ind w:leftChars="0"/>
+              <w:jc w:val="both"/>
+              <w:rPr>
+                <w:rFonts w:hint="default" w:ascii="Times New Roman" w:hAnsi="Times New Roman" w:cs="Times New Roman"/>
+                <w:sz w:val="28"/>
+                <w:szCs w:val="28"/>
+                <w:lang w:val="en-US"/>
+              </w:rPr>
+            </w:pPr>
+            <w:r>
+              <w:rPr>
+                <w:rFonts w:hint="default" w:ascii="Times New Roman" w:hAnsi="Times New Roman" w:cs="Times New Roman"/>
+                <w:sz w:val="28"/>
+                <w:szCs w:val="28"/>
+                <w:lang w:val="en-US"/>
+              </w:rPr>
+              <w:t>4.1 Nếu bé hơn thì hệ thống thông báo lỗi thời điểm hiện tại chưa được hủy phòng này đến Admin</w:t>
+            </w:r>
+          </w:p>
+        </w:tc>
+      </w:tr>
+    </w:tbl>
+    <w:p>
+      <w:pPr>
+        <w:numPr>
+          <w:ilvl w:val="0"/>
+          <w:numId w:val="0"/>
+        </w:numPr>
+        <w:ind w:leftChars="0"/>
+        <w:rPr>
+          <w:rFonts w:hint="default" w:ascii="Times New Roman" w:hAnsi="Times New Roman" w:cs="Times New Roman"/>
+          <w:lang w:val="en-US"/>
+        </w:rPr>
+      </w:pPr>
+    </w:p>
+    <w:p>
+      <w:pPr>
+        <w:pStyle w:val="6"/>
+        <w:bidi w:val="0"/>
+        <w:rPr>
+          <w:rFonts w:hint="default"/>
+          <w:lang w:val="en-US"/>
+        </w:rPr>
+      </w:pPr>
+      <w:r>
+        <w:rPr>
+          <w:rFonts w:hint="default"/>
+          <w:lang w:val="en-US"/>
+        </w:rPr>
+        <w:t>2.2.1.15 Đặc tả usecase nhận phòng</w:t>
+      </w:r>
+    </w:p>
+    <w:tbl>
+      <w:tblPr>
+        <w:tblStyle w:val="8"/>
+        <w:tblW w:w="9355" w:type="dxa"/>
+        <w:jc w:val="center"/>
+        <w:tblBorders>
+          <w:top w:val="single" w:color="auto" w:sz="4" w:space="0"/>
+          <w:left w:val="single" w:color="auto" w:sz="4" w:space="0"/>
+          <w:bottom w:val="single" w:color="auto" w:sz="4" w:space="0"/>
+          <w:right w:val="single" w:color="auto" w:sz="4" w:space="0"/>
+          <w:insideH w:val="single" w:color="auto" w:sz="4" w:space="0"/>
+          <w:insideV w:val="single" w:color="auto" w:sz="4" w:space="0"/>
+        </w:tblBorders>
+        <w:tblLayout w:type="autofit"/>
+        <w:tblCellMar>
+          <w:top w:w="0" w:type="dxa"/>
+          <w:left w:w="108" w:type="dxa"/>
+          <w:bottom w:w="0" w:type="dxa"/>
+          <w:right w:w="108" w:type="dxa"/>
+        </w:tblCellMar>
+      </w:tblPr>
+      <w:tblGrid>
+        <w:gridCol w:w="2925"/>
+        <w:gridCol w:w="6430"/>
+      </w:tblGrid>
+      <w:tr>
+        <w:tblPrEx>
+          <w:tblBorders>
+            <w:top w:val="single" w:color="auto" w:sz="4" w:space="0"/>
+            <w:left w:val="single" w:color="auto" w:sz="4" w:space="0"/>
+            <w:bottom w:val="single" w:color="auto" w:sz="4" w:space="0"/>
+            <w:right w:val="single" w:color="auto" w:sz="4" w:space="0"/>
+            <w:insideH w:val="single" w:color="auto" w:sz="4" w:space="0"/>
+            <w:insideV w:val="single" w:color="auto" w:sz="4" w:space="0"/>
+          </w:tblBorders>
+          <w:tblCellMar>
+            <w:top w:w="0" w:type="dxa"/>
+            <w:left w:w="108" w:type="dxa"/>
+            <w:bottom w:w="0" w:type="dxa"/>
+            <w:right w:w="108" w:type="dxa"/>
+          </w:tblCellMar>
+        </w:tblPrEx>
+        <w:trPr>
+          <w:jc w:val="center"/>
+        </w:trPr>
+        <w:tc>
+          <w:tcPr>
+            <w:tcW w:w="2925" w:type="dxa"/>
+            <w:vAlign w:val="center"/>
+          </w:tcPr>
+          <w:p>
+            <w:pPr>
+              <w:spacing w:line="336" w:lineRule="auto"/>
+              <w:jc w:val="center"/>
+              <w:rPr>
+                <w:rFonts w:hint="default" w:ascii="Times New Roman" w:hAnsi="Times New Roman" w:cs="Times New Roman"/>
+                <w:b/>
+                <w:bCs/>
+                <w:sz w:val="28"/>
+                <w:szCs w:val="28"/>
+              </w:rPr>
+            </w:pPr>
+            <w:r>
+              <w:rPr>
+                <w:rStyle w:val="11"/>
+                <w:rFonts w:hint="default" w:ascii="Times New Roman" w:hAnsi="Times New Roman" w:cs="Times New Roman" w:eastAsiaTheme="majorEastAsia"/>
+                <w:sz w:val="28"/>
+                <w:szCs w:val="28"/>
+              </w:rPr>
+              <w:t>Thuộc tính</w:t>
+            </w:r>
+          </w:p>
+        </w:tc>
+        <w:tc>
+          <w:tcPr>
+            <w:tcW w:w="6430" w:type="dxa"/>
+            <w:vAlign w:val="center"/>
+          </w:tcPr>
+          <w:p>
+            <w:pPr>
+              <w:spacing w:line="336" w:lineRule="auto"/>
+              <w:jc w:val="center"/>
+              <w:rPr>
+                <w:rFonts w:hint="default" w:ascii="Times New Roman" w:hAnsi="Times New Roman" w:cs="Times New Roman"/>
+                <w:b/>
+                <w:bCs/>
+                <w:sz w:val="28"/>
+                <w:szCs w:val="28"/>
+              </w:rPr>
+            </w:pPr>
+            <w:r>
+              <w:rPr>
+                <w:rStyle w:val="11"/>
+                <w:rFonts w:hint="default" w:ascii="Times New Roman" w:hAnsi="Times New Roman" w:cs="Times New Roman" w:eastAsiaTheme="majorEastAsia"/>
+                <w:sz w:val="28"/>
+                <w:szCs w:val="28"/>
+              </w:rPr>
+              <w:t>Mô tả</w:t>
+            </w:r>
+          </w:p>
+        </w:tc>
+      </w:tr>
+      <w:tr>
+        <w:tblPrEx>
+          <w:tblBorders>
+            <w:top w:val="single" w:color="auto" w:sz="4" w:space="0"/>
+            <w:left w:val="single" w:color="auto" w:sz="4" w:space="0"/>
+            <w:bottom w:val="single" w:color="auto" w:sz="4" w:space="0"/>
+            <w:right w:val="single" w:color="auto" w:sz="4" w:space="0"/>
+            <w:insideH w:val="single" w:color="auto" w:sz="4" w:space="0"/>
+            <w:insideV w:val="single" w:color="auto" w:sz="4" w:space="0"/>
+          </w:tblBorders>
+          <w:tblCellMar>
+            <w:top w:w="0" w:type="dxa"/>
+            <w:left w:w="108" w:type="dxa"/>
+            <w:bottom w:w="0" w:type="dxa"/>
+            <w:right w:w="108" w:type="dxa"/>
+          </w:tblCellMar>
+        </w:tblPrEx>
+        <w:trPr>
+          <w:jc w:val="center"/>
+        </w:trPr>
+        <w:tc>
+          <w:tcPr>
+            <w:tcW w:w="2925" w:type="dxa"/>
+            <w:vAlign w:val="center"/>
+          </w:tcPr>
+          <w:p>
+            <w:pPr>
+              <w:spacing w:line="336" w:lineRule="auto"/>
+              <w:jc w:val="center"/>
+              <w:rPr>
+                <w:rFonts w:hint="default" w:ascii="Times New Roman" w:hAnsi="Times New Roman" w:cs="Times New Roman"/>
+                <w:sz w:val="28"/>
+                <w:szCs w:val="28"/>
+              </w:rPr>
+            </w:pPr>
+            <w:r>
+              <w:rPr>
+                <w:rStyle w:val="11"/>
+                <w:rFonts w:hint="default" w:ascii="Times New Roman" w:hAnsi="Times New Roman" w:cs="Times New Roman" w:eastAsiaTheme="majorEastAsia"/>
+                <w:sz w:val="28"/>
+                <w:szCs w:val="28"/>
+              </w:rPr>
+              <w:t>Tên Use Case</w:t>
+            </w:r>
+          </w:p>
+        </w:tc>
+        <w:tc>
+          <w:tcPr>
+            <w:tcW w:w="6430" w:type="dxa"/>
+            <w:vAlign w:val="center"/>
+          </w:tcPr>
+          <w:p>
+            <w:pPr>
+              <w:spacing w:line="336" w:lineRule="auto"/>
+              <w:jc w:val="both"/>
+              <w:rPr>
+                <w:rFonts w:hint="default" w:ascii="Times New Roman" w:hAnsi="Times New Roman" w:cs="Times New Roman"/>
+                <w:sz w:val="28"/>
+                <w:szCs w:val="28"/>
+                <w:lang w:val="en-US"/>
+              </w:rPr>
+            </w:pPr>
+            <w:r>
+              <w:rPr>
+                <w:rFonts w:hint="default" w:ascii="Times New Roman" w:hAnsi="Times New Roman" w:cs="Times New Roman"/>
+                <w:sz w:val="28"/>
+                <w:szCs w:val="28"/>
+                <w:lang w:val="en-US"/>
+              </w:rPr>
+              <w:t>Nhận phòng</w:t>
+            </w:r>
+          </w:p>
+        </w:tc>
+      </w:tr>
+      <w:tr>
+        <w:tblPrEx>
+          <w:tblBorders>
+            <w:top w:val="single" w:color="auto" w:sz="4" w:space="0"/>
+            <w:left w:val="single" w:color="auto" w:sz="4" w:space="0"/>
+            <w:bottom w:val="single" w:color="auto" w:sz="4" w:space="0"/>
+            <w:right w:val="single" w:color="auto" w:sz="4" w:space="0"/>
+            <w:insideH w:val="single" w:color="auto" w:sz="4" w:space="0"/>
+            <w:insideV w:val="single" w:color="auto" w:sz="4" w:space="0"/>
+          </w:tblBorders>
+          <w:tblCellMar>
+            <w:top w:w="0" w:type="dxa"/>
+            <w:left w:w="108" w:type="dxa"/>
+            <w:bottom w:w="0" w:type="dxa"/>
+            <w:right w:w="108" w:type="dxa"/>
+          </w:tblCellMar>
+        </w:tblPrEx>
+        <w:trPr>
+          <w:jc w:val="center"/>
+        </w:trPr>
+        <w:tc>
+          <w:tcPr>
+            <w:tcW w:w="2925" w:type="dxa"/>
+            <w:vAlign w:val="center"/>
+          </w:tcPr>
+          <w:p>
+            <w:pPr>
+              <w:spacing w:line="336" w:lineRule="auto"/>
+              <w:jc w:val="center"/>
+              <w:rPr>
+                <w:rFonts w:hint="default" w:ascii="Times New Roman" w:hAnsi="Times New Roman" w:cs="Times New Roman"/>
+                <w:sz w:val="28"/>
+                <w:szCs w:val="28"/>
+              </w:rPr>
+            </w:pPr>
+            <w:r>
+              <w:rPr>
+                <w:rStyle w:val="11"/>
+                <w:rFonts w:hint="default" w:ascii="Times New Roman" w:hAnsi="Times New Roman" w:cs="Times New Roman" w:eastAsiaTheme="majorEastAsia"/>
+                <w:sz w:val="28"/>
+                <w:szCs w:val="28"/>
+              </w:rPr>
+              <w:t>Mô tả</w:t>
+            </w:r>
+          </w:p>
+        </w:tc>
+        <w:tc>
+          <w:tcPr>
+            <w:tcW w:w="6430" w:type="dxa"/>
+            <w:vAlign w:val="center"/>
+          </w:tcPr>
+          <w:p>
+            <w:pPr>
+              <w:pStyle w:val="10"/>
+              <w:spacing w:before="0" w:beforeAutospacing="0" w:after="0" w:afterAutospacing="0" w:line="336" w:lineRule="auto"/>
+              <w:jc w:val="both"/>
+              <w:rPr>
+                <w:rFonts w:hint="default" w:ascii="Times New Roman" w:hAnsi="Times New Roman" w:cs="Times New Roman"/>
+                <w:sz w:val="28"/>
+                <w:szCs w:val="28"/>
+                <w:lang w:val="vi"/>
+              </w:rPr>
+            </w:pPr>
+            <w:r>
+              <w:rPr>
+                <w:rFonts w:hint="default" w:ascii="Times New Roman" w:hAnsi="Times New Roman"/>
+                <w:sz w:val="28"/>
+                <w:szCs w:val="28"/>
+                <w:lang w:val="vi"/>
+              </w:rPr>
+              <w:t>Cho phép Admin xác nhận khi khách có lịch đặt trước đến quán. Hệ thống sẽ cập nhật trạng thái lịch đặt và bắt đầu tính giờ sử dụng phòng.</w:t>
+            </w:r>
+          </w:p>
+        </w:tc>
+      </w:tr>
+      <w:tr>
+        <w:tblPrEx>
+          <w:tblBorders>
+            <w:top w:val="single" w:color="auto" w:sz="4" w:space="0"/>
+            <w:left w:val="single" w:color="auto" w:sz="4" w:space="0"/>
+            <w:bottom w:val="single" w:color="auto" w:sz="4" w:space="0"/>
+            <w:right w:val="single" w:color="auto" w:sz="4" w:space="0"/>
+            <w:insideH w:val="single" w:color="auto" w:sz="4" w:space="0"/>
+            <w:insideV w:val="single" w:color="auto" w:sz="4" w:space="0"/>
+          </w:tblBorders>
+          <w:tblCellMar>
+            <w:top w:w="0" w:type="dxa"/>
+            <w:left w:w="108" w:type="dxa"/>
+            <w:bottom w:w="0" w:type="dxa"/>
+            <w:right w:w="108" w:type="dxa"/>
+          </w:tblCellMar>
+        </w:tblPrEx>
+        <w:trPr>
+          <w:jc w:val="center"/>
+        </w:trPr>
+        <w:tc>
+          <w:tcPr>
+            <w:tcW w:w="2925" w:type="dxa"/>
+            <w:vAlign w:val="center"/>
+          </w:tcPr>
+          <w:p>
+            <w:pPr>
+              <w:spacing w:line="336" w:lineRule="auto"/>
+              <w:jc w:val="center"/>
+              <w:rPr>
+                <w:rFonts w:hint="default" w:ascii="Times New Roman" w:hAnsi="Times New Roman" w:cs="Times New Roman"/>
+                <w:sz w:val="28"/>
+                <w:szCs w:val="28"/>
+              </w:rPr>
+            </w:pPr>
+            <w:r>
+              <w:rPr>
+                <w:rStyle w:val="11"/>
+                <w:rFonts w:hint="default" w:ascii="Times New Roman" w:hAnsi="Times New Roman" w:cs="Times New Roman" w:eastAsiaTheme="majorEastAsia"/>
+                <w:sz w:val="28"/>
+                <w:szCs w:val="28"/>
+              </w:rPr>
+              <w:t>Tác nhân chính</w:t>
+            </w:r>
+          </w:p>
+        </w:tc>
+        <w:tc>
+          <w:tcPr>
+            <w:tcW w:w="6430" w:type="dxa"/>
+            <w:vAlign w:val="center"/>
+          </w:tcPr>
+          <w:p>
+            <w:pPr>
+              <w:spacing w:line="336" w:lineRule="auto"/>
+              <w:jc w:val="both"/>
+              <w:rPr>
+                <w:rFonts w:hint="default" w:ascii="Times New Roman" w:hAnsi="Times New Roman" w:cs="Times New Roman"/>
+                <w:sz w:val="28"/>
+                <w:szCs w:val="28"/>
+                <w:lang w:val="en-US"/>
+              </w:rPr>
+            </w:pPr>
+            <w:r>
+              <w:rPr>
+                <w:rFonts w:hint="default" w:ascii="Times New Roman" w:hAnsi="Times New Roman" w:cs="Times New Roman"/>
+                <w:sz w:val="28"/>
+                <w:szCs w:val="28"/>
+                <w:lang w:val="en-US"/>
+              </w:rPr>
+              <w:t>Admin</w:t>
+            </w:r>
+          </w:p>
+        </w:tc>
+      </w:tr>
+      <w:tr>
+        <w:tblPrEx>
+          <w:tblBorders>
+            <w:top w:val="single" w:color="auto" w:sz="4" w:space="0"/>
+            <w:left w:val="single" w:color="auto" w:sz="4" w:space="0"/>
+            <w:bottom w:val="single" w:color="auto" w:sz="4" w:space="0"/>
+            <w:right w:val="single" w:color="auto" w:sz="4" w:space="0"/>
+            <w:insideH w:val="single" w:color="auto" w:sz="4" w:space="0"/>
+            <w:insideV w:val="single" w:color="auto" w:sz="4" w:space="0"/>
+          </w:tblBorders>
+          <w:tblCellMar>
+            <w:top w:w="0" w:type="dxa"/>
+            <w:left w:w="108" w:type="dxa"/>
+            <w:bottom w:w="0" w:type="dxa"/>
+            <w:right w:w="108" w:type="dxa"/>
+          </w:tblCellMar>
+        </w:tblPrEx>
+        <w:trPr>
+          <w:jc w:val="center"/>
+        </w:trPr>
+        <w:tc>
+          <w:tcPr>
+            <w:tcW w:w="2925" w:type="dxa"/>
+            <w:vAlign w:val="center"/>
+          </w:tcPr>
+          <w:p>
+            <w:pPr>
+              <w:spacing w:line="336" w:lineRule="auto"/>
+              <w:jc w:val="center"/>
+              <w:rPr>
+                <w:rFonts w:hint="default" w:ascii="Times New Roman" w:hAnsi="Times New Roman" w:cs="Times New Roman"/>
+                <w:sz w:val="28"/>
+                <w:szCs w:val="28"/>
+              </w:rPr>
+            </w:pPr>
+            <w:r>
+              <w:rPr>
+                <w:rStyle w:val="11"/>
+                <w:rFonts w:hint="default" w:ascii="Times New Roman" w:hAnsi="Times New Roman" w:cs="Times New Roman" w:eastAsiaTheme="majorEastAsia"/>
+                <w:sz w:val="28"/>
+                <w:szCs w:val="28"/>
+              </w:rPr>
+              <w:t>Tiền điều kiện</w:t>
+            </w:r>
+          </w:p>
+        </w:tc>
+        <w:tc>
+          <w:tcPr>
+            <w:tcW w:w="6430" w:type="dxa"/>
+            <w:vAlign w:val="center"/>
+          </w:tcPr>
+          <w:p>
+            <w:pPr>
+              <w:spacing w:line="336" w:lineRule="auto"/>
+              <w:jc w:val="both"/>
+              <w:rPr>
+                <w:rFonts w:hint="default" w:ascii="Times New Roman" w:hAnsi="Times New Roman" w:cs="Times New Roman"/>
+                <w:sz w:val="28"/>
+                <w:szCs w:val="28"/>
+                <w:lang w:val="en-US"/>
+              </w:rPr>
+            </w:pPr>
+            <w:r>
+              <w:rPr>
+                <w:rFonts w:hint="default" w:ascii="Times New Roman" w:hAnsi="Times New Roman" w:cs="Times New Roman"/>
+                <w:sz w:val="28"/>
+                <w:szCs w:val="28"/>
+                <w:lang w:val="en-US"/>
+              </w:rPr>
+              <w:t>Admin đã đăng nhập vào hệ thống và đang xem danh sách lịch đặt của một phòng. Phòng đang xem phải là ở trạng thái là “phòng chờ”</w:t>
+            </w:r>
+          </w:p>
+        </w:tc>
+      </w:tr>
+      <w:tr>
+        <w:tblPrEx>
+          <w:tblBorders>
+            <w:top w:val="single" w:color="auto" w:sz="4" w:space="0"/>
+            <w:left w:val="single" w:color="auto" w:sz="4" w:space="0"/>
+            <w:bottom w:val="single" w:color="auto" w:sz="4" w:space="0"/>
+            <w:right w:val="single" w:color="auto" w:sz="4" w:space="0"/>
+            <w:insideH w:val="single" w:color="auto" w:sz="4" w:space="0"/>
+            <w:insideV w:val="single" w:color="auto" w:sz="4" w:space="0"/>
+          </w:tblBorders>
+          <w:tblCellMar>
+            <w:top w:w="0" w:type="dxa"/>
+            <w:left w:w="108" w:type="dxa"/>
+            <w:bottom w:w="0" w:type="dxa"/>
+            <w:right w:w="108" w:type="dxa"/>
+          </w:tblCellMar>
+        </w:tblPrEx>
+        <w:trPr>
+          <w:jc w:val="center"/>
+        </w:trPr>
+        <w:tc>
+          <w:tcPr>
+            <w:tcW w:w="2925" w:type="dxa"/>
+            <w:vAlign w:val="center"/>
+          </w:tcPr>
+          <w:p>
+            <w:pPr>
+              <w:spacing w:line="336" w:lineRule="auto"/>
+              <w:jc w:val="center"/>
+              <w:rPr>
+                <w:rFonts w:hint="default" w:ascii="Times New Roman" w:hAnsi="Times New Roman" w:cs="Times New Roman"/>
+                <w:sz w:val="28"/>
+                <w:szCs w:val="28"/>
+              </w:rPr>
+            </w:pPr>
+            <w:r>
+              <w:rPr>
+                <w:rStyle w:val="11"/>
+                <w:rFonts w:hint="default" w:ascii="Times New Roman" w:hAnsi="Times New Roman" w:cs="Times New Roman" w:eastAsiaTheme="majorEastAsia"/>
+                <w:sz w:val="28"/>
+                <w:szCs w:val="28"/>
+              </w:rPr>
+              <w:t>Hậu điều kiện</w:t>
+            </w:r>
+          </w:p>
+        </w:tc>
+        <w:tc>
+          <w:tcPr>
+            <w:tcW w:w="6430" w:type="dxa"/>
+            <w:vAlign w:val="center"/>
+          </w:tcPr>
+          <w:p>
+            <w:pPr>
+              <w:pStyle w:val="10"/>
+              <w:spacing w:before="0" w:beforeAutospacing="0" w:after="0" w:afterAutospacing="0" w:line="336" w:lineRule="auto"/>
+              <w:jc w:val="both"/>
+              <w:rPr>
+                <w:rFonts w:hint="default" w:ascii="Times New Roman" w:hAnsi="Times New Roman" w:cs="Times New Roman"/>
+                <w:sz w:val="28"/>
+                <w:szCs w:val="28"/>
+                <w:lang w:val="en-US"/>
+              </w:rPr>
+            </w:pPr>
+            <w:r>
+              <w:rPr>
+                <w:rFonts w:hint="default" w:ascii="Times New Roman" w:hAnsi="Times New Roman" w:cs="Times New Roman"/>
+                <w:sz w:val="28"/>
+                <w:szCs w:val="28"/>
+                <w:lang w:val="en-US"/>
+              </w:rPr>
+              <w:t>Lịch đặt được chuyển sang trạng thái “Checked in”. Một hóa đơn tạm của phòng tương ứng với hội viên được tạo ra.</w:t>
+            </w:r>
+          </w:p>
+        </w:tc>
+      </w:tr>
+      <w:tr>
+        <w:tblPrEx>
+          <w:tblBorders>
+            <w:top w:val="single" w:color="auto" w:sz="4" w:space="0"/>
+            <w:left w:val="single" w:color="auto" w:sz="4" w:space="0"/>
+            <w:bottom w:val="single" w:color="auto" w:sz="4" w:space="0"/>
+            <w:right w:val="single" w:color="auto" w:sz="4" w:space="0"/>
+            <w:insideH w:val="single" w:color="auto" w:sz="4" w:space="0"/>
+            <w:insideV w:val="single" w:color="auto" w:sz="4" w:space="0"/>
+          </w:tblBorders>
+          <w:tblCellMar>
+            <w:top w:w="0" w:type="dxa"/>
+            <w:left w:w="108" w:type="dxa"/>
+            <w:bottom w:w="0" w:type="dxa"/>
+            <w:right w:w="108" w:type="dxa"/>
+          </w:tblCellMar>
+        </w:tblPrEx>
+        <w:trPr>
+          <w:jc w:val="center"/>
+        </w:trPr>
+        <w:tc>
+          <w:tcPr>
+            <w:tcW w:w="2925" w:type="dxa"/>
+            <w:vAlign w:val="center"/>
+          </w:tcPr>
+          <w:p>
+            <w:pPr>
+              <w:spacing w:line="336" w:lineRule="auto"/>
+              <w:jc w:val="center"/>
+              <w:rPr>
+                <w:rFonts w:hint="default" w:ascii="Times New Roman" w:hAnsi="Times New Roman" w:cs="Times New Roman"/>
+                <w:sz w:val="28"/>
+                <w:szCs w:val="28"/>
+              </w:rPr>
+            </w:pPr>
+            <w:r>
+              <w:rPr>
+                <w:rStyle w:val="11"/>
+                <w:rFonts w:hint="default" w:ascii="Times New Roman" w:hAnsi="Times New Roman" w:cs="Times New Roman" w:eastAsiaTheme="majorEastAsia"/>
+                <w:sz w:val="28"/>
+                <w:szCs w:val="28"/>
+              </w:rPr>
+              <w:t>Luồng chính</w:t>
+            </w:r>
+          </w:p>
+        </w:tc>
+        <w:tc>
+          <w:tcPr>
+            <w:tcW w:w="6430" w:type="dxa"/>
+            <w:vAlign w:val="center"/>
+          </w:tcPr>
+          <w:p>
+            <w:pPr>
+              <w:pStyle w:val="10"/>
+              <w:numPr>
+                <w:ilvl w:val="0"/>
+                <w:numId w:val="16"/>
+              </w:numPr>
+              <w:spacing w:before="0" w:beforeAutospacing="0" w:after="0" w:afterAutospacing="0" w:line="336" w:lineRule="auto"/>
+              <w:jc w:val="both"/>
+              <w:rPr>
+                <w:rFonts w:hint="default" w:ascii="Times New Roman" w:hAnsi="Times New Roman" w:cs="Times New Roman"/>
+                <w:sz w:val="28"/>
+                <w:szCs w:val="28"/>
+                <w:lang w:val="en-US"/>
+              </w:rPr>
+            </w:pPr>
+            <w:r>
+              <w:rPr>
+                <w:rFonts w:hint="default" w:ascii="Times New Roman" w:hAnsi="Times New Roman" w:cs="Times New Roman"/>
+                <w:sz w:val="28"/>
+                <w:szCs w:val="28"/>
+                <w:lang w:val="en-US"/>
+              </w:rPr>
+              <w:t>Admin chọn lịch đặt và nhấn nút nhận phòng</w:t>
+            </w:r>
+          </w:p>
+          <w:p>
+            <w:pPr>
+              <w:pStyle w:val="10"/>
+              <w:numPr>
+                <w:ilvl w:val="0"/>
+                <w:numId w:val="16"/>
+              </w:numPr>
+              <w:spacing w:before="0" w:beforeAutospacing="0" w:after="0" w:afterAutospacing="0" w:line="336" w:lineRule="auto"/>
+              <w:jc w:val="both"/>
+              <w:rPr>
+                <w:rFonts w:hint="default" w:ascii="Times New Roman" w:hAnsi="Times New Roman" w:cs="Times New Roman"/>
+                <w:sz w:val="28"/>
+                <w:szCs w:val="28"/>
+                <w:lang w:val="en-US"/>
+              </w:rPr>
+            </w:pPr>
+            <w:r>
+              <w:rPr>
+                <w:rFonts w:hint="default" w:ascii="Times New Roman" w:hAnsi="Times New Roman" w:cs="Times New Roman"/>
+                <w:sz w:val="28"/>
+                <w:szCs w:val="28"/>
+                <w:lang w:val="en-US"/>
+              </w:rPr>
+              <w:t>Hệ thống hiển thị hộp thoại xác nhận</w:t>
+            </w:r>
+          </w:p>
+          <w:p>
+            <w:pPr>
+              <w:pStyle w:val="10"/>
+              <w:numPr>
+                <w:ilvl w:val="0"/>
+                <w:numId w:val="16"/>
+              </w:numPr>
+              <w:spacing w:before="0" w:beforeAutospacing="0" w:after="0" w:afterAutospacing="0" w:line="336" w:lineRule="auto"/>
+              <w:jc w:val="both"/>
+              <w:rPr>
+                <w:rFonts w:hint="default" w:ascii="Times New Roman" w:hAnsi="Times New Roman" w:cs="Times New Roman"/>
+                <w:sz w:val="28"/>
+                <w:szCs w:val="28"/>
+                <w:lang w:val="en-US"/>
+              </w:rPr>
+            </w:pPr>
+            <w:r>
+              <w:rPr>
+                <w:rFonts w:hint="default" w:ascii="Times New Roman" w:hAnsi="Times New Roman" w:cs="Times New Roman"/>
+                <w:sz w:val="28"/>
+                <w:szCs w:val="28"/>
+                <w:lang w:val="en-US"/>
+              </w:rPr>
+              <w:t>Admin chọn “Đồng ý”</w:t>
+            </w:r>
+          </w:p>
+          <w:p>
+            <w:pPr>
+              <w:pStyle w:val="10"/>
+              <w:numPr>
+                <w:ilvl w:val="0"/>
+                <w:numId w:val="16"/>
+              </w:numPr>
+              <w:spacing w:before="0" w:beforeAutospacing="0" w:after="0" w:afterAutospacing="0" w:line="336" w:lineRule="auto"/>
+              <w:jc w:val="both"/>
+              <w:rPr>
+                <w:rFonts w:hint="default" w:ascii="Times New Roman" w:hAnsi="Times New Roman" w:cs="Times New Roman"/>
+                <w:sz w:val="28"/>
+                <w:szCs w:val="28"/>
+                <w:lang w:val="en-US"/>
+              </w:rPr>
+            </w:pPr>
+            <w:r>
+              <w:rPr>
+                <w:rFonts w:hint="default" w:ascii="Times New Roman" w:hAnsi="Times New Roman" w:cs="Times New Roman"/>
+                <w:sz w:val="28"/>
+                <w:szCs w:val="28"/>
+                <w:lang w:val="en-US"/>
+              </w:rPr>
+              <w:t>Hệ thống kiểm tra thời điểm hiện tại có trước thời điểm nhận phòng đã đặt không</w:t>
+            </w:r>
+          </w:p>
+          <w:p>
+            <w:pPr>
+              <w:pStyle w:val="10"/>
+              <w:numPr>
+                <w:ilvl w:val="0"/>
+                <w:numId w:val="16"/>
+              </w:numPr>
+              <w:spacing w:before="0" w:beforeAutospacing="0" w:after="0" w:afterAutospacing="0" w:line="336" w:lineRule="auto"/>
+              <w:jc w:val="both"/>
+              <w:rPr>
+                <w:rFonts w:hint="default" w:ascii="Times New Roman" w:hAnsi="Times New Roman" w:cs="Times New Roman"/>
+                <w:sz w:val="28"/>
+                <w:szCs w:val="28"/>
+                <w:lang w:val="en-US"/>
+              </w:rPr>
+            </w:pPr>
+            <w:r>
+              <w:rPr>
+                <w:rFonts w:hint="default" w:ascii="Times New Roman" w:hAnsi="Times New Roman" w:cs="Times New Roman"/>
+                <w:sz w:val="28"/>
+                <w:szCs w:val="28"/>
+                <w:lang w:val="en-US"/>
+              </w:rPr>
+              <w:t>Nếu không thì hệ thống cập nhật trạng thái của lịch đặt sang “Checked in”, sau đó tạo hóa đơn tạm của phòng hiện tại và tương ứng hội viên.</w:t>
+            </w:r>
+          </w:p>
+          <w:p>
+            <w:pPr>
+              <w:pStyle w:val="10"/>
+              <w:numPr>
+                <w:ilvl w:val="0"/>
+                <w:numId w:val="16"/>
+              </w:numPr>
+              <w:spacing w:before="0" w:beforeAutospacing="0" w:after="0" w:afterAutospacing="0" w:line="336" w:lineRule="auto"/>
+              <w:jc w:val="both"/>
+              <w:rPr>
+                <w:rFonts w:hint="default" w:ascii="Times New Roman" w:hAnsi="Times New Roman" w:cs="Times New Roman"/>
+                <w:sz w:val="28"/>
+                <w:szCs w:val="28"/>
+                <w:lang w:val="en-US"/>
+              </w:rPr>
+            </w:pPr>
+            <w:r>
+              <w:rPr>
+                <w:rFonts w:hint="default" w:ascii="Times New Roman" w:hAnsi="Times New Roman" w:cs="Times New Roman"/>
+                <w:sz w:val="28"/>
+                <w:szCs w:val="28"/>
+                <w:lang w:val="en-US"/>
+              </w:rPr>
+              <w:t>Hệ thống kiểm tra phòng hiện tại còn lịch đặt không</w:t>
+            </w:r>
+          </w:p>
+          <w:p>
+            <w:pPr>
+              <w:pStyle w:val="10"/>
+              <w:numPr>
+                <w:ilvl w:val="0"/>
+                <w:numId w:val="16"/>
+              </w:numPr>
+              <w:spacing w:before="0" w:beforeAutospacing="0" w:after="0" w:afterAutospacing="0" w:line="336" w:lineRule="auto"/>
+              <w:jc w:val="both"/>
+              <w:rPr>
+                <w:rFonts w:hint="default" w:ascii="Times New Roman" w:hAnsi="Times New Roman" w:cs="Times New Roman"/>
+                <w:sz w:val="28"/>
+                <w:szCs w:val="28"/>
+                <w:lang w:val="en-US"/>
+              </w:rPr>
+            </w:pPr>
+            <w:r>
+              <w:rPr>
+                <w:rFonts w:hint="default" w:ascii="Times New Roman" w:hAnsi="Times New Roman" w:cs="Times New Roman"/>
+                <w:sz w:val="28"/>
+                <w:szCs w:val="28"/>
+                <w:lang w:val="en-US"/>
+              </w:rPr>
+              <w:t>Nếu không thì chuyển trạng thái phòng hiên tại sang “Đang sử dụng”. Nếu có thì chuyển trạng thái phòng hiện tại sang “Phòng tạm”</w:t>
+            </w:r>
+          </w:p>
+          <w:p>
+            <w:pPr>
+              <w:pStyle w:val="10"/>
+              <w:numPr>
+                <w:ilvl w:val="0"/>
+                <w:numId w:val="16"/>
+              </w:numPr>
+              <w:spacing w:before="0" w:beforeAutospacing="0" w:after="0" w:afterAutospacing="0" w:line="336" w:lineRule="auto"/>
+              <w:jc w:val="both"/>
+              <w:rPr>
+                <w:rFonts w:hint="default" w:ascii="Times New Roman" w:hAnsi="Times New Roman" w:cs="Times New Roman"/>
+                <w:sz w:val="28"/>
+                <w:szCs w:val="28"/>
+                <w:lang w:val="en-US"/>
+              </w:rPr>
+            </w:pPr>
+            <w:r>
+              <w:rPr>
+                <w:rFonts w:hint="default" w:ascii="Times New Roman" w:hAnsi="Times New Roman" w:cs="Times New Roman"/>
+                <w:sz w:val="28"/>
+                <w:szCs w:val="28"/>
+                <w:lang w:val="en-US"/>
+              </w:rPr>
+              <w:t>Hệ thống thông báo nhận phòng thành công</w:t>
+            </w:r>
+            <w:bookmarkStart w:id="0" w:name="_GoBack"/>
+            <w:bookmarkEnd w:id="0"/>
+          </w:p>
+        </w:tc>
+      </w:tr>
+      <w:tr>
+        <w:tblPrEx>
+          <w:tblBorders>
+            <w:top w:val="single" w:color="auto" w:sz="4" w:space="0"/>
+            <w:left w:val="single" w:color="auto" w:sz="4" w:space="0"/>
+            <w:bottom w:val="single" w:color="auto" w:sz="4" w:space="0"/>
+            <w:right w:val="single" w:color="auto" w:sz="4" w:space="0"/>
+            <w:insideH w:val="single" w:color="auto" w:sz="4" w:space="0"/>
+            <w:insideV w:val="single" w:color="auto" w:sz="4" w:space="0"/>
+          </w:tblBorders>
+          <w:tblCellMar>
+            <w:top w:w="0" w:type="dxa"/>
+            <w:left w:w="108" w:type="dxa"/>
+            <w:bottom w:w="0" w:type="dxa"/>
+            <w:right w:w="108" w:type="dxa"/>
+          </w:tblCellMar>
+        </w:tblPrEx>
+        <w:trPr>
+          <w:jc w:val="center"/>
+        </w:trPr>
+        <w:tc>
+          <w:tcPr>
+            <w:tcW w:w="2925" w:type="dxa"/>
+            <w:vAlign w:val="center"/>
+          </w:tcPr>
+          <w:p>
+            <w:pPr>
+              <w:spacing w:line="336" w:lineRule="auto"/>
+              <w:jc w:val="center"/>
+              <w:rPr>
+                <w:rFonts w:hint="default" w:ascii="Times New Roman" w:hAnsi="Times New Roman" w:cs="Times New Roman"/>
+                <w:sz w:val="28"/>
+                <w:szCs w:val="28"/>
+              </w:rPr>
+            </w:pPr>
+            <w:r>
+              <w:rPr>
+                <w:rStyle w:val="11"/>
+                <w:rFonts w:hint="default" w:ascii="Times New Roman" w:hAnsi="Times New Roman" w:cs="Times New Roman" w:eastAsiaTheme="majorEastAsia"/>
+                <w:sz w:val="28"/>
+                <w:szCs w:val="28"/>
+              </w:rPr>
+              <w:t>Luồng thay thế</w:t>
+            </w:r>
+          </w:p>
+        </w:tc>
+        <w:tc>
+          <w:tcPr>
+            <w:tcW w:w="6430" w:type="dxa"/>
+            <w:vAlign w:val="center"/>
+          </w:tcPr>
+          <w:p>
+            <w:pPr>
+              <w:numPr>
+                <w:ilvl w:val="1"/>
+                <w:numId w:val="7"/>
+              </w:numPr>
+              <w:spacing w:line="336" w:lineRule="auto"/>
+              <w:jc w:val="both"/>
+              <w:rPr>
+                <w:rFonts w:hint="default" w:ascii="Times New Roman" w:hAnsi="Times New Roman" w:cs="Times New Roman"/>
+                <w:sz w:val="28"/>
+                <w:szCs w:val="28"/>
+                <w:lang w:val="en-US"/>
+              </w:rPr>
+            </w:pPr>
+            <w:r>
+              <w:rPr>
+                <w:rFonts w:hint="default" w:ascii="Times New Roman" w:hAnsi="Times New Roman" w:cs="Times New Roman"/>
+                <w:sz w:val="28"/>
+                <w:szCs w:val="28"/>
+                <w:lang w:val="en-US"/>
+              </w:rPr>
+              <w:t>Nếu Admin chọn “Hủy” thì hệ thống sẽ đóng hộp thoại và quay về màn hình danh sách lịch đặt của phòng</w:t>
+            </w:r>
+          </w:p>
+          <w:p>
+            <w:pPr>
+              <w:numPr>
+                <w:numId w:val="0"/>
+              </w:numPr>
+              <w:spacing w:line="336" w:lineRule="auto"/>
+              <w:ind w:leftChars="0"/>
+              <w:jc w:val="both"/>
+              <w:rPr>
+                <w:rFonts w:hint="default" w:ascii="Times New Roman" w:hAnsi="Times New Roman" w:cs="Times New Roman"/>
+                <w:sz w:val="28"/>
+                <w:szCs w:val="28"/>
+                <w:lang w:val="en-US"/>
+              </w:rPr>
+            </w:pPr>
+            <w:r>
+              <w:rPr>
+                <w:rFonts w:hint="default" w:ascii="Times New Roman" w:hAnsi="Times New Roman" w:cs="Times New Roman"/>
+                <w:sz w:val="28"/>
+                <w:szCs w:val="28"/>
+                <w:lang w:val="en-US"/>
+              </w:rPr>
+              <w:t>4.1 Nếu có thì thông báo lỗi thời điểm hiện tại không thể nhận phòng đến cho Admin</w:t>
             </w:r>
           </w:p>
         </w:tc>
@@ -9019,6 +13070,122 @@
     </w:lvl>
   </w:abstractNum>
   <w:abstractNum w:abstractNumId="3">
+    <w:nsid w:val="C282BC5E"/>
+    <w:multiLevelType w:val="multilevel"/>
+    <w:tmpl w:val="C282BC5E"/>
+    <w:lvl w:ilvl="0" w:tentative="0">
+      <w:start w:val="1"/>
+      <w:numFmt w:val="decimal"/>
+      <w:suff w:val="space"/>
+      <w:lvlText w:val="%1."/>
+      <w:lvlJc w:val="left"/>
+    </w:lvl>
+    <w:lvl w:ilvl="1" w:tentative="0">
+      <w:start w:val="1"/>
+      <w:numFmt w:val="decimal"/>
+      <w:suff w:val="space"/>
+      <w:lvlText w:val="%1.%2"/>
+      <w:lvlJc w:val="left"/>
+      <w:pPr>
+        <w:ind w:left="0" w:leftChars="0" w:firstLine="0" w:firstLineChars="0"/>
+      </w:pPr>
+      <w:rPr>
+        <w:rFonts w:hint="default"/>
+      </w:rPr>
+    </w:lvl>
+    <w:lvl w:ilvl="2" w:tentative="0">
+      <w:start w:val="1"/>
+      <w:numFmt w:val="decimal"/>
+      <w:suff w:val="space"/>
+      <w:lvlText w:val="%1.%2.%3"/>
+      <w:lvlJc w:val="left"/>
+      <w:pPr>
+        <w:ind w:left="0" w:leftChars="0" w:firstLine="0" w:firstLineChars="0"/>
+      </w:pPr>
+      <w:rPr>
+        <w:rFonts w:hint="default"/>
+      </w:rPr>
+    </w:lvl>
+    <w:lvl w:ilvl="3" w:tentative="0">
+      <w:start w:val="1"/>
+      <w:numFmt w:val="decimal"/>
+      <w:suff w:val="space"/>
+      <w:lvlText w:val="%1.%2.%3.%4"/>
+      <w:lvlJc w:val="left"/>
+      <w:pPr>
+        <w:ind w:left="0" w:leftChars="0" w:firstLine="0" w:firstLineChars="0"/>
+      </w:pPr>
+      <w:rPr>
+        <w:rFonts w:hint="default"/>
+      </w:rPr>
+    </w:lvl>
+    <w:lvl w:ilvl="4" w:tentative="0">
+      <w:start w:val="1"/>
+      <w:numFmt w:val="decimal"/>
+      <w:suff w:val="space"/>
+      <w:lvlText w:val="%1.%2.%3.%4.%5"/>
+      <w:lvlJc w:val="left"/>
+      <w:pPr>
+        <w:ind w:left="0" w:leftChars="0" w:firstLine="0" w:firstLineChars="0"/>
+      </w:pPr>
+      <w:rPr>
+        <w:rFonts w:hint="default"/>
+      </w:rPr>
+    </w:lvl>
+    <w:lvl w:ilvl="5" w:tentative="0">
+      <w:start w:val="1"/>
+      <w:numFmt w:val="decimal"/>
+      <w:suff w:val="space"/>
+      <w:lvlText w:val="%1.%2.%3.%4.%5.%6"/>
+      <w:lvlJc w:val="left"/>
+      <w:pPr>
+        <w:ind w:left="0" w:leftChars="0" w:firstLine="0" w:firstLineChars="0"/>
+      </w:pPr>
+      <w:rPr>
+        <w:rFonts w:hint="default"/>
+      </w:rPr>
+    </w:lvl>
+    <w:lvl w:ilvl="6" w:tentative="0">
+      <w:start w:val="1"/>
+      <w:numFmt w:val="decimal"/>
+      <w:suff w:val="space"/>
+      <w:lvlText w:val="%1.%2.%3.%4.%5.%6.%7"/>
+      <w:lvlJc w:val="left"/>
+      <w:pPr>
+        <w:ind w:left="0" w:leftChars="0" w:firstLine="0" w:firstLineChars="0"/>
+      </w:pPr>
+      <w:rPr>
+        <w:rFonts w:hint="default"/>
+      </w:rPr>
+    </w:lvl>
+    <w:lvl w:ilvl="7" w:tentative="0">
+      <w:start w:val="1"/>
+      <w:numFmt w:val="decimal"/>
+      <w:suff w:val="space"/>
+      <w:lvlText w:val="%1.%2.%3.%4.%5.%6.%7.%8"/>
+      <w:lvlJc w:val="left"/>
+      <w:pPr>
+        <w:ind w:left="0" w:leftChars="0" w:firstLine="0" w:firstLineChars="0"/>
+      </w:pPr>
+      <w:rPr>
+        <w:rFonts w:hint="default"/>
+      </w:rPr>
+    </w:lvl>
+    <w:lvl w:ilvl="8" w:tentative="0">
+      <w:start w:val="1"/>
+      <w:numFmt w:val="decimal"/>
+      <w:suff w:val="space"/>
+      <w:lvlText w:val="%1.%2.%3.%4.%5.%6.%7.%8.%9"/>
+      <w:lvlJc w:val="left"/>
+      <w:pPr>
+        <w:ind w:left="0" w:leftChars="0" w:firstLine="0" w:firstLineChars="0"/>
+      </w:pPr>
+      <w:rPr>
+        <w:rFonts w:hint="default"/>
+      </w:rPr>
+    </w:lvl>
+  </w:abstractNum>
+  <w:abstractNum w:abstractNumId="4">
     <w:nsid w:val="C5A17844"/>
     <w:multiLevelType w:val="singleLevel"/>
     <w:tmpl w:val="C5A17844"/>
@@ -9030,7 +13197,7 @@
       <w:lvlJc w:val="left"/>
     </w:lvl>
   </w:abstractNum>
-  <w:abstractNum w:abstractNumId="4">
+  <w:abstractNum w:abstractNumId="5">
     <w:nsid w:val="CBB60CEF"/>
     <w:multiLevelType w:val="singleLevel"/>
     <w:tmpl w:val="CBB60CEF"/>
@@ -9042,7 +13209,147 @@
       <w:lvlJc w:val="left"/>
     </w:lvl>
   </w:abstractNum>
-  <w:abstractNum w:abstractNumId="5">
+  <w:abstractNum w:abstractNumId="6">
+    <w:nsid w:val="E9655F69"/>
+    <w:multiLevelType w:val="singleLevel"/>
+    <w:tmpl w:val="E9655F69"/>
+    <w:lvl w:ilvl="0" w:tentative="0">
+      <w:start w:val="1"/>
+      <w:numFmt w:val="decimal"/>
+      <w:suff w:val="space"/>
+      <w:lvlText w:val="%1."/>
+      <w:lvlJc w:val="left"/>
+    </w:lvl>
+  </w:abstractNum>
+  <w:abstractNum w:abstractNumId="7">
+    <w:nsid w:val="0A04ABC0"/>
+    <w:multiLevelType w:val="multilevel"/>
+    <w:tmpl w:val="0A04ABC0"/>
+    <w:lvl w:ilvl="0" w:tentative="0">
+      <w:start w:val="1"/>
+      <w:numFmt w:val="decimal"/>
+      <w:suff w:val="space"/>
+      <w:lvlText w:val="%1."/>
+      <w:lvlJc w:val="left"/>
+    </w:lvl>
+    <w:lvl w:ilvl="1" w:tentative="0">
+      <w:start w:val="1"/>
+      <w:numFmt w:val="decimal"/>
+      <w:suff w:val="space"/>
+      <w:lvlText w:val="%1.%2"/>
+      <w:lvlJc w:val="left"/>
+      <w:pPr>
+        <w:ind w:left="70" w:leftChars="0" w:firstLine="0" w:firstLineChars="0"/>
+      </w:pPr>
+      <w:rPr>
+        <w:rFonts w:hint="default"/>
+      </w:rPr>
+    </w:lvl>
+    <w:lvl w:ilvl="2" w:tentative="0">
+      <w:start w:val="1"/>
+      <w:numFmt w:val="decimal"/>
+      <w:suff w:val="space"/>
+      <w:lvlText w:val="%1.%2.%3"/>
+      <w:lvlJc w:val="left"/>
+      <w:pPr>
+        <w:ind w:left="70" w:leftChars="0" w:firstLine="0" w:firstLineChars="0"/>
+      </w:pPr>
+      <w:rPr>
+        <w:rFonts w:hint="default"/>
+      </w:rPr>
+    </w:lvl>
+    <w:lvl w:ilvl="3" w:tentative="0">
+      <w:start w:val="1"/>
+      <w:numFmt w:val="decimal"/>
+      <w:suff w:val="space"/>
+      <w:lvlText w:val="%1.%2.%3.%4"/>
+      <w:lvlJc w:val="left"/>
+      <w:pPr>
+        <w:ind w:left="70" w:leftChars="0" w:firstLine="0" w:firstLineChars="0"/>
+      </w:pPr>
+      <w:rPr>
+        <w:rFonts w:hint="default"/>
+      </w:rPr>
+    </w:lvl>
+    <w:lvl w:ilvl="4" w:tentative="0">
+      <w:start w:val="1"/>
+      <w:numFmt w:val="decimal"/>
+      <w:suff w:val="space"/>
+      <w:lvlText w:val="%1.%2.%3.%4.%5"/>
+      <w:lvlJc w:val="left"/>
+      <w:pPr>
+        <w:ind w:left="70" w:leftChars="0" w:firstLine="0" w:firstLineChars="0"/>
+      </w:pPr>
+      <w:rPr>
+        <w:rFonts w:hint="default"/>
+      </w:rPr>
+    </w:lvl>
+    <w:lvl w:ilvl="5" w:tentative="0">
+      <w:start w:val="1"/>
+      <w:numFmt w:val="decimal"/>
+      <w:suff w:val="space"/>
+      <w:lvlText w:val="%1.%2.%3.%4.%5.%6"/>
+      <w:lvlJc w:val="left"/>
+      <w:pPr>
+        <w:ind w:left="70" w:leftChars="0" w:firstLine="0" w:firstLineChars="0"/>
+      </w:pPr>
+      <w:rPr>
+        <w:rFonts w:hint="default"/>
+      </w:rPr>
+    </w:lvl>
+    <w:lvl w:ilvl="6" w:tentative="0">
+      <w:start w:val="1"/>
+      <w:numFmt w:val="decimal"/>
+      <w:suff w:val="space"/>
+      <w:lvlText w:val="%1.%2.%3.%4.%5.%6.%7"/>
+      <w:lvlJc w:val="left"/>
+      <w:pPr>
+        <w:ind w:left="70" w:leftChars="0" w:firstLine="0" w:firstLineChars="0"/>
+      </w:pPr>
+      <w:rPr>
+        <w:rFonts w:hint="default"/>
+      </w:rPr>
+    </w:lvl>
+    <w:lvl w:ilvl="7" w:tentative="0">
+      <w:start w:val="1"/>
+      <w:numFmt w:val="decimal"/>
+      <w:suff w:val="space"/>
+      <w:lvlText w:val="%1.%2.%3.%4.%5.%6.%7.%8"/>
+      <w:lvlJc w:val="left"/>
+      <w:pPr>
+        <w:ind w:left="70" w:leftChars="0" w:firstLine="0" w:firstLineChars="0"/>
+      </w:pPr>
+      <w:rPr>
+        <w:rFonts w:hint="default"/>
+      </w:rPr>
+    </w:lvl>
+    <w:lvl w:ilvl="8" w:tentative="0">
+      <w:start w:val="1"/>
+      <w:numFmt w:val="decimal"/>
+      <w:suff w:val="space"/>
+      <w:lvlText w:val="%1.%2.%3.%4.%5.%6.%7.%8.%9"/>
+      <w:lvlJc w:val="left"/>
+      <w:pPr>
+        <w:ind w:left="70" w:leftChars="0" w:firstLine="0" w:firstLineChars="0"/>
+      </w:pPr>
+      <w:rPr>
+        <w:rFonts w:hint="default"/>
+      </w:rPr>
+    </w:lvl>
+  </w:abstractNum>
+  <w:abstractNum w:abstractNumId="8">
+    <w:nsid w:val="140BAA96"/>
+    <w:multiLevelType w:val="singleLevel"/>
+    <w:tmpl w:val="140BAA96"/>
+    <w:lvl w:ilvl="0" w:tentative="0">
+      <w:start w:val="1"/>
+      <w:numFmt w:val="decimal"/>
+      <w:suff w:val="space"/>
+      <w:lvlText w:val="%1."/>
+      <w:lvlJc w:val="left"/>
+    </w:lvl>
+  </w:abstractNum>
+  <w:abstractNum w:abstractNumId="9">
     <w:nsid w:val="25E0AF67"/>
     <w:multiLevelType w:val="singleLevel"/>
     <w:tmpl w:val="25E0AF67"/>
@@ -9054,7 +13361,7 @@
       <w:lvlJc w:val="left"/>
     </w:lvl>
   </w:abstractNum>
-  <w:abstractNum w:abstractNumId="6">
+  <w:abstractNum w:abstractNumId="10">
     <w:nsid w:val="27E01A1C"/>
     <w:multiLevelType w:val="singleLevel"/>
     <w:tmpl w:val="27E01A1C"/>
@@ -9066,9 +13373,9 @@
       <w:lvlJc w:val="left"/>
     </w:lvl>
   </w:abstractNum>
-  <w:abstractNum w:abstractNumId="7">
+  <w:abstractNum w:abstractNumId="11">
     <w:nsid w:val="4D46F8E1"/>
-    <w:multiLevelType w:val="singleLevel"/>
+    <w:multiLevelType w:val="multilevel"/>
     <w:tmpl w:val="4D46F8E1"/>
     <w:lvl w:ilvl="0" w:tentative="0">
       <w:start w:val="1"/>
@@ -9077,8 +13384,112 @@
       <w:lvlText w:val="%1."/>
       <w:lvlJc w:val="left"/>
     </w:lvl>
+    <w:lvl w:ilvl="1" w:tentative="0">
+      <w:start w:val="1"/>
+      <w:numFmt w:val="decimal"/>
+      <w:suff w:val="space"/>
+      <w:lvlText w:val="%1.%2"/>
+      <w:lvlJc w:val="left"/>
+      <w:pPr>
+        <w:ind w:left="0" w:leftChars="0" w:firstLine="0" w:firstLineChars="0"/>
+      </w:pPr>
+      <w:rPr>
+        <w:rFonts w:hint="default"/>
+      </w:rPr>
+    </w:lvl>
+    <w:lvl w:ilvl="2" w:tentative="0">
+      <w:start w:val="1"/>
+      <w:numFmt w:val="decimal"/>
+      <w:suff w:val="space"/>
+      <w:lvlText w:val="%1.%2.%3"/>
+      <w:lvlJc w:val="left"/>
+      <w:pPr>
+        <w:ind w:left="0" w:leftChars="0" w:firstLine="0" w:firstLineChars="0"/>
+      </w:pPr>
+      <w:rPr>
+        <w:rFonts w:hint="default"/>
+      </w:rPr>
+    </w:lvl>
+    <w:lvl w:ilvl="3" w:tentative="0">
+      <w:start w:val="1"/>
+      <w:numFmt w:val="decimal"/>
+      <w:suff w:val="space"/>
+      <w:lvlText w:val="%1.%2.%3.%4"/>
+      <w:lvlJc w:val="left"/>
+      <w:pPr>
+        <w:ind w:left="0" w:leftChars="0" w:firstLine="0" w:firstLineChars="0"/>
+      </w:pPr>
+      <w:rPr>
+        <w:rFonts w:hint="default"/>
+      </w:rPr>
+    </w:lvl>
+    <w:lvl w:ilvl="4" w:tentative="0">
+      <w:start w:val="1"/>
+      <w:numFmt w:val="decimal"/>
+      <w:suff w:val="space"/>
+      <w:lvlText w:val="%1.%2.%3.%4.%5"/>
+      <w:lvlJc w:val="left"/>
+      <w:pPr>
+        <w:ind w:left="0" w:leftChars="0" w:firstLine="0" w:firstLineChars="0"/>
+      </w:pPr>
+      <w:rPr>
+        <w:rFonts w:hint="default"/>
+      </w:rPr>
+    </w:lvl>
+    <w:lvl w:ilvl="5" w:tentative="0">
+      <w:start w:val="1"/>
+      <w:numFmt w:val="decimal"/>
+      <w:suff w:val="space"/>
+      <w:lvlText w:val="%1.%2.%3.%4.%5.%6"/>
+      <w:lvlJc w:val="left"/>
+      <w:pPr>
+        <w:ind w:left="0" w:leftChars="0" w:firstLine="0" w:firstLineChars="0"/>
+      </w:pPr>
+      <w:rPr>
+        <w:rFonts w:hint="default"/>
+      </w:rPr>
+    </w:lvl>
+    <w:lvl w:ilvl="6" w:tentative="0">
+      <w:start w:val="1"/>
+      <w:numFmt w:val="decimal"/>
+      <w:suff w:val="space"/>
+      <w:lvlText w:val="%1.%2.%3.%4.%5.%6.%7"/>
+      <w:lvlJc w:val="left"/>
+      <w:pPr>
+        <w:ind w:left="0" w:leftChars="0" w:firstLine="0" w:firstLineChars="0"/>
+      </w:pPr>
+      <w:rPr>
+        <w:rFonts w:hint="default"/>
+      </w:rPr>
+    </w:lvl>
+    <w:lvl w:ilvl="7" w:tentative="0">
+      <w:start w:val="1"/>
+      <w:numFmt w:val="decimal"/>
+      <w:suff w:val="space"/>
+      <w:lvlText w:val="%1.%2.%3.%4.%5.%6.%7.%8"/>
+      <w:lvlJc w:val="left"/>
+      <w:pPr>
+        <w:ind w:left="0" w:leftChars="0" w:firstLine="0" w:firstLineChars="0"/>
+      </w:pPr>
+      <w:rPr>
+        <w:rFonts w:hint="default"/>
+      </w:rPr>
+    </w:lvl>
+    <w:lvl w:ilvl="8" w:tentative="0">
+      <w:start w:val="1"/>
+      <w:numFmt w:val="decimal"/>
+      <w:suff w:val="space"/>
+      <w:lvlText w:val="%1.%2.%3.%4.%5.%6.%7.%8.%9"/>
+      <w:lvlJc w:val="left"/>
+      <w:pPr>
+        <w:ind w:left="0" w:leftChars="0" w:firstLine="0" w:firstLineChars="0"/>
+      </w:pPr>
+      <w:rPr>
+        <w:rFonts w:hint="default"/>
+      </w:rPr>
+    </w:lvl>
   </w:abstractNum>
-  <w:abstractNum w:abstractNumId="8">
+  <w:abstractNum w:abstractNumId="12">
     <w:nsid w:val="514BAAB2"/>
     <w:multiLevelType w:val="multilevel"/>
     <w:tmpl w:val="514BAAB2"/>
@@ -9194,7 +13605,19 @@
       </w:rPr>
     </w:lvl>
   </w:abstractNum>
-  <w:abstractNum w:abstractNumId="9">
+  <w:abstractNum w:abstractNumId="13">
+    <w:nsid w:val="60844B0F"/>
+    <w:multiLevelType w:val="singleLevel"/>
+    <w:tmpl w:val="60844B0F"/>
+    <w:lvl w:ilvl="0" w:tentative="0">
+      <w:start w:val="1"/>
+      <w:numFmt w:val="decimal"/>
+      <w:suff w:val="space"/>
+      <w:lvlText w:val="%1."/>
+      <w:lvlJc w:val="left"/>
+    </w:lvl>
+  </w:abstractNum>
+  <w:abstractNum w:abstractNumId="14">
     <w:nsid w:val="6E2FFDA1"/>
     <w:multiLevelType w:val="singleLevel"/>
     <w:tmpl w:val="6E2FFDA1"/>
@@ -9206,7 +13629,7 @@
       <w:lvlJc w:val="left"/>
     </w:lvl>
   </w:abstractNum>
-  <w:abstractNum w:abstractNumId="10">
+  <w:abstractNum w:abstractNumId="15">
     <w:nsid w:val="75EEB6ED"/>
     <w:multiLevelType w:val="singleLevel"/>
     <w:tmpl w:val="75EEB6ED"/>
@@ -9219,37 +13642,52 @@
     </w:lvl>
   </w:abstractNum>
   <w:num w:numId="1">
-    <w:abstractNumId w:val="8"/>
+    <w:abstractNumId w:val="12"/>
   </w:num>
   <w:num w:numId="2">
-    <w:abstractNumId w:val="9"/>
+    <w:abstractNumId w:val="14"/>
   </w:num>
   <w:num w:numId="3">
-    <w:abstractNumId w:val="6"/>
+    <w:abstractNumId w:val="10"/>
   </w:num>
   <w:num w:numId="4">
-    <w:abstractNumId w:val="10"/>
+    <w:abstractNumId w:val="15"/>
   </w:num>
   <w:num w:numId="5">
     <w:abstractNumId w:val="0"/>
   </w:num>
   <w:num w:numId="6">
-    <w:abstractNumId w:val="4"/>
+    <w:abstractNumId w:val="5"/>
   </w:num>
   <w:num w:numId="7">
-    <w:abstractNumId w:val="7"/>
+    <w:abstractNumId w:val="11"/>
   </w:num>
   <w:num w:numId="8">
-    <w:abstractNumId w:val="5"/>
+    <w:abstractNumId w:val="9"/>
   </w:num>
   <w:num w:numId="9">
     <w:abstractNumId w:val="2"/>
   </w:num>
   <w:num w:numId="10">
-    <w:abstractNumId w:val="3"/>
+    <w:abstractNumId w:val="4"/>
   </w:num>
   <w:num w:numId="11">
     <w:abstractNumId w:val="1"/>
+  </w:num>
+  <w:num w:numId="12">
+    <w:abstractNumId w:val="7"/>
+  </w:num>
+  <w:num w:numId="13">
+    <w:abstractNumId w:val="8"/>
+  </w:num>
+  <w:num w:numId="14">
+    <w:abstractNumId w:val="3"/>
+  </w:num>
+  <w:num w:numId="15">
+    <w:abstractNumId w:val="13"/>
+  </w:num>
+  <w:num w:numId="16">
+    <w:abstractNumId w:val="6"/>
   </w:num>
 </w:numbering>
 </file>
@@ -9330,7 +13768,7 @@
     <w:lsdException w:qFormat="1" w:unhideWhenUsed="0" w:uiPriority="0" w:semiHidden="0" w:name="Title"/>
     <w:lsdException w:unhideWhenUsed="0" w:uiPriority="0" w:semiHidden="0" w:name="Closing"/>
     <w:lsdException w:unhideWhenUsed="0" w:uiPriority="0" w:semiHidden="0" w:name="Signature"/>
-    <w:lsdException w:unhideWhenUsed="0" w:uiPriority="0" w:name="Default Paragraph Font"/>
+    <w:lsdException w:qFormat="1" w:unhideWhenUsed="0" w:uiPriority="0" w:name="Default Paragraph Font"/>
     <w:lsdException w:unhideWhenUsed="0" w:uiPriority="0" w:semiHidden="0" w:name="Body Text"/>
     <w:lsdException w:unhideWhenUsed="0" w:uiPriority="0" w:semiHidden="0" w:name="Body Text Indent"/>
     <w:lsdException w:unhideWhenUsed="0" w:uiPriority="0" w:semiHidden="0" w:name="List Continue"/>
@@ -9626,6 +14064,7 @@
   <w:style w:type="character" w:default="1" w:styleId="7">
     <w:name w:val="Default Paragraph Font"/>
     <w:semiHidden/>
+    <w:qFormat/>
     <w:uiPriority w:val="0"/>
   </w:style>
   <w:style w:type="table" w:default="1" w:styleId="8">

</xml_diff>